<commit_message>
more additions to paper
</commit_message>
<xml_diff>
--- a/ms_versions/ms_microbiome_v1.docx
+++ b/ms_versions/ms_microbiome_v1.docx
@@ -688,77 +688,23 @@
         <w:pStyle w:val="BodyText"/>
         <w:jc w:val="both"/>
         <w:rPr>
-          <w:ins w:id="6" w:author="Ainhoa Magrach" w:date="2025-05-08T13:05:00Z" w16du:dateUtc="2025-05-08T11:05:00Z"/>
-          <w:rFonts w:ascii="CMU Serif Roman" w:hAnsi="CMU Serif Roman" w:cs="CMU Serif Roman"/>
-        </w:rPr>
-      </w:pPr>
-      <w:r>
-        <w:rPr>
-          <w:rFonts w:ascii="CMU Serif Roman" w:hAnsi="CMU Serif Roman" w:cs="CMU Serif Roman"/>
-        </w:rPr>
-        <w:t xml:space="preserve">We first </w:t>
-      </w:r>
-      <w:ins w:id="7" w:author="Ainhoa Magrach" w:date="2025-05-07T13:53:00Z" w16du:dateUtc="2025-05-07T11:53:00Z">
-        <w:r>
-          <w:rPr>
-            <w:rFonts w:ascii="CMU Serif Roman" w:hAnsi="CMU Serif Roman" w:cs="CMU Serif Roman"/>
-          </w:rPr>
-          <w:t>assessed s</w:t>
-        </w:r>
-      </w:ins>
-      <w:ins w:id="8" w:author="Ainhoa Magrach" w:date="2025-04-07T13:14:00Z" w16du:dateUtc="2025-04-07T11:14:00Z">
-        <w:r>
-          <w:rPr>
-            <w:rFonts w:ascii="CMU Serif Roman" w:hAnsi="CMU Serif Roman" w:cs="CMU Serif Roman"/>
-          </w:rPr>
-          <w:t>ampling completeness</w:t>
-        </w:r>
-      </w:ins>
-      <w:ins w:id="9" w:author="Ainhoa Magrach" w:date="2025-05-07T13:53:00Z" w16du:dateUtc="2025-05-07T11:53:00Z">
-        <w:r>
-          <w:rPr>
-            <w:rFonts w:ascii="CMU Serif Roman" w:hAnsi="CMU Serif Roman" w:cs="CMU Serif Roman"/>
-          </w:rPr>
-          <w:t xml:space="preserve"> within our surveys by </w:t>
-        </w:r>
-      </w:ins>
-    </w:p>
-    <w:p>
-      <w:pPr>
-        <w:pStyle w:val="BodyText"/>
-        <w:jc w:val="both"/>
-        <w:rPr>
-          <w:ins w:id="10" w:author="Ainhoa Magrach" w:date="2025-05-08T13:05:00Z" w16du:dateUtc="2025-05-08T11:05:00Z"/>
-          <w:rFonts w:ascii="CMU Serif Roman" w:hAnsi="CMU Serif Roman" w:cs="CMU Serif Roman"/>
-        </w:rPr>
-      </w:pPr>
-    </w:p>
-    <w:p>
-      <w:pPr>
-        <w:spacing w:before="100" w:beforeAutospacing="1" w:after="100" w:afterAutospacing="1"/>
-        <w:jc w:val="both"/>
-        <w:rPr>
-          <w:ins w:id="11" w:author="Ainhoa Magrach" w:date="2025-05-08T13:05:00Z" w16du:dateUtc="2025-05-08T11:05:00Z"/>
-          <w:rFonts w:ascii="CMU Serif Roman" w:hAnsi="CMU Serif Roman" w:cs="CMU Serif Roman"/>
-          <w:rPrChange w:id="12" w:author="Ainhoa Magrach" w:date="2025-05-08T13:05:00Z" w16du:dateUtc="2025-05-08T11:05:00Z">
-            <w:rPr>
-              <w:ins w:id="13" w:author="Ainhoa Magrach" w:date="2025-05-08T13:05:00Z" w16du:dateUtc="2025-05-08T11:05:00Z"/>
-              <w:rFonts w:ascii="Times New Roman" w:eastAsia="Times New Roman" w:hAnsi="Times New Roman" w:cs="Times New Roman"/>
-              <w:color w:val="000000"/>
-            </w:rPr>
-          </w:rPrChange>
-        </w:rPr>
-        <w:pPrChange w:id="14" w:author="Ainhoa Magrach" w:date="2025-05-08T13:05:00Z" w16du:dateUtc="2025-05-08T11:05:00Z">
-          <w:pPr>
-            <w:spacing w:before="100" w:beforeAutospacing="1" w:after="100" w:afterAutospacing="1"/>
-          </w:pPr>
-        </w:pPrChange>
-      </w:pPr>
-      <w:ins w:id="15" w:author="Ainhoa Magrach" w:date="2025-05-08T13:05:00Z" w16du:dateUtc="2025-05-08T11:05:00Z">
-        <w:r>
-          <w:rPr>
-            <w:rFonts w:ascii="CMU Serif Roman" w:hAnsi="CMU Serif Roman" w:cs="CMU Serif Roman"/>
-            <w:rPrChange w:id="16" w:author="Ainhoa Magrach" w:date="2025-05-08T13:05:00Z" w16du:dateUtc="2025-05-08T11:05:00Z">
+          <w:ins w:id="6" w:author="Ainhoa Magrach" w:date="2025-05-08T15:04:00Z" w16du:dateUtc="2025-05-08T13:04:00Z"/>
+          <w:rFonts w:ascii="CMU Serif Roman" w:hAnsi="CMU Serif Roman" w:cs="CMU Serif Roman"/>
+        </w:rPr>
+      </w:pPr>
+      <w:del w:id="7" w:author="Ainhoa Magrach" w:date="2025-05-08T13:07:00Z" w16du:dateUtc="2025-05-08T11:07:00Z">
+        <w:r>
+          <w:rPr>
+            <w:rFonts w:ascii="CMU Serif Roman" w:hAnsi="CMU Serif Roman" w:cs="CMU Serif Roman"/>
+          </w:rPr>
+          <w:delText xml:space="preserve">We first </w:delText>
+        </w:r>
+      </w:del>
+      <w:ins w:id="8" w:author="Ainhoa Magrach" w:date="2025-05-08T13:05:00Z" w16du:dateUtc="2025-05-08T11:05:00Z">
+        <w:r>
+          <w:rPr>
+            <w:rFonts w:ascii="CMU Serif Roman" w:hAnsi="CMU Serif Roman" w:cs="CMU Serif Roman"/>
+            <w:rPrChange w:id="9" w:author="Ainhoa Magrach" w:date="2025-05-08T13:05:00Z" w16du:dateUtc="2025-05-08T11:05:00Z">
               <w:rPr>
                 <w:rFonts w:ascii="Times New Roman" w:eastAsia="Times New Roman" w:hAnsi="Times New Roman" w:cs="Times New Roman"/>
                 <w:color w:val="000000"/>
@@ -771,7 +717,7 @@
         <w:r>
           <w:rPr>
             <w:rFonts w:ascii="CMU Serif Roman" w:hAnsi="CMU Serif Roman" w:cs="CMU Serif Roman"/>
-            <w:rPrChange w:id="17" w:author="Ainhoa Magrach" w:date="2025-05-08T13:05:00Z" w16du:dateUtc="2025-05-08T11:05:00Z">
+            <w:rPrChange w:id="10" w:author="Ainhoa Magrach" w:date="2025-05-08T13:05:00Z" w16du:dateUtc="2025-05-08T11:05:00Z">
               <w:rPr>
                 <w:rFonts w:ascii="Courier New" w:eastAsia="Times New Roman" w:hAnsi="Courier New" w:cs="Courier New"/>
                 <w:color w:val="000000"/>
@@ -786,7 +732,7 @@
         <w:r>
           <w:rPr>
             <w:rFonts w:ascii="CMU Serif Roman" w:hAnsi="CMU Serif Roman" w:cs="CMU Serif Roman"/>
-            <w:rPrChange w:id="18" w:author="Ainhoa Magrach" w:date="2025-05-08T13:05:00Z" w16du:dateUtc="2025-05-08T11:05:00Z">
+            <w:rPrChange w:id="11" w:author="Ainhoa Magrach" w:date="2025-05-08T13:05:00Z" w16du:dateUtc="2025-05-08T11:05:00Z">
               <w:rPr>
                 <w:rFonts w:ascii="Times New Roman" w:eastAsia="Times New Roman" w:hAnsi="Times New Roman" w:cs="Times New Roman"/>
                 <w:color w:val="000000"/>
@@ -796,7 +742,7 @@
           <w:t xml:space="preserve"> package (Hsieh et al., 2016), which provides robust estimates of species diversity and sampling coverage based on sample-size- and coverage-based rarefaction and extrapolation. </w:t>
         </w:r>
       </w:ins>
-      <w:ins w:id="19" w:author="Ainhoa Magrach" w:date="2025-05-08T13:06:00Z" w16du:dateUtc="2025-05-08T11:06:00Z">
+      <w:ins w:id="12" w:author="Ainhoa Magrach" w:date="2025-05-08T13:06:00Z" w16du:dateUtc="2025-05-08T11:06:00Z">
         <w:r>
           <w:rPr>
             <w:rFonts w:ascii="CMU Serif Roman" w:hAnsi="CMU Serif Roman" w:cs="CMU Serif Roman"/>
@@ -804,11 +750,11 @@
           <w:t xml:space="preserve">We </w:t>
         </w:r>
       </w:ins>
-      <w:ins w:id="20" w:author="Ainhoa Magrach" w:date="2025-05-08T13:05:00Z" w16du:dateUtc="2025-05-08T11:05:00Z">
-        <w:r>
-          <w:rPr>
-            <w:rFonts w:ascii="CMU Serif Roman" w:hAnsi="CMU Serif Roman" w:cs="CMU Serif Roman"/>
-            <w:rPrChange w:id="21" w:author="Ainhoa Magrach" w:date="2025-05-08T13:05:00Z" w16du:dateUtc="2025-05-08T11:05:00Z">
+      <w:ins w:id="13" w:author="Ainhoa Magrach" w:date="2025-05-08T13:05:00Z" w16du:dateUtc="2025-05-08T11:05:00Z">
+        <w:r>
+          <w:rPr>
+            <w:rFonts w:ascii="CMU Serif Roman" w:hAnsi="CMU Serif Roman" w:cs="CMU Serif Roman"/>
+            <w:rPrChange w:id="14" w:author="Ainhoa Magrach" w:date="2025-05-08T13:05:00Z" w16du:dateUtc="2025-05-08T11:05:00Z">
               <w:rPr>
                 <w:rFonts w:ascii="Times New Roman" w:eastAsia="Times New Roman" w:hAnsi="Times New Roman" w:cs="Times New Roman"/>
                 <w:color w:val="000000"/>
@@ -821,10 +767,260 @@
     </w:p>
     <w:p>
       <w:pPr>
+        <w:spacing w:before="100" w:beforeAutospacing="1" w:after="100" w:afterAutospacing="1"/>
+        <w:jc w:val="both"/>
+        <w:rPr>
+          <w:ins w:id="15" w:author="Ainhoa Magrach" w:date="2025-05-08T15:09:00Z" w16du:dateUtc="2025-05-08T13:09:00Z"/>
+          <w:rFonts w:ascii="CMU Serif Roman" w:hAnsi="CMU Serif Roman" w:cs="CMU Serif Roman"/>
+        </w:rPr>
+      </w:pPr>
+      <w:ins w:id="16" w:author="Ainhoa Magrach" w:date="2025-05-08T15:04:00Z" w16du:dateUtc="2025-05-08T13:04:00Z">
+        <w:r>
+          <w:rPr>
+            <w:rFonts w:ascii="CMU Serif Roman" w:hAnsi="CMU Serif Roman" w:cs="CMU Serif Roman"/>
+            <w:rPrChange w:id="17" w:author="Ainhoa Magrach" w:date="2025-05-08T15:04:00Z" w16du:dateUtc="2025-05-08T13:04:00Z">
+              <w:rPr>
+                <w:rFonts w:ascii="-webkit-standard" w:hAnsi="-webkit-standard"/>
+                <w:color w:val="000000"/>
+                <w:sz w:val="27"/>
+                <w:szCs w:val="27"/>
+              </w:rPr>
+            </w:rPrChange>
+          </w:rPr>
+          <w:t>We analyzed community composition using Non-metric Multidimensional Scaling (NMDS) with the Bray-Curtis dissimilarity index, implemented in the</w:t>
+        </w:r>
+        <w:r>
+          <w:rPr>
+            <w:rFonts w:ascii="CMU Serif Roman" w:hAnsi="CMU Serif Roman" w:cs="CMU Serif Roman"/>
+            <w:rPrChange w:id="18" w:author="Ainhoa Magrach" w:date="2025-05-08T15:04:00Z" w16du:dateUtc="2025-05-08T13:04:00Z">
+              <w:rPr>
+                <w:rStyle w:val="apple-converted-space"/>
+                <w:rFonts w:ascii="-webkit-standard" w:hAnsi="-webkit-standard"/>
+                <w:color w:val="000000"/>
+                <w:sz w:val="27"/>
+                <w:szCs w:val="27"/>
+              </w:rPr>
+            </w:rPrChange>
+          </w:rPr>
+          <w:t> </w:t>
+        </w:r>
+        <w:r>
+          <w:rPr>
+            <w:rFonts w:ascii="CMU Serif Roman" w:hAnsi="CMU Serif Roman" w:cs="CMU Serif Roman"/>
+            <w:rPrChange w:id="19" w:author="Ainhoa Magrach" w:date="2025-05-08T15:04:00Z" w16du:dateUtc="2025-05-08T13:04:00Z">
+              <w:rPr>
+                <w:rStyle w:val="HTMLCode"/>
+                <w:color w:val="000000"/>
+              </w:rPr>
+            </w:rPrChange>
+          </w:rPr>
+          <w:t>vegan</w:t>
+        </w:r>
+        <w:r>
+          <w:rPr>
+            <w:rFonts w:ascii="CMU Serif Roman" w:hAnsi="CMU Serif Roman" w:cs="CMU Serif Roman"/>
+            <w:rPrChange w:id="20" w:author="Ainhoa Magrach" w:date="2025-05-08T15:04:00Z" w16du:dateUtc="2025-05-08T13:04:00Z">
+              <w:rPr>
+                <w:rStyle w:val="apple-converted-space"/>
+                <w:rFonts w:ascii="-webkit-standard" w:hAnsi="-webkit-standard"/>
+                <w:color w:val="000000"/>
+                <w:sz w:val="27"/>
+                <w:szCs w:val="27"/>
+              </w:rPr>
+            </w:rPrChange>
+          </w:rPr>
+          <w:t> </w:t>
+        </w:r>
+        <w:r>
+          <w:rPr>
+            <w:rFonts w:ascii="CMU Serif Roman" w:hAnsi="CMU Serif Roman" w:cs="CMU Serif Roman"/>
+            <w:rPrChange w:id="21" w:author="Ainhoa Magrach" w:date="2025-05-08T15:04:00Z" w16du:dateUtc="2025-05-08T13:04:00Z">
+              <w:rPr>
+                <w:rFonts w:ascii="-webkit-standard" w:hAnsi="-webkit-standard"/>
+                <w:color w:val="000000"/>
+                <w:sz w:val="27"/>
+                <w:szCs w:val="27"/>
+              </w:rPr>
+            </w:rPrChange>
+          </w:rPr>
+          <w:t xml:space="preserve">package in R (Oksanen et al., 2022). </w:t>
+        </w:r>
+        <w:r>
+          <w:rPr>
+            <w:rFonts w:ascii="CMU Serif Roman" w:hAnsi="CMU Serif Roman" w:cs="CMU Serif Roman"/>
+            <w:highlight w:val="yellow"/>
+            <w:rPrChange w:id="22" w:author="Ainhoa Magrach" w:date="2025-05-08T15:04:00Z" w16du:dateUtc="2025-05-08T13:04:00Z">
+              <w:rPr>
+                <w:rFonts w:ascii="-webkit-standard" w:hAnsi="-webkit-standard"/>
+                <w:color w:val="000000"/>
+                <w:sz w:val="27"/>
+                <w:szCs w:val="27"/>
+              </w:rPr>
+            </w:rPrChange>
+          </w:rPr>
+          <w:t xml:space="preserve">Species abundance data were </w:t>
+        </w:r>
+        <w:proofErr w:type="gramStart"/>
+        <w:r>
+          <w:rPr>
+            <w:rFonts w:ascii="CMU Serif Roman" w:hAnsi="CMU Serif Roman" w:cs="CMU Serif Roman"/>
+            <w:highlight w:val="yellow"/>
+            <w:rPrChange w:id="23" w:author="Ainhoa Magrach" w:date="2025-05-08T15:04:00Z" w16du:dateUtc="2025-05-08T13:04:00Z">
+              <w:rPr>
+                <w:rFonts w:ascii="-webkit-standard" w:hAnsi="-webkit-standard"/>
+                <w:color w:val="000000"/>
+                <w:sz w:val="27"/>
+                <w:szCs w:val="27"/>
+              </w:rPr>
+            </w:rPrChange>
+          </w:rPr>
+          <w:t>square-</w:t>
+        </w:r>
+        <w:proofErr w:type="spellStart"/>
+        <w:r>
+          <w:rPr>
+            <w:rFonts w:ascii="CMU Serif Roman" w:hAnsi="CMU Serif Roman" w:cs="CMU Serif Roman"/>
+            <w:highlight w:val="yellow"/>
+            <w:rPrChange w:id="24" w:author="Ainhoa Magrach" w:date="2025-05-08T15:04:00Z" w16du:dateUtc="2025-05-08T13:04:00Z">
+              <w:rPr>
+                <w:rFonts w:ascii="-webkit-standard" w:hAnsi="-webkit-standard"/>
+                <w:color w:val="000000"/>
+                <w:sz w:val="27"/>
+                <w:szCs w:val="27"/>
+              </w:rPr>
+            </w:rPrChange>
+          </w:rPr>
+          <w:t>root</w:t>
+        </w:r>
+        <w:proofErr w:type="spellEnd"/>
+        <w:proofErr w:type="gramEnd"/>
+        <w:r>
+          <w:rPr>
+            <w:rFonts w:ascii="CMU Serif Roman" w:hAnsi="CMU Serif Roman" w:cs="CMU Serif Roman"/>
+            <w:highlight w:val="yellow"/>
+            <w:rPrChange w:id="25" w:author="Ainhoa Magrach" w:date="2025-05-08T15:04:00Z" w16du:dateUtc="2025-05-08T13:04:00Z">
+              <w:rPr>
+                <w:rFonts w:ascii="-webkit-standard" w:hAnsi="-webkit-standard"/>
+                <w:color w:val="000000"/>
+                <w:sz w:val="27"/>
+                <w:szCs w:val="27"/>
+              </w:rPr>
+            </w:rPrChange>
+          </w:rPr>
+          <w:t xml:space="preserve"> transformed to reduce the influence of dominant species</w:t>
+        </w:r>
+        <w:r>
+          <w:rPr>
+            <w:rFonts w:ascii="CMU Serif Roman" w:hAnsi="CMU Serif Roman" w:cs="CMU Serif Roman"/>
+            <w:rPrChange w:id="26" w:author="Ainhoa Magrach" w:date="2025-05-08T15:04:00Z" w16du:dateUtc="2025-05-08T13:04:00Z">
+              <w:rPr>
+                <w:rFonts w:ascii="-webkit-standard" w:hAnsi="-webkit-standard"/>
+                <w:color w:val="000000"/>
+                <w:sz w:val="27"/>
+                <w:szCs w:val="27"/>
+              </w:rPr>
+            </w:rPrChange>
+          </w:rPr>
+          <w:t xml:space="preserve">. </w:t>
+        </w:r>
+      </w:ins>
+      <w:ins w:id="27" w:author="Ainhoa Magrach" w:date="2025-05-08T15:05:00Z" w16du:dateUtc="2025-05-08T13:05:00Z">
+        <w:r>
+          <w:rPr>
+            <w:rFonts w:ascii="CMU Serif Roman" w:hAnsi="CMU Serif Roman" w:cs="CMU Serif Roman"/>
+          </w:rPr>
+          <w:t>We then</w:t>
+        </w:r>
+        <w:r>
+          <w:rPr>
+            <w:rFonts w:ascii="CMU Serif Roman" w:eastAsiaTheme="minorHAnsi" w:hAnsi="CMU Serif Roman" w:cs="CMU Serif Roman"/>
+            <w:rPrChange w:id="28" w:author="Ainhoa Magrach" w:date="2025-05-08T15:05:00Z" w16du:dateUtc="2025-05-08T13:05:00Z">
+              <w:rPr>
+                <w:color w:val="000000"/>
+              </w:rPr>
+            </w:rPrChange>
+          </w:rPr>
+          <w:t xml:space="preserve"> performed a Permutational Multivariate Analysis of Variance (PERMANOVA) with 999 permutations to assess significance. </w:t>
+        </w:r>
+      </w:ins>
+      <w:ins w:id="29" w:author="Ainhoa Magrach" w:date="2025-05-08T15:06:00Z" w16du:dateUtc="2025-05-08T13:06:00Z">
+        <w:r>
+          <w:rPr>
+            <w:rFonts w:ascii="CMU Serif Roman" w:hAnsi="CMU Serif Roman" w:cs="CMU Serif Roman"/>
+          </w:rPr>
+          <w:t xml:space="preserve">The </w:t>
+        </w:r>
+        <w:proofErr w:type="gramStart"/>
+        <w:r>
+          <w:rPr>
+            <w:rFonts w:ascii="CMU Serif Roman" w:hAnsi="CMU Serif Roman" w:cs="CMU Serif Roman"/>
+          </w:rPr>
+          <w:t>time period</w:t>
+        </w:r>
+        <w:proofErr w:type="gramEnd"/>
+        <w:r>
+          <w:rPr>
+            <w:rFonts w:ascii="CMU Serif Roman" w:hAnsi="CMU Serif Roman" w:cs="CMU Serif Roman"/>
+          </w:rPr>
+          <w:t xml:space="preserve"> in which the specimens were sampled </w:t>
+        </w:r>
+      </w:ins>
+      <w:ins w:id="30" w:author="Ainhoa Magrach" w:date="2025-05-08T15:05:00Z" w16du:dateUtc="2025-05-08T13:05:00Z">
+        <w:r>
+          <w:rPr>
+            <w:rFonts w:ascii="CMU Serif Roman" w:eastAsiaTheme="minorHAnsi" w:hAnsi="CMU Serif Roman" w:cs="CMU Serif Roman"/>
+            <w:rPrChange w:id="31" w:author="Ainhoa Magrach" w:date="2025-05-08T15:05:00Z" w16du:dateUtc="2025-05-08T13:05:00Z">
+              <w:rPr>
+                <w:color w:val="000000"/>
+              </w:rPr>
+            </w:rPrChange>
+          </w:rPr>
+          <w:t xml:space="preserve">was specified as the main factor. </w:t>
+        </w:r>
+      </w:ins>
+    </w:p>
+    <w:p>
+      <w:pPr>
+        <w:spacing w:before="100" w:beforeAutospacing="1" w:after="100" w:afterAutospacing="1"/>
+        <w:jc w:val="both"/>
+        <w:rPr>
+          <w:ins w:id="32" w:author="Ainhoa Magrach" w:date="2025-05-08T15:05:00Z" w16du:dateUtc="2025-05-08T13:05:00Z"/>
+          <w:rFonts w:ascii="CMU Serif Roman" w:eastAsiaTheme="minorHAnsi" w:hAnsi="CMU Serif Roman" w:cs="CMU Serif Roman"/>
+          <w:rPrChange w:id="33" w:author="Ainhoa Magrach" w:date="2025-05-08T15:05:00Z" w16du:dateUtc="2025-05-08T13:05:00Z">
+            <w:rPr>
+              <w:ins w:id="34" w:author="Ainhoa Magrach" w:date="2025-05-08T15:05:00Z" w16du:dateUtc="2025-05-08T13:05:00Z"/>
+              <w:color w:val="000000"/>
+            </w:rPr>
+          </w:rPrChange>
+        </w:rPr>
+        <w:pPrChange w:id="35" w:author="Ainhoa Magrach" w:date="2025-05-08T15:06:00Z" w16du:dateUtc="2025-05-08T13:06:00Z">
+          <w:pPr>
+            <w:spacing w:before="100" w:beforeAutospacing="1" w:after="100" w:afterAutospacing="1"/>
+          </w:pPr>
+        </w:pPrChange>
+      </w:pPr>
+      <w:ins w:id="36" w:author="Ainhoa Magrach" w:date="2025-05-08T15:09:00Z" w16du:dateUtc="2025-05-08T13:09:00Z">
+        <w:r>
+          <w:rPr>
+            <w:rFonts w:ascii="CMU Serif Roman" w:hAnsi="CMU Serif Roman" w:cs="CMU Serif Roman"/>
+            <w:highlight w:val="magenta"/>
+            <w:rPrChange w:id="37" w:author="Ainhoa Magrach" w:date="2025-05-08T15:10:00Z" w16du:dateUtc="2025-05-08T13:10:00Z">
+              <w:rPr>
+                <w:rFonts w:ascii="CMU Serif Roman" w:hAnsi="CMU Serif Roman" w:cs="CMU Serif Roman"/>
+              </w:rPr>
+            </w:rPrChange>
+          </w:rPr>
+          <w:lastRenderedPageBreak/>
+          <w:t>Finally, we assessed whether floral species diversity was related to zzz</w:t>
+        </w:r>
+      </w:ins>
+    </w:p>
+    <w:p>
+      <w:pPr>
         <w:pStyle w:val="BodyText"/>
         <w:jc w:val="both"/>
         <w:rPr>
-          <w:ins w:id="22" w:author="Ainhoa Magrach" w:date="2025-04-07T13:14:00Z" w16du:dateUtc="2025-04-07T11:14:00Z"/>
+          <w:ins w:id="38" w:author="Ainhoa Magrach" w:date="2025-04-07T13:14:00Z" w16du:dateUtc="2025-04-07T11:14:00Z"/>
           <w:rFonts w:ascii="CMU Serif Roman" w:hAnsi="CMU Serif Roman" w:cs="CMU Serif Roman"/>
         </w:rPr>
       </w:pPr>
@@ -834,11 +1030,11 @@
         <w:pStyle w:val="BodyText"/>
         <w:jc w:val="both"/>
         <w:rPr>
-          <w:ins w:id="23" w:author="Ainhoa Magrach" w:date="2025-04-07T13:15:00Z" w16du:dateUtc="2025-04-07T11:15:00Z"/>
-          <w:rFonts w:ascii="CMU Serif Roman" w:hAnsi="CMU Serif Roman" w:cs="CMU Serif Roman"/>
-        </w:rPr>
-      </w:pPr>
-      <w:ins w:id="24" w:author="Ainhoa Magrach" w:date="2025-04-07T13:14:00Z" w16du:dateUtc="2025-04-07T11:14:00Z">
+          <w:ins w:id="39" w:author="Ainhoa Magrach" w:date="2025-04-07T13:15:00Z" w16du:dateUtc="2025-04-07T11:15:00Z"/>
+          <w:rFonts w:ascii="CMU Serif Roman" w:hAnsi="CMU Serif Roman" w:cs="CMU Serif Roman"/>
+        </w:rPr>
+      </w:pPr>
+      <w:ins w:id="40" w:author="Ainhoa Magrach" w:date="2025-04-07T13:14:00Z" w16du:dateUtc="2025-04-07T11:14:00Z">
         <w:r>
           <w:rPr>
             <w:rFonts w:ascii="CMU Serif Roman" w:hAnsi="CMU Serif Roman" w:cs="CMU Serif Roman"/>
@@ -864,7 +1060,7 @@
           <w:rFonts w:ascii="CMU Serif Roman" w:hAnsi="CMU Serif Roman" w:cs="CMU Serif Roman"/>
         </w:rPr>
       </w:pPr>
-      <w:bookmarkStart w:id="25" w:name="results"/>
+      <w:bookmarkStart w:id="41" w:name="results"/>
       <w:bookmarkEnd w:id="2"/>
       <w:r>
         <w:rPr>
@@ -878,17 +1074,33 @@
         <w:pStyle w:val="FirstParagraph"/>
         <w:jc w:val="both"/>
         <w:rPr>
-          <w:ins w:id="26" w:author="Ainhoa Magrach" w:date="2025-04-07T13:14:00Z" w16du:dateUtc="2025-04-07T11:14:00Z"/>
-          <w:rFonts w:ascii="CMU Serif Roman" w:hAnsi="CMU Serif Roman" w:cs="CMU Serif Roman"/>
-        </w:rPr>
-      </w:pPr>
-      <w:r>
-        <w:rPr>
-          <w:rFonts w:ascii="CMU Serif Roman" w:hAnsi="CMU Serif Roman" w:cs="CMU Serif Roman"/>
-        </w:rPr>
-        <w:t>During the 2023 season, we collected a total of 132 bumblebee specimens</w:t>
-      </w:r>
-      <w:ins w:id="27" w:author="Ainhoa Magrach" w:date="2025-04-07T13:07:00Z" w16du:dateUtc="2025-04-07T11:07:00Z">
+          <w:ins w:id="42" w:author="Ainhoa Magrach" w:date="2025-04-07T13:14:00Z" w16du:dateUtc="2025-04-07T11:14:00Z"/>
+          <w:rFonts w:ascii="CMU Serif Roman" w:hAnsi="CMU Serif Roman" w:cs="CMU Serif Roman"/>
+        </w:rPr>
+      </w:pPr>
+      <w:del w:id="43" w:author="Ainhoa Magrach" w:date="2025-05-08T15:11:00Z" w16du:dateUtc="2025-05-08T13:11:00Z">
+        <w:r>
+          <w:rPr>
+            <w:rFonts w:ascii="CMU Serif Roman" w:hAnsi="CMU Serif Roman" w:cs="CMU Serif Roman"/>
+          </w:rPr>
+          <w:delText>During the 2023</w:delText>
+        </w:r>
+      </w:del>
+      <w:ins w:id="44" w:author="Ainhoa Magrach" w:date="2025-05-08T15:11:00Z" w16du:dateUtc="2025-05-08T13:11:00Z">
+        <w:r>
+          <w:rPr>
+            <w:rFonts w:ascii="CMU Serif Roman" w:hAnsi="CMU Serif Roman" w:cs="CMU Serif Roman"/>
+          </w:rPr>
+          <w:t>Throughout the flowering</w:t>
+        </w:r>
+      </w:ins>
+      <w:r>
+        <w:rPr>
+          <w:rFonts w:ascii="CMU Serif Roman" w:hAnsi="CMU Serif Roman" w:cs="CMU Serif Roman"/>
+        </w:rPr>
+        <w:t xml:space="preserve"> season, we collected a total of 132 bumblebee specimens</w:t>
+      </w:r>
+      <w:ins w:id="45" w:author="Ainhoa Magrach" w:date="2025-04-07T13:07:00Z" w16du:dateUtc="2025-04-07T11:07:00Z">
         <w:r>
           <w:rPr>
             <w:rFonts w:ascii="CMU Serif Roman" w:hAnsi="CMU Serif Roman" w:cs="CMU Serif Roman"/>
@@ -896,7 +1108,7 @@
           <w:t xml:space="preserve"> across our 16 sites (XX+- individuals per site and period).</w:t>
         </w:r>
       </w:ins>
-      <w:del w:id="28" w:author="Ainhoa Magrach" w:date="2025-04-07T13:07:00Z" w16du:dateUtc="2025-04-07T11:07:00Z">
+      <w:del w:id="46" w:author="Ainhoa Magrach" w:date="2025-04-07T13:07:00Z" w16du:dateUtc="2025-04-07T11:07:00Z">
         <w:r>
           <w:rPr>
             <w:rFonts w:ascii="CMU Serif Roman" w:hAnsi="CMU Serif Roman" w:cs="CMU Serif Roman"/>
@@ -909,11 +1121,11 @@
       <w:pPr>
         <w:pStyle w:val="BodyText"/>
         <w:rPr>
-          <w:ins w:id="29" w:author="Ainhoa Magrach" w:date="2025-04-07T13:21:00Z" w16du:dateUtc="2025-04-07T11:21:00Z"/>
-          <w:rFonts w:ascii="CMU Serif Roman" w:hAnsi="CMU Serif Roman" w:cs="CMU Serif Roman"/>
-        </w:rPr>
-      </w:pPr>
-      <w:ins w:id="30" w:author="Ainhoa Magrach" w:date="2025-04-07T13:14:00Z" w16du:dateUtc="2025-04-07T11:14:00Z">
+          <w:ins w:id="47" w:author="Ainhoa Magrach" w:date="2025-05-08T15:25:00Z" w16du:dateUtc="2025-05-08T13:25:00Z"/>
+          <w:rFonts w:ascii="CMU Serif Roman" w:hAnsi="CMU Serif Roman" w:cs="CMU Serif Roman"/>
+        </w:rPr>
+      </w:pPr>
+      <w:ins w:id="48" w:author="Ainhoa Magrach" w:date="2025-04-07T13:14:00Z" w16du:dateUtc="2025-04-07T11:14:00Z">
         <w:r>
           <w:rPr>
             <w:rFonts w:ascii="CMU Serif Roman" w:hAnsi="CMU Serif Roman" w:cs="CMU Serif Roman"/>
@@ -921,7 +1133,7 @@
           <w:t xml:space="preserve">Our results show that </w:t>
         </w:r>
       </w:ins>
-      <w:ins w:id="31" w:author="Ainhoa Magrach" w:date="2025-04-07T13:19:00Z" w16du:dateUtc="2025-04-07T11:19:00Z">
+      <w:ins w:id="49" w:author="Ainhoa Magrach" w:date="2025-04-07T13:19:00Z" w16du:dateUtc="2025-04-07T11:19:00Z">
         <w:r>
           <w:rPr>
             <w:rFonts w:ascii="CMU Serif Roman" w:hAnsi="CMU Serif Roman" w:cs="CMU Serif Roman"/>
@@ -929,7 +1141,7 @@
           <w:t xml:space="preserve">sampling completeness </w:t>
         </w:r>
       </w:ins>
-      <w:ins w:id="32" w:author="Ainhoa Magrach" w:date="2025-04-07T13:20:00Z" w16du:dateUtc="2025-04-07T11:20:00Z">
+      <w:ins w:id="50" w:author="Ainhoa Magrach" w:date="2025-04-07T13:20:00Z" w16du:dateUtc="2025-04-07T11:20:00Z">
         <w:r>
           <w:rPr>
             <w:rFonts w:ascii="CMU Serif Roman" w:hAnsi="CMU Serif Roman" w:cs="CMU Serif Roman"/>
@@ -942,16 +1154,250 @@
       <w:pPr>
         <w:pStyle w:val="BodyText"/>
         <w:rPr>
-          <w:rFonts w:ascii="CMU Serif Roman" w:hAnsi="CMU Serif Roman" w:cs="CMU Serif Roman"/>
-        </w:rPr>
-        <w:pPrChange w:id="33" w:author="Ainhoa Magrach" w:date="2025-04-07T13:14:00Z" w16du:dateUtc="2025-04-07T11:14:00Z">
+          <w:ins w:id="51" w:author="Ainhoa Magrach" w:date="2025-05-08T15:25:00Z" w16du:dateUtc="2025-05-08T13:25:00Z"/>
+        </w:rPr>
+      </w:pPr>
+    </w:p>
+    <w:p>
+      <w:pPr>
+        <w:pStyle w:val="BodyText"/>
+        <w:rPr>
+          <w:ins w:id="52" w:author="Ainhoa Magrach" w:date="2025-05-08T15:25:00Z" w16du:dateUtc="2025-05-08T13:25:00Z"/>
+          <w:rFonts w:ascii="CMU Serif Roman" w:hAnsi="CMU Serif Roman" w:cs="CMU Serif Roman"/>
+        </w:rPr>
+      </w:pPr>
+      <w:ins w:id="53" w:author="Ainhoa Magrach" w:date="2025-05-08T15:25:00Z" w16du:dateUtc="2025-05-08T13:25:00Z">
+        <w:r>
+          <w:rPr>
+            <w:rFonts w:ascii="CMU Serif Roman" w:hAnsi="CMU Serif Roman" w:cs="CMU Serif Roman"/>
+          </w:rPr>
+          <w:t xml:space="preserve">We find that </w:t>
+        </w:r>
+        <w:r>
+          <w:rPr>
+            <w:rFonts w:ascii="CMU Serif Roman" w:hAnsi="CMU Serif Roman" w:cs="CMU Serif Roman"/>
+          </w:rPr>
+          <w:t xml:space="preserve">bacterial diversity within bumblebee guts tends to slightly increase through time, although this relationship is not significant, probably due to our relatively low sample size. </w:t>
+        </w:r>
+      </w:ins>
+    </w:p>
+    <w:p>
+      <w:pPr>
+        <w:pStyle w:val="BodyText"/>
+        <w:rPr>
+          <w:ins w:id="54" w:author="Ainhoa Magrach" w:date="2025-05-08T15:25:00Z" w16du:dateUtc="2025-05-08T13:25:00Z"/>
+          <w:rFonts w:ascii="CMU Serif Roman" w:hAnsi="CMU Serif Roman" w:cs="CMU Serif Roman"/>
+        </w:rPr>
+      </w:pPr>
+      <w:ins w:id="55" w:author="Ainhoa Magrach" w:date="2025-05-08T15:25:00Z" w16du:dateUtc="2025-05-08T13:25:00Z">
+        <w:r>
+          <w:rPr>
+            <w:rFonts w:ascii="CMU Serif Roman" w:hAnsi="CMU Serif Roman" w:cs="CMU Serif Roman"/>
+          </w:rPr>
+          <w:t>Bumblebee</w:t>
+        </w:r>
+        <w:r>
+          <w:rPr>
+            <w:rFonts w:ascii="CMU Serif Roman" w:hAnsi="CMU Serif Roman" w:cs="CMU Serif Roman"/>
+          </w:rPr>
+          <w:t xml:space="preserve"> guts were characterized by a diverse group of bacteria, dominated by Gammaproteobacteria such as XX and XX, followed by Actinobacteria, Firmicutes and Cyanobacteria and including a relatively large proportion of unidentified specimens (X%). </w:t>
+        </w:r>
+      </w:ins>
+    </w:p>
+    <w:p>
+      <w:pPr>
+        <w:pStyle w:val="BodyText"/>
+        <w:rPr>
+          <w:ins w:id="56" w:author="Ainhoa Magrach" w:date="2025-05-08T15:26:00Z" w16du:dateUtc="2025-05-08T13:26:00Z"/>
+          <w:rFonts w:ascii="CMU Serif Roman" w:hAnsi="CMU Serif Roman" w:cs="CMU Serif Roman"/>
+        </w:rPr>
+      </w:pPr>
+      <w:ins w:id="57" w:author="Ainhoa Magrach" w:date="2025-05-08T15:25:00Z" w16du:dateUtc="2025-05-08T13:25:00Z">
+        <w:r>
+          <w:rPr>
+            <w:rFonts w:ascii="CMU Serif Roman" w:hAnsi="CMU Serif Roman" w:cs="CMU Serif Roman"/>
+          </w:rPr>
+          <w:t xml:space="preserve">In terms of changes in composition through time, our results show that there is a constant group of bacterial components that consistently appear across all time periods (Fig. 4) and sites (Fig. SX), probably defining the species’ core microbiome and including ASVs in the genus Lactobacillus, </w:t>
+        </w:r>
+        <w:proofErr w:type="spellStart"/>
+        <w:r>
+          <w:rPr>
+            <w:rFonts w:ascii="CMU Serif Roman" w:hAnsi="CMU Serif Roman" w:cs="CMU Serif Roman"/>
+          </w:rPr>
+          <w:t>Gilliamella</w:t>
+        </w:r>
+        <w:proofErr w:type="spellEnd"/>
+        <w:r>
+          <w:rPr>
+            <w:rFonts w:ascii="CMU Serif Roman" w:hAnsi="CMU Serif Roman" w:cs="CMU Serif Roman"/>
+          </w:rPr>
+          <w:t xml:space="preserve">, </w:t>
+        </w:r>
+        <w:proofErr w:type="spellStart"/>
+        <w:r>
+          <w:rPr>
+            <w:rFonts w:ascii="CMU Serif Roman" w:hAnsi="CMU Serif Roman" w:cs="CMU Serif Roman"/>
+          </w:rPr>
+          <w:t>Snodgrassella</w:t>
+        </w:r>
+        <w:proofErr w:type="spellEnd"/>
+        <w:r>
+          <w:rPr>
+            <w:rFonts w:ascii="CMU Serif Roman" w:hAnsi="CMU Serif Roman" w:cs="CMU Serif Roman"/>
+          </w:rPr>
+          <w:t xml:space="preserve"> and </w:t>
+        </w:r>
+        <w:proofErr w:type="spellStart"/>
+        <w:r>
+          <w:rPr>
+            <w:rFonts w:ascii="CMU Serif Roman" w:hAnsi="CMU Serif Roman" w:cs="CMU Serif Roman"/>
+          </w:rPr>
+          <w:t>Bombiscardovia</w:t>
+        </w:r>
+        <w:proofErr w:type="spellEnd"/>
+        <w:r>
+          <w:rPr>
+            <w:rFonts w:ascii="CMU Serif Roman" w:hAnsi="CMU Serif Roman" w:cs="CMU Serif Roman"/>
+          </w:rPr>
+          <w:t xml:space="preserve">. We also find that towards the end of the sampling season, this core microbiome becomes complemented by other species belonging to genus like Pseudomonas, Bacillus, </w:t>
+        </w:r>
+        <w:proofErr w:type="spellStart"/>
+        <w:r>
+          <w:rPr>
+            <w:rFonts w:ascii="CMU Serif Roman" w:hAnsi="CMU Serif Roman" w:cs="CMU Serif Roman"/>
+          </w:rPr>
+          <w:t>Commensalibacter</w:t>
+        </w:r>
+        <w:proofErr w:type="spellEnd"/>
+        <w:r>
+          <w:rPr>
+            <w:rFonts w:ascii="CMU Serif Roman" w:hAnsi="CMU Serif Roman" w:cs="CMU Serif Roman"/>
+          </w:rPr>
+          <w:t xml:space="preserve"> or </w:t>
+        </w:r>
+        <w:proofErr w:type="spellStart"/>
+        <w:r>
+          <w:rPr>
+            <w:rFonts w:ascii="CMU Serif Roman" w:hAnsi="CMU Serif Roman" w:cs="CMU Serif Roman"/>
+          </w:rPr>
+          <w:t>Apibacter</w:t>
+        </w:r>
+        <w:proofErr w:type="spellEnd"/>
+        <w:r>
+          <w:rPr>
+            <w:rFonts w:ascii="CMU Serif Roman" w:hAnsi="CMU Serif Roman" w:cs="CMU Serif Roman"/>
+          </w:rPr>
+          <w:t xml:space="preserve">. </w:t>
+        </w:r>
+      </w:ins>
+    </w:p>
+    <w:p>
+      <w:pPr>
+        <w:pStyle w:val="BodyText"/>
+        <w:rPr>
+          <w:ins w:id="58" w:author="Ainhoa Magrach" w:date="2025-05-08T15:26:00Z" w16du:dateUtc="2025-05-08T13:26:00Z"/>
+          <w:rFonts w:ascii="CMU Serif Roman" w:hAnsi="CMU Serif Roman" w:cs="CMU Serif Roman"/>
+        </w:rPr>
+      </w:pPr>
+      <w:ins w:id="59" w:author="Ainhoa Magrach" w:date="2025-05-08T15:26:00Z" w16du:dateUtc="2025-05-08T13:26:00Z">
+        <w:r>
+          <w:rPr>
+            <w:rFonts w:ascii="CMU Serif Roman" w:hAnsi="CMU Serif Roman" w:cs="CMU Serif Roman"/>
+          </w:rPr>
+          <w:t xml:space="preserve">Our analysis of how the composition of the bacterial community changes through time shows a distinct grouping across the different time periods, with </w:t>
+        </w:r>
+        <w:proofErr w:type="gramStart"/>
+        <w:r>
+          <w:rPr>
+            <w:rFonts w:ascii="CMU Serif Roman" w:hAnsi="CMU Serif Roman" w:cs="CMU Serif Roman"/>
+          </w:rPr>
+          <w:t>particular differences</w:t>
+        </w:r>
+        <w:proofErr w:type="gramEnd"/>
+        <w:r>
+          <w:rPr>
+            <w:rFonts w:ascii="CMU Serif Roman" w:hAnsi="CMU Serif Roman" w:cs="CMU Serif Roman"/>
+          </w:rPr>
+          <w:t xml:space="preserve"> found between the earlier (dark blue) and later (yellow) time periods in their bacterial composition (Fig. 5). </w:t>
+        </w:r>
+      </w:ins>
+    </w:p>
+    <w:p>
+      <w:pPr>
+        <w:pStyle w:val="BodyText"/>
+        <w:rPr>
+          <w:ins w:id="60" w:author="Ainhoa Magrach" w:date="2025-05-08T15:26:00Z" w16du:dateUtc="2025-05-08T13:26:00Z"/>
+          <w:rFonts w:ascii="CMU Serif Roman" w:hAnsi="CMU Serif Roman" w:cs="CMU Serif Roman"/>
+        </w:rPr>
+      </w:pPr>
+      <w:ins w:id="61" w:author="Ainhoa Magrach" w:date="2025-05-08T15:26:00Z" w16du:dateUtc="2025-05-08T13:26:00Z">
+        <w:r>
+          <w:rPr>
+            <w:rFonts w:ascii="CMU Serif Roman" w:hAnsi="CMU Serif Roman" w:cs="CMU Serif Roman"/>
+          </w:rPr>
+          <w:t>Our analysis of fungal communities…</w:t>
+        </w:r>
+      </w:ins>
+    </w:p>
+    <w:p>
+      <w:pPr>
+        <w:pStyle w:val="BodyText"/>
+        <w:rPr>
+          <w:ins w:id="62" w:author="Ainhoa Magrach" w:date="2025-05-08T15:26:00Z" w16du:dateUtc="2025-05-08T13:26:00Z"/>
+          <w:rFonts w:ascii="CMU Serif Roman" w:hAnsi="CMU Serif Roman" w:cs="CMU Serif Roman"/>
+        </w:rPr>
+      </w:pPr>
+    </w:p>
+    <w:p>
+      <w:pPr>
+        <w:pStyle w:val="BodyText"/>
+        <w:rPr>
+          <w:ins w:id="63" w:author="Ainhoa Magrach" w:date="2025-05-08T15:25:00Z" w16du:dateUtc="2025-05-08T13:25:00Z"/>
+          <w:rFonts w:ascii="CMU Serif Roman" w:hAnsi="CMU Serif Roman" w:cs="CMU Serif Roman"/>
+        </w:rPr>
+      </w:pPr>
+    </w:p>
+    <w:p>
+      <w:pPr>
+        <w:pStyle w:val="BodyText"/>
+        <w:rPr>
+          <w:ins w:id="64" w:author="Ainhoa Magrach" w:date="2025-05-08T15:25:00Z" w16du:dateUtc="2025-05-08T13:25:00Z"/>
+          <w:rFonts w:ascii="CMU Serif Roman" w:hAnsi="CMU Serif Roman" w:cs="CMU Serif Roman"/>
+        </w:rPr>
+      </w:pPr>
+    </w:p>
+    <w:p>
+      <w:pPr>
+        <w:pStyle w:val="BodyText"/>
+        <w:rPr>
+          <w:ins w:id="65" w:author="Ainhoa Magrach" w:date="2025-05-08T15:25:00Z" w16du:dateUtc="2025-05-08T13:25:00Z"/>
+          <w:rFonts w:ascii="CMU Serif Roman" w:hAnsi="CMU Serif Roman" w:cs="CMU Serif Roman"/>
+        </w:rPr>
+      </w:pPr>
+    </w:p>
+    <w:p>
+      <w:pPr>
+        <w:pStyle w:val="BodyText"/>
+        <w:rPr>
+          <w:ins w:id="66" w:author="Ainhoa Magrach" w:date="2025-04-07T13:21:00Z" w16du:dateUtc="2025-04-07T11:21:00Z"/>
+          <w:rFonts w:ascii="CMU Serif Roman" w:hAnsi="CMU Serif Roman" w:cs="CMU Serif Roman"/>
+        </w:rPr>
+      </w:pPr>
+    </w:p>
+    <w:p>
+      <w:pPr>
+        <w:pStyle w:val="BodyText"/>
+        <w:rPr>
+          <w:rFonts w:ascii="CMU Serif Roman" w:hAnsi="CMU Serif Roman" w:cs="CMU Serif Roman"/>
+        </w:rPr>
+        <w:pPrChange w:id="67" w:author="Ainhoa Magrach" w:date="2025-04-07T13:14:00Z" w16du:dateUtc="2025-04-07T11:14:00Z">
           <w:pPr>
             <w:pStyle w:val="FirstParagraph"/>
             <w:jc w:val="both"/>
           </w:pPr>
         </w:pPrChange>
       </w:pPr>
-      <w:ins w:id="34" w:author="Ainhoa Magrach" w:date="2025-04-07T13:21:00Z" w16du:dateUtc="2025-04-07T11:21:00Z">
+      <w:ins w:id="68" w:author="Ainhoa Magrach" w:date="2025-04-07T13:21:00Z" w16du:dateUtc="2025-04-07T11:21:00Z">
         <w:r>
           <w:rPr>
             <w:noProof/>
@@ -1016,71 +1462,46 @@
     <w:p>
       <w:pPr>
         <w:pStyle w:val="BodyText"/>
+        <w:rPr>
+          <w:del w:id="69" w:author="Ainhoa Magrach" w:date="2025-05-08T15:25:00Z" w16du:dateUtc="2025-05-08T13:25:00Z"/>
+        </w:rPr>
       </w:pPr>
     </w:p>
     <w:p>
       <w:pPr>
         <w:pStyle w:val="BodyText"/>
         <w:rPr>
-          <w:rFonts w:ascii="CMU Serif Roman" w:hAnsi="CMU Serif Roman" w:cs="CMU Serif Roman"/>
-          <w:rPrChange w:id="35" w:author="Ainhoa Magrach" w:date="2025-04-07T13:21:00Z" w16du:dateUtc="2025-04-07T11:21:00Z">
-            <w:rPr/>
+          <w:del w:id="70" w:author="Ainhoa Magrach" w:date="2025-05-08T15:25:00Z" w16du:dateUtc="2025-05-08T13:25:00Z"/>
+          <w:rFonts w:ascii="CMU Serif Roman" w:hAnsi="CMU Serif Roman" w:cs="CMU Serif Roman"/>
+          <w:rPrChange w:id="71" w:author="Ainhoa Magrach" w:date="2025-04-07T13:21:00Z" w16du:dateUtc="2025-04-07T11:21:00Z">
+            <w:rPr>
+              <w:del w:id="72" w:author="Ainhoa Magrach" w:date="2025-05-08T15:25:00Z" w16du:dateUtc="2025-05-08T13:25:00Z"/>
+            </w:rPr>
           </w:rPrChange>
         </w:rPr>
       </w:pPr>
-      <w:ins w:id="36" w:author="Ainhoa Magrach" w:date="2025-04-07T13:21:00Z" w16du:dateUtc="2025-04-07T11:21:00Z">
-        <w:r>
-          <w:rPr>
-            <w:rFonts w:ascii="CMU Serif Roman" w:hAnsi="CMU Serif Roman" w:cs="CMU Serif Roman"/>
-            <w:rPrChange w:id="37" w:author="Ainhoa Magrach" w:date="2025-04-07T13:21:00Z" w16du:dateUtc="2025-04-07T11:21:00Z">
-              <w:rPr/>
-            </w:rPrChange>
+    </w:p>
+    <w:p>
+      <w:pPr>
+        <w:pStyle w:val="BodyText"/>
+        <w:rPr>
+          <w:ins w:id="73" w:author="Ainhoa Magrach" w:date="2025-04-07T12:42:00Z" w16du:dateUtc="2025-04-07T10:42:00Z"/>
+        </w:rPr>
+      </w:pPr>
+    </w:p>
+    <w:p>
+      <w:pPr>
+        <w:pStyle w:val="BodyText"/>
+        <w:rPr>
+          <w:ins w:id="74" w:author="Ainhoa Magrach" w:date="2025-04-07T13:22:00Z" w16du:dateUtc="2025-04-07T11:22:00Z"/>
+        </w:rPr>
+      </w:pPr>
+      <w:ins w:id="75" w:author="Ainhoa Magrach" w:date="2025-04-07T12:42:00Z">
+        <w:r>
+          <w:rPr>
+            <w:noProof/>
           </w:rPr>
           <w:lastRenderedPageBreak/>
-          <w:t xml:space="preserve">We find that </w:t>
-        </w:r>
-        <w:r>
-          <w:rPr>
-            <w:rFonts w:ascii="CMU Serif Roman" w:hAnsi="CMU Serif Roman" w:cs="CMU Serif Roman"/>
-          </w:rPr>
-          <w:t xml:space="preserve">bacterial diversity within bumblebee guts tends to </w:t>
-        </w:r>
-        <w:r>
-          <w:rPr>
-            <w:rFonts w:ascii="CMU Serif Roman" w:hAnsi="CMU Serif Roman" w:cs="CMU Serif Roman"/>
-          </w:rPr>
-          <w:t>slightly increase through time, although this relationship is not significant, probably due to our relativ</w:t>
-        </w:r>
-      </w:ins>
-      <w:ins w:id="38" w:author="Ainhoa Magrach" w:date="2025-04-07T13:22:00Z" w16du:dateUtc="2025-04-07T11:22:00Z">
-        <w:r>
-          <w:rPr>
-            <w:rFonts w:ascii="CMU Serif Roman" w:hAnsi="CMU Serif Roman" w:cs="CMU Serif Roman"/>
-          </w:rPr>
-          <w:t xml:space="preserve">ely low sample size. </w:t>
-        </w:r>
-      </w:ins>
-    </w:p>
-    <w:p>
-      <w:pPr>
-        <w:pStyle w:val="BodyText"/>
-        <w:rPr>
-          <w:ins w:id="39" w:author="Ainhoa Magrach" w:date="2025-04-07T12:42:00Z" w16du:dateUtc="2025-04-07T10:42:00Z"/>
-        </w:rPr>
-      </w:pPr>
-    </w:p>
-    <w:p>
-      <w:pPr>
-        <w:pStyle w:val="BodyText"/>
-        <w:rPr>
-          <w:ins w:id="40" w:author="Ainhoa Magrach" w:date="2025-04-07T13:22:00Z" w16du:dateUtc="2025-04-07T11:22:00Z"/>
-        </w:rPr>
-      </w:pPr>
-      <w:ins w:id="41" w:author="Ainhoa Magrach" w:date="2025-04-07T12:42:00Z">
-        <w:r>
-          <w:rPr>
-            <w:noProof/>
-          </w:rPr>
           <w:drawing>
             <wp:inline distT="0" distB="0" distL="0" distR="0" wp14:anchorId="5FA5AB2F" wp14:editId="71A510E0">
               <wp:extent cx="5622471" cy="5581331"/>
@@ -1137,55 +1558,10 @@
       <w:pPr>
         <w:pStyle w:val="BodyText"/>
         <w:rPr>
-          <w:ins w:id="42" w:author="Ainhoa Magrach" w:date="2025-04-07T12:43:00Z" w16du:dateUtc="2025-04-07T10:43:00Z"/>
-          <w:rFonts w:ascii="CMU Serif Roman" w:hAnsi="CMU Serif Roman" w:cs="CMU Serif Roman"/>
-          <w:rPrChange w:id="43" w:author="Ainhoa Magrach" w:date="2025-04-07T13:22:00Z" w16du:dateUtc="2025-04-07T11:22:00Z">
-            <w:rPr>
-              <w:ins w:id="44" w:author="Ainhoa Magrach" w:date="2025-04-07T12:43:00Z" w16du:dateUtc="2025-04-07T10:43:00Z"/>
-            </w:rPr>
-          </w:rPrChange>
-        </w:rPr>
-      </w:pPr>
-      <w:ins w:id="45" w:author="Ainhoa Magrach" w:date="2025-04-07T13:22:00Z" w16du:dateUtc="2025-04-07T11:22:00Z">
-        <w:r>
-          <w:rPr>
-            <w:rFonts w:ascii="CMU Serif Roman" w:hAnsi="CMU Serif Roman" w:cs="CMU Serif Roman"/>
-            <w:rPrChange w:id="46" w:author="Ainhoa Magrach" w:date="2025-04-07T13:22:00Z" w16du:dateUtc="2025-04-07T11:22:00Z">
-              <w:rPr/>
-            </w:rPrChange>
-          </w:rPr>
-          <w:t>Bumblebee</w:t>
-        </w:r>
-        <w:r>
-          <w:rPr>
-            <w:rFonts w:ascii="CMU Serif Roman" w:hAnsi="CMU Serif Roman" w:cs="CMU Serif Roman"/>
-          </w:rPr>
-          <w:t xml:space="preserve"> guts were characterized by </w:t>
-        </w:r>
-        <w:r>
-          <w:rPr>
-            <w:rFonts w:ascii="CMU Serif Roman" w:hAnsi="CMU Serif Roman" w:cs="CMU Serif Roman"/>
-          </w:rPr>
-          <w:t xml:space="preserve">a diverse group of bacteria, dominated by Gammaproteobacteria such as </w:t>
-        </w:r>
-      </w:ins>
-      <w:ins w:id="47" w:author="Ainhoa Magrach" w:date="2025-04-07T13:23:00Z" w16du:dateUtc="2025-04-07T11:23:00Z">
-        <w:r>
-          <w:rPr>
-            <w:rFonts w:ascii="CMU Serif Roman" w:hAnsi="CMU Serif Roman" w:cs="CMU Serif Roman"/>
-          </w:rPr>
-          <w:t xml:space="preserve">XX and XX, followed by Actinobacteria, Firmicutes and Cyanobacteria and including a relatively large proportion of unidentified specimens (X%). </w:t>
-        </w:r>
-      </w:ins>
-    </w:p>
-    <w:p>
-      <w:pPr>
-        <w:pStyle w:val="BodyText"/>
-        <w:rPr>
-          <w:ins w:id="48" w:author="Ainhoa Magrach" w:date="2025-04-07T12:43:00Z" w16du:dateUtc="2025-04-07T10:43:00Z"/>
-        </w:rPr>
-      </w:pPr>
-      <w:ins w:id="49" w:author="Ainhoa Magrach" w:date="2025-04-07T12:43:00Z">
+          <w:ins w:id="76" w:author="Ainhoa Magrach" w:date="2025-04-07T12:43:00Z" w16du:dateUtc="2025-04-07T10:43:00Z"/>
+        </w:rPr>
+      </w:pPr>
+      <w:ins w:id="77" w:author="Ainhoa Magrach" w:date="2025-04-07T12:43:00Z">
         <w:r>
           <w:rPr>
             <w:noProof/>
@@ -1247,10 +1623,10 @@
       <w:pPr>
         <w:pStyle w:val="BodyText"/>
         <w:rPr>
-          <w:ins w:id="50" w:author="Ainhoa Magrach" w:date="2025-04-07T13:24:00Z" w16du:dateUtc="2025-04-07T11:24:00Z"/>
-        </w:rPr>
-      </w:pPr>
-      <w:ins w:id="51" w:author="Ainhoa Magrach" w:date="2025-04-07T13:24:00Z">
+          <w:ins w:id="78" w:author="Ainhoa Magrach" w:date="2025-04-07T13:24:00Z" w16du:dateUtc="2025-04-07T11:24:00Z"/>
+        </w:rPr>
+      </w:pPr>
+      <w:ins w:id="79" w:author="Ainhoa Magrach" w:date="2025-04-07T13:24:00Z">
         <w:r>
           <w:rPr>
             <w:noProof/>
@@ -1312,146 +1688,11 @@
       <w:pPr>
         <w:pStyle w:val="BodyText"/>
         <w:rPr>
-          <w:ins w:id="52" w:author="Ainhoa Magrach" w:date="2025-04-07T13:28:00Z" w16du:dateUtc="2025-04-07T11:28:00Z"/>
-          <w:rFonts w:ascii="CMU Serif Roman" w:hAnsi="CMU Serif Roman" w:cs="CMU Serif Roman"/>
-        </w:rPr>
-      </w:pPr>
-      <w:ins w:id="53" w:author="Ainhoa Magrach" w:date="2025-04-07T13:24:00Z" w16du:dateUtc="2025-04-07T11:24:00Z">
-        <w:r>
-          <w:rPr>
-            <w:rFonts w:ascii="CMU Serif Roman" w:hAnsi="CMU Serif Roman" w:cs="CMU Serif Roman"/>
-          </w:rPr>
-          <w:t xml:space="preserve">In terms of changes in composition through time, our results show that there is a constant group of bacterial </w:t>
-        </w:r>
-      </w:ins>
-      <w:ins w:id="54" w:author="Ainhoa Magrach" w:date="2025-04-07T13:25:00Z" w16du:dateUtc="2025-04-07T11:25:00Z">
-        <w:r>
-          <w:rPr>
-            <w:rFonts w:ascii="CMU Serif Roman" w:hAnsi="CMU Serif Roman" w:cs="CMU Serif Roman"/>
-          </w:rPr>
-          <w:t>components that consistently appear across all time periods (Fig. 4) and sites (Fig. SX), probably defining</w:t>
-        </w:r>
-      </w:ins>
-      <w:ins w:id="55" w:author="Ainhoa Magrach" w:date="2025-04-07T13:26:00Z" w16du:dateUtc="2025-04-07T11:26:00Z">
-        <w:r>
-          <w:rPr>
-            <w:rFonts w:ascii="CMU Serif Roman" w:hAnsi="CMU Serif Roman" w:cs="CMU Serif Roman"/>
-          </w:rPr>
-          <w:t xml:space="preserve"> the species’ core microbiome and including ASVs in the genus Lactobacillus, </w:t>
-        </w:r>
-        <w:proofErr w:type="spellStart"/>
-        <w:r>
-          <w:rPr>
-            <w:rFonts w:ascii="CMU Serif Roman" w:hAnsi="CMU Serif Roman" w:cs="CMU Serif Roman"/>
-          </w:rPr>
-          <w:t>Gilliamella</w:t>
-        </w:r>
-        <w:proofErr w:type="spellEnd"/>
-        <w:r>
-          <w:rPr>
-            <w:rFonts w:ascii="CMU Serif Roman" w:hAnsi="CMU Serif Roman" w:cs="CMU Serif Roman"/>
-          </w:rPr>
-          <w:t xml:space="preserve">, </w:t>
-        </w:r>
-        <w:proofErr w:type="spellStart"/>
-        <w:r>
-          <w:rPr>
-            <w:rFonts w:ascii="CMU Serif Roman" w:hAnsi="CMU Serif Roman" w:cs="CMU Serif Roman"/>
-          </w:rPr>
-          <w:t>Snodgrassella</w:t>
-        </w:r>
-        <w:proofErr w:type="spellEnd"/>
-        <w:r>
-          <w:rPr>
-            <w:rFonts w:ascii="CMU Serif Roman" w:hAnsi="CMU Serif Roman" w:cs="CMU Serif Roman"/>
-          </w:rPr>
-          <w:t xml:space="preserve"> and </w:t>
-        </w:r>
-        <w:proofErr w:type="spellStart"/>
-        <w:r>
-          <w:rPr>
-            <w:rFonts w:ascii="CMU Serif Roman" w:hAnsi="CMU Serif Roman" w:cs="CMU Serif Roman"/>
-          </w:rPr>
-          <w:t>Bombiscardovia</w:t>
-        </w:r>
-        <w:proofErr w:type="spellEnd"/>
-        <w:r>
-          <w:rPr>
-            <w:rFonts w:ascii="CMU Serif Roman" w:hAnsi="CMU Serif Roman" w:cs="CMU Serif Roman"/>
-          </w:rPr>
-          <w:t xml:space="preserve">. </w:t>
-        </w:r>
-      </w:ins>
-      <w:ins w:id="56" w:author="Ainhoa Magrach" w:date="2025-04-07T13:27:00Z" w16du:dateUtc="2025-04-07T11:27:00Z">
-        <w:r>
-          <w:rPr>
-            <w:rFonts w:ascii="CMU Serif Roman" w:hAnsi="CMU Serif Roman" w:cs="CMU Serif Roman"/>
-          </w:rPr>
-          <w:t>We also find that towards the end of the sampling season, this core microbiome becomes complemented by other species belonging to genus like Pseudom</w:t>
-        </w:r>
-      </w:ins>
-      <w:ins w:id="57" w:author="Ainhoa Magrach" w:date="2025-04-07T13:28:00Z" w16du:dateUtc="2025-04-07T11:28:00Z">
-        <w:r>
-          <w:rPr>
-            <w:rFonts w:ascii="CMU Serif Roman" w:hAnsi="CMU Serif Roman" w:cs="CMU Serif Roman"/>
-          </w:rPr>
-          <w:t>o</w:t>
-        </w:r>
-      </w:ins>
-      <w:ins w:id="58" w:author="Ainhoa Magrach" w:date="2025-04-07T13:27:00Z" w16du:dateUtc="2025-04-07T11:27:00Z">
-        <w:r>
-          <w:rPr>
-            <w:rFonts w:ascii="CMU Serif Roman" w:hAnsi="CMU Serif Roman" w:cs="CMU Serif Roman"/>
-          </w:rPr>
-          <w:t xml:space="preserve">nas, </w:t>
-        </w:r>
-      </w:ins>
-      <w:ins w:id="59" w:author="Ainhoa Magrach" w:date="2025-04-07T13:28:00Z" w16du:dateUtc="2025-04-07T11:28:00Z">
-        <w:r>
-          <w:rPr>
-            <w:rFonts w:ascii="CMU Serif Roman" w:hAnsi="CMU Serif Roman" w:cs="CMU Serif Roman"/>
-          </w:rPr>
-          <w:t xml:space="preserve">Bacillus, </w:t>
-        </w:r>
-        <w:proofErr w:type="spellStart"/>
-        <w:r>
-          <w:rPr>
-            <w:rFonts w:ascii="CMU Serif Roman" w:hAnsi="CMU Serif Roman" w:cs="CMU Serif Roman"/>
-          </w:rPr>
-          <w:t>Commensalibacter</w:t>
-        </w:r>
-        <w:proofErr w:type="spellEnd"/>
-        <w:r>
-          <w:rPr>
-            <w:rFonts w:ascii="CMU Serif Roman" w:hAnsi="CMU Serif Roman" w:cs="CMU Serif Roman"/>
-          </w:rPr>
-          <w:t xml:space="preserve"> or </w:t>
-        </w:r>
-        <w:proofErr w:type="spellStart"/>
-        <w:r>
-          <w:rPr>
-            <w:rFonts w:ascii="CMU Serif Roman" w:hAnsi="CMU Serif Roman" w:cs="CMU Serif Roman"/>
-          </w:rPr>
-          <w:t>Apibacter</w:t>
-        </w:r>
-        <w:proofErr w:type="spellEnd"/>
-        <w:r>
-          <w:rPr>
-            <w:rFonts w:ascii="CMU Serif Roman" w:hAnsi="CMU Serif Roman" w:cs="CMU Serif Roman"/>
-          </w:rPr>
-          <w:t xml:space="preserve">. </w:t>
-        </w:r>
-      </w:ins>
-    </w:p>
-    <w:p>
-      <w:pPr>
-        <w:pStyle w:val="BodyText"/>
-        <w:rPr>
-          <w:ins w:id="60" w:author="Ainhoa Magrach" w:date="2025-04-07T13:29:00Z" w16du:dateUtc="2025-04-07T11:29:00Z"/>
-          <w:rFonts w:ascii="CMU Serif Roman" w:hAnsi="CMU Serif Roman" w:cs="CMU Serif Roman"/>
-        </w:rPr>
-      </w:pPr>
-      <w:ins w:id="61" w:author="Ainhoa Magrach" w:date="2025-04-07T13:28:00Z" w16du:dateUtc="2025-04-07T11:28:00Z">
+          <w:ins w:id="80" w:author="Ainhoa Magrach" w:date="2025-04-07T13:29:00Z" w16du:dateUtc="2025-04-07T11:29:00Z"/>
+          <w:rFonts w:ascii="CMU Serif Roman" w:hAnsi="CMU Serif Roman" w:cs="CMU Serif Roman"/>
+        </w:rPr>
+      </w:pPr>
+      <w:ins w:id="81" w:author="Ainhoa Magrach" w:date="2025-04-07T13:28:00Z" w16du:dateUtc="2025-04-07T11:28:00Z">
         <w:r>
           <w:rPr>
             <w:noProof/>
@@ -1513,54 +1754,10 @@
       <w:pPr>
         <w:pStyle w:val="BodyText"/>
         <w:rPr>
-          <w:ins w:id="62" w:author="Ainhoa Magrach" w:date="2025-04-07T12:44:00Z" w16du:dateUtc="2025-04-07T10:44:00Z"/>
-          <w:rFonts w:ascii="CMU Serif Roman" w:hAnsi="CMU Serif Roman" w:cs="CMU Serif Roman"/>
-          <w:rPrChange w:id="63" w:author="Ainhoa Magrach" w:date="2025-04-07T13:24:00Z" w16du:dateUtc="2025-04-07T11:24:00Z">
-            <w:rPr>
-              <w:ins w:id="64" w:author="Ainhoa Magrach" w:date="2025-04-07T12:44:00Z" w16du:dateUtc="2025-04-07T10:44:00Z"/>
-            </w:rPr>
-          </w:rPrChange>
-        </w:rPr>
-      </w:pPr>
-      <w:ins w:id="65" w:author="Ainhoa Magrach" w:date="2025-04-07T13:29:00Z" w16du:dateUtc="2025-04-07T11:29:00Z">
-        <w:r>
-          <w:rPr>
-            <w:rFonts w:ascii="CMU Serif Roman" w:hAnsi="CMU Serif Roman" w:cs="CMU Serif Roman"/>
-          </w:rPr>
-          <w:t xml:space="preserve">Our analysis of how the composition of the bacterial community changes through time shows a distinct grouping across the different time periods, with </w:t>
-        </w:r>
-        <w:proofErr w:type="gramStart"/>
-        <w:r>
-          <w:rPr>
-            <w:rFonts w:ascii="CMU Serif Roman" w:hAnsi="CMU Serif Roman" w:cs="CMU Serif Roman"/>
-          </w:rPr>
-          <w:t>particular differences</w:t>
-        </w:r>
-        <w:proofErr w:type="gramEnd"/>
-        <w:r>
-          <w:rPr>
-            <w:rFonts w:ascii="CMU Serif Roman" w:hAnsi="CMU Serif Roman" w:cs="CMU Serif Roman"/>
-          </w:rPr>
-          <w:t xml:space="preserve"> found between the earlier (dark blue) and later (yellow) time</w:t>
-        </w:r>
-      </w:ins>
-      <w:ins w:id="66" w:author="Ainhoa Magrach" w:date="2025-04-07T13:30:00Z" w16du:dateUtc="2025-04-07T11:30:00Z">
-        <w:r>
-          <w:rPr>
-            <w:rFonts w:ascii="CMU Serif Roman" w:hAnsi="CMU Serif Roman" w:cs="CMU Serif Roman"/>
-          </w:rPr>
-          <w:t xml:space="preserve"> periods in their bacterial composition (Fig. 5). </w:t>
-        </w:r>
-      </w:ins>
-    </w:p>
-    <w:p>
-      <w:pPr>
-        <w:pStyle w:val="BodyText"/>
-        <w:rPr>
-          <w:ins w:id="67" w:author="Ainhoa Magrach" w:date="2025-04-07T12:44:00Z" w16du:dateUtc="2025-04-07T10:44:00Z"/>
-        </w:rPr>
-      </w:pPr>
-      <w:ins w:id="68" w:author="Ainhoa Magrach" w:date="2025-04-07T12:44:00Z">
+          <w:ins w:id="82" w:author="Ainhoa Magrach" w:date="2025-04-07T12:44:00Z" w16du:dateUtc="2025-04-07T10:44:00Z"/>
+        </w:rPr>
+      </w:pPr>
+      <w:ins w:id="83" w:author="Ainhoa Magrach" w:date="2025-04-07T12:44:00Z">
         <w:r>
           <w:rPr>
             <w:noProof/>
@@ -1621,107 +1818,790 @@
     <w:p>
       <w:pPr>
         <w:pStyle w:val="BodyText"/>
-        <w:rPr>
-          <w:ins w:id="69" w:author="Ainhoa Magrach" w:date="2025-04-07T12:45:00Z" w16du:dateUtc="2025-04-07T10:45:00Z"/>
-          <w:rFonts w:ascii="CMU Serif Roman" w:hAnsi="CMU Serif Roman" w:cs="CMU Serif Roman"/>
-          <w:rPrChange w:id="70" w:author="Ainhoa Magrach" w:date="2025-04-07T13:30:00Z" w16du:dateUtc="2025-04-07T11:30:00Z">
+      </w:pPr>
+    </w:p>
+    <w:p>
+      <w:pPr>
+        <w:pStyle w:val="Heading2"/>
+        <w:jc w:val="both"/>
+        <w:rPr>
+          <w:ins w:id="84" w:author="Ainhoa Magrach" w:date="2025-05-07T13:58:00Z" w16du:dateUtc="2025-05-07T11:58:00Z"/>
+          <w:rFonts w:ascii="CMU Serif Roman" w:hAnsi="CMU Serif Roman" w:cs="CMU Serif Roman"/>
+          <w:lang w:val="es-ES"/>
+        </w:rPr>
+      </w:pPr>
+      <w:bookmarkStart w:id="85" w:name="discussion"/>
+      <w:bookmarkEnd w:id="41"/>
+      <w:proofErr w:type="spellStart"/>
+      <w:r>
+        <w:rPr>
+          <w:rFonts w:ascii="CMU Serif Roman" w:hAnsi="CMU Serif Roman" w:cs="CMU Serif Roman"/>
+          <w:lang w:val="es-ES"/>
+        </w:rPr>
+        <w:t>Discussion</w:t>
+      </w:r>
+      <w:proofErr w:type="spellEnd"/>
+    </w:p>
+    <w:p>
+      <w:pPr>
+        <w:pStyle w:val="BodyText"/>
+        <w:jc w:val="both"/>
+        <w:rPr>
+          <w:ins w:id="86" w:author="Ainhoa Magrach" w:date="2025-05-08T15:13:00Z" w16du:dateUtc="2025-05-08T13:13:00Z"/>
+          <w:rFonts w:ascii="CMU Serif Roman" w:hAnsi="CMU Serif Roman" w:cs="CMU Serif Roman"/>
+        </w:rPr>
+        <w:pPrChange w:id="87" w:author="Ainhoa Magrach" w:date="2025-05-08T15:15:00Z" w16du:dateUtc="2025-05-08T13:15:00Z">
+          <w:pPr>
+            <w:pStyle w:val="BodyText"/>
+          </w:pPr>
+        </w:pPrChange>
+      </w:pPr>
+      <w:ins w:id="88" w:author="Ainhoa Magrach" w:date="2025-05-07T13:58:00Z" w16du:dateUtc="2025-05-07T11:58:00Z">
+        <w:r>
+          <w:rPr>
+            <w:rFonts w:ascii="CMU Serif Roman" w:hAnsi="CMU Serif Roman" w:cs="CMU Serif Roman"/>
+            <w:rPrChange w:id="89" w:author="Ainhoa Magrach" w:date="2025-05-07T13:58:00Z" w16du:dateUtc="2025-05-07T11:58:00Z">
+              <w:rPr>
+                <w:rFonts w:ascii="CMU Serif Roman" w:hAnsi="CMU Serif Roman" w:cs="CMU Serif Roman"/>
+                <w:lang w:val="es-ES"/>
+              </w:rPr>
+            </w:rPrChange>
+          </w:rPr>
+          <w:t xml:space="preserve">Our </w:t>
+        </w:r>
+        <w:r>
+          <w:rPr>
+            <w:rFonts w:ascii="CMU Serif Roman" w:hAnsi="CMU Serif Roman" w:cs="CMU Serif Roman"/>
+          </w:rPr>
+          <w:t>analysis</w:t>
+        </w:r>
+        <w:r>
+          <w:rPr>
+            <w:rFonts w:ascii="CMU Serif Roman" w:hAnsi="CMU Serif Roman" w:cs="CMU Serif Roman"/>
+            <w:rPrChange w:id="90" w:author="Ainhoa Magrach" w:date="2025-05-07T13:58:00Z" w16du:dateUtc="2025-05-07T11:58:00Z">
+              <w:rPr>
+                <w:rFonts w:ascii="CMU Serif Roman" w:hAnsi="CMU Serif Roman" w:cs="CMU Serif Roman"/>
+                <w:lang w:val="es-ES"/>
+              </w:rPr>
+            </w:rPrChange>
+          </w:rPr>
+          <w:t xml:space="preserve"> of the mi</w:t>
+        </w:r>
+        <w:r>
+          <w:rPr>
+            <w:rFonts w:ascii="CMU Serif Roman" w:hAnsi="CMU Serif Roman" w:cs="CMU Serif Roman"/>
+          </w:rPr>
+          <w:t xml:space="preserve">crobial composition of wild bumblebee guts shows that </w:t>
+        </w:r>
+      </w:ins>
+    </w:p>
+    <w:p>
+      <w:pPr>
+        <w:pStyle w:val="BodyText"/>
+        <w:jc w:val="both"/>
+        <w:rPr>
+          <w:ins w:id="91" w:author="Ainhoa Magrach" w:date="2025-05-08T15:13:00Z" w16du:dateUtc="2025-05-08T13:13:00Z"/>
+          <w:rFonts w:ascii="CMU Serif Roman" w:hAnsi="CMU Serif Roman" w:cs="CMU Serif Roman"/>
+        </w:rPr>
+        <w:pPrChange w:id="92" w:author="Ainhoa Magrach" w:date="2025-05-08T15:15:00Z" w16du:dateUtc="2025-05-08T13:15:00Z">
+          <w:pPr>
+            <w:pStyle w:val="BodyText"/>
+          </w:pPr>
+        </w:pPrChange>
+      </w:pPr>
+    </w:p>
+    <w:p>
+      <w:pPr>
+        <w:pStyle w:val="BodyText"/>
+        <w:jc w:val="both"/>
+        <w:rPr>
+          <w:ins w:id="93" w:author="Ainhoa Magrach" w:date="2025-05-08T15:27:00Z" w16du:dateUtc="2025-05-08T13:27:00Z"/>
+          <w:rFonts w:ascii="CMU Serif Roman" w:hAnsi="CMU Serif Roman" w:cs="CMU Serif Roman"/>
+        </w:rPr>
+      </w:pPr>
+      <w:proofErr w:type="gramStart"/>
+      <w:ins w:id="94" w:author="Ainhoa Magrach" w:date="2025-05-08T15:13:00Z" w16du:dateUtc="2025-05-08T13:13:00Z">
+        <w:r>
+          <w:rPr>
+            <w:rFonts w:ascii="CMU Serif Roman" w:hAnsi="CMU Serif Roman" w:cs="CMU Serif Roman"/>
+          </w:rPr>
+          <w:t>Similar to</w:t>
+        </w:r>
+        <w:proofErr w:type="gramEnd"/>
+        <w:r>
+          <w:rPr>
+            <w:rFonts w:ascii="CMU Serif Roman" w:hAnsi="CMU Serif Roman" w:cs="CMU Serif Roman"/>
+          </w:rPr>
+          <w:t xml:space="preserve"> other previous</w:t>
+        </w:r>
+      </w:ins>
+      <w:ins w:id="95" w:author="Ainhoa Magrach" w:date="2025-05-08T15:14:00Z" w16du:dateUtc="2025-05-08T13:14:00Z">
+        <w:r>
+          <w:rPr>
+            <w:rFonts w:ascii="CMU Serif Roman" w:hAnsi="CMU Serif Roman" w:cs="CMU Serif Roman"/>
+          </w:rPr>
+          <w:t xml:space="preserve"> research looking at the composition of gut microbiomes in other bumblebee species, we find large differences throughout the flowering season</w:t>
+        </w:r>
+      </w:ins>
+      <w:ins w:id="96" w:author="Ainhoa Magrach" w:date="2025-05-08T15:15:00Z" w16du:dateUtc="2025-05-08T13:15:00Z">
+        <w:r>
+          <w:rPr>
+            <w:rFonts w:ascii="CMU Serif Roman" w:hAnsi="CMU Serif Roman" w:cs="CMU Serif Roman"/>
+          </w:rPr>
+          <w:t xml:space="preserve"> (REF)</w:t>
+        </w:r>
+      </w:ins>
+      <w:ins w:id="97" w:author="Ainhoa Magrach" w:date="2025-05-08T15:14:00Z" w16du:dateUtc="2025-05-08T13:14:00Z">
+        <w:r>
+          <w:rPr>
+            <w:rFonts w:ascii="CMU Serif Roman" w:hAnsi="CMU Serif Roman" w:cs="CMU Serif Roman"/>
+          </w:rPr>
+          <w:t xml:space="preserve">. </w:t>
+        </w:r>
+      </w:ins>
+      <w:ins w:id="98" w:author="Ainhoa Magrach" w:date="2025-05-08T15:15:00Z" w16du:dateUtc="2025-05-08T13:15:00Z">
+        <w:r>
+          <w:rPr>
+            <w:rFonts w:ascii="CMU Serif Roman" w:hAnsi="CMU Serif Roman" w:cs="CMU Serif Roman"/>
+          </w:rPr>
+          <w:t>Specifically, w</w:t>
+        </w:r>
+      </w:ins>
+      <w:ins w:id="99" w:author="Ainhoa Magrach" w:date="2025-05-08T15:14:00Z" w16du:dateUtc="2025-05-08T13:14:00Z">
+        <w:r>
+          <w:rPr>
+            <w:rFonts w:ascii="CMU Serif Roman" w:hAnsi="CMU Serif Roman" w:cs="CMU Serif Roman"/>
+          </w:rPr>
+          <w:t>hile bumblebees</w:t>
+        </w:r>
+      </w:ins>
+      <w:ins w:id="100" w:author="Ainhoa Magrach" w:date="2025-05-08T15:15:00Z" w16du:dateUtc="2025-05-08T13:15:00Z">
+        <w:r>
+          <w:rPr>
+            <w:rFonts w:ascii="CMU Serif Roman" w:hAnsi="CMU Serif Roman" w:cs="CMU Serif Roman"/>
+          </w:rPr>
+          <w:t xml:space="preserve"> collected early in the season exhibit more depauperate patterns, featuri</w:t>
+        </w:r>
+      </w:ins>
+      <w:ins w:id="101" w:author="Ainhoa Magrach" w:date="2025-05-08T15:16:00Z" w16du:dateUtc="2025-05-08T13:16:00Z">
+        <w:r>
+          <w:rPr>
+            <w:rFonts w:ascii="CMU Serif Roman" w:hAnsi="CMU Serif Roman" w:cs="CMU Serif Roman"/>
+          </w:rPr>
+          <w:t xml:space="preserve">ng XX to XX ASVs, those captured </w:t>
+        </w:r>
+        <w:proofErr w:type="gramStart"/>
+        <w:r>
+          <w:rPr>
+            <w:rFonts w:ascii="CMU Serif Roman" w:hAnsi="CMU Serif Roman" w:cs="CMU Serif Roman"/>
+          </w:rPr>
+          <w:t>later on</w:t>
+        </w:r>
+        <w:proofErr w:type="gramEnd"/>
+        <w:r>
+          <w:rPr>
+            <w:rFonts w:ascii="CMU Serif Roman" w:hAnsi="CMU Serif Roman" w:cs="CMU Serif Roman"/>
+          </w:rPr>
+          <w:t xml:space="preserve"> in the season host a much more diverse microbial community (XXX to XXX). </w:t>
+        </w:r>
+      </w:ins>
+      <w:ins w:id="102" w:author="Ainhoa Magrach" w:date="2025-05-08T15:25:00Z" w16du:dateUtc="2025-05-08T13:25:00Z">
+        <w:r>
+          <w:rPr>
+            <w:rFonts w:ascii="CMU Serif Roman" w:hAnsi="CMU Serif Roman" w:cs="CMU Serif Roman"/>
+            <w:rPrChange w:id="103" w:author="Ainhoa Magrach" w:date="2025-05-08T15:25:00Z" w16du:dateUtc="2025-05-08T13:25:00Z">
+              <w:rPr>
+                <w:rFonts w:ascii="-webkit-standard" w:hAnsi="-webkit-standard"/>
+                <w:color w:val="000000"/>
+                <w:sz w:val="27"/>
+                <w:szCs w:val="27"/>
+              </w:rPr>
+            </w:rPrChange>
+          </w:rPr>
+          <w:t>This seasonal shift suggests a progressive accumulation of microbial diversity, potentially driven by increased foraging activity, exposure to diverse floral resources, and interactions with other pollinators as the season advances. These findings highlight the dynamic nature of bumblebee gut microbiomes and underscore the importance of seasonal context when assessing microbial diversity and its ecological implications.</w:t>
+        </w:r>
+      </w:ins>
+    </w:p>
+    <w:p>
+      <w:pPr>
+        <w:spacing w:before="100" w:beforeAutospacing="1" w:after="100" w:afterAutospacing="1"/>
+        <w:jc w:val="both"/>
+        <w:rPr>
+          <w:ins w:id="104" w:author="Ainhoa Magrach" w:date="2025-05-08T15:27:00Z" w16du:dateUtc="2025-05-08T13:27:00Z"/>
+          <w:rFonts w:ascii="CMU Serif Roman" w:eastAsiaTheme="minorHAnsi" w:hAnsi="CMU Serif Roman" w:cs="CMU Serif Roman"/>
+          <w:rPrChange w:id="105" w:author="Ainhoa Magrach" w:date="2025-05-08T15:27:00Z" w16du:dateUtc="2025-05-08T13:27:00Z">
             <w:rPr>
-              <w:ins w:id="71" w:author="Ainhoa Magrach" w:date="2025-04-07T12:45:00Z" w16du:dateUtc="2025-04-07T10:45:00Z"/>
+              <w:ins w:id="106" w:author="Ainhoa Magrach" w:date="2025-05-08T15:27:00Z" w16du:dateUtc="2025-05-08T13:27:00Z"/>
+              <w:color w:val="000000"/>
             </w:rPr>
           </w:rPrChange>
         </w:rPr>
-      </w:pPr>
-      <w:ins w:id="72" w:author="Ainhoa Magrach" w:date="2025-04-07T13:30:00Z" w16du:dateUtc="2025-04-07T11:30:00Z">
-        <w:r>
-          <w:rPr>
-            <w:rFonts w:ascii="CMU Serif Roman" w:hAnsi="CMU Serif Roman" w:cs="CMU Serif Roman"/>
-          </w:rPr>
-          <w:t>Our analysis of fungal communities…</w:t>
+        <w:pPrChange w:id="107" w:author="Ainhoa Magrach" w:date="2025-05-08T15:28:00Z" w16du:dateUtc="2025-05-08T13:28:00Z">
+          <w:pPr>
+            <w:spacing w:before="100" w:beforeAutospacing="1" w:after="100" w:afterAutospacing="1"/>
+          </w:pPr>
+        </w:pPrChange>
+      </w:pPr>
+      <w:ins w:id="108" w:author="Ainhoa Magrach" w:date="2025-05-08T15:27:00Z" w16du:dateUtc="2025-05-08T13:27:00Z">
+        <w:r>
+          <w:rPr>
+            <w:rFonts w:ascii="CMU Serif Roman" w:eastAsiaTheme="minorHAnsi" w:hAnsi="CMU Serif Roman" w:cs="CMU Serif Roman"/>
+            <w:rPrChange w:id="109" w:author="Ainhoa Magrach" w:date="2025-05-08T15:27:00Z" w16du:dateUtc="2025-05-08T13:27:00Z">
+              <w:rPr>
+                <w:color w:val="000000"/>
+              </w:rPr>
+            </w:rPrChange>
+          </w:rPr>
+          <w:lastRenderedPageBreak/>
+          <w:t>Bumblebee guts were colonized by a diverse array of bacteria, with Gammaproteobacteria</w:t>
         </w:r>
       </w:ins>
+      <w:ins w:id="110" w:author="Ainhoa Magrach" w:date="2025-05-08T15:28:00Z" w16du:dateUtc="2025-05-08T13:28:00Z">
+        <w:r>
+          <w:rPr>
+            <w:rFonts w:ascii="CMU Serif Roman" w:eastAsiaTheme="minorHAnsi" w:hAnsi="CMU Serif Roman" w:cs="CMU Serif Roman"/>
+          </w:rPr>
+          <w:t xml:space="preserve"> </w:t>
+        </w:r>
+      </w:ins>
+      <w:ins w:id="111" w:author="Ainhoa Magrach" w:date="2025-05-08T15:27:00Z" w16du:dateUtc="2025-05-08T13:27:00Z">
+        <w:r>
+          <w:rPr>
+            <w:rFonts w:ascii="CMU Serif Roman" w:eastAsiaTheme="minorHAnsi" w:hAnsi="CMU Serif Roman" w:cs="CMU Serif Roman"/>
+            <w:rPrChange w:id="112" w:author="Ainhoa Magrach" w:date="2025-05-08T15:27:00Z" w16du:dateUtc="2025-05-08T13:27:00Z">
+              <w:rPr>
+                <w:color w:val="000000"/>
+              </w:rPr>
+            </w:rPrChange>
+          </w:rPr>
+          <w:t>being the most abundant, followed by Actinobacteria, Firmicutes, and Cyanobacteria. Notably, we observed a considerable proportion of unidentified bacterial taxa (</w:t>
+        </w:r>
+        <w:r>
+          <w:rPr>
+            <w:rFonts w:ascii="CMU Serif Roman" w:eastAsiaTheme="minorHAnsi" w:hAnsi="CMU Serif Roman" w:cs="CMU Serif Roman"/>
+            <w:b/>
+            <w:bCs/>
+            <w:rPrChange w:id="113" w:author="Ainhoa Magrach" w:date="2025-05-08T15:27:00Z" w16du:dateUtc="2025-05-08T13:27:00Z">
+              <w:rPr>
+                <w:rStyle w:val="Strong"/>
+                <w:color w:val="000000"/>
+              </w:rPr>
+            </w:rPrChange>
+          </w:rPr>
+          <w:t>X%</w:t>
+        </w:r>
+        <w:r>
+          <w:rPr>
+            <w:rFonts w:ascii="CMU Serif Roman" w:eastAsiaTheme="minorHAnsi" w:hAnsi="CMU Serif Roman" w:cs="CMU Serif Roman"/>
+            <w:rPrChange w:id="114" w:author="Ainhoa Magrach" w:date="2025-05-08T15:27:00Z" w16du:dateUtc="2025-05-08T13:27:00Z">
+              <w:rPr>
+                <w:color w:val="000000"/>
+              </w:rPr>
+            </w:rPrChange>
+          </w:rPr>
+          <w:t>), reflecting both the complexity of microbial communities within pollinators and potential gaps in current taxonomic databases. This underlines the importance of continued exploration and sequencing efforts to fully characterize the microbial diversity associated with bumblebees.</w:t>
+        </w:r>
+      </w:ins>
+    </w:p>
+    <w:p>
+      <w:pPr>
+        <w:spacing w:before="100" w:beforeAutospacing="1" w:after="100" w:afterAutospacing="1"/>
+        <w:jc w:val="both"/>
+        <w:rPr>
+          <w:ins w:id="115" w:author="Ainhoa Magrach" w:date="2025-05-08T15:27:00Z" w16du:dateUtc="2025-05-08T13:27:00Z"/>
+          <w:rFonts w:ascii="CMU Serif Roman" w:eastAsiaTheme="minorHAnsi" w:hAnsi="CMU Serif Roman" w:cs="CMU Serif Roman"/>
+          <w:rPrChange w:id="116" w:author="Ainhoa Magrach" w:date="2025-05-08T15:27:00Z" w16du:dateUtc="2025-05-08T13:27:00Z">
+            <w:rPr>
+              <w:ins w:id="117" w:author="Ainhoa Magrach" w:date="2025-05-08T15:27:00Z" w16du:dateUtc="2025-05-08T13:27:00Z"/>
+              <w:color w:val="000000"/>
+            </w:rPr>
+          </w:rPrChange>
+        </w:rPr>
+        <w:pPrChange w:id="118" w:author="Ainhoa Magrach" w:date="2025-05-08T15:28:00Z" w16du:dateUtc="2025-05-08T13:28:00Z">
+          <w:pPr>
+            <w:spacing w:before="100" w:beforeAutospacing="1" w:after="100" w:afterAutospacing="1"/>
+          </w:pPr>
+        </w:pPrChange>
+      </w:pPr>
+      <w:ins w:id="119" w:author="Ainhoa Magrach" w:date="2025-05-08T15:27:00Z" w16du:dateUtc="2025-05-08T13:27:00Z">
+        <w:r>
+          <w:rPr>
+            <w:rFonts w:ascii="CMU Serif Roman" w:eastAsiaTheme="minorHAnsi" w:hAnsi="CMU Serif Roman" w:cs="CMU Serif Roman"/>
+            <w:rPrChange w:id="120" w:author="Ainhoa Magrach" w:date="2025-05-08T15:27:00Z" w16du:dateUtc="2025-05-08T13:27:00Z">
+              <w:rPr>
+                <w:color w:val="000000"/>
+              </w:rPr>
+            </w:rPrChange>
+          </w:rPr>
+          <w:t>In terms of temporal shifts, our results indicate the persistence of a core group of bacterial taxa consistently present across all time points and sampling sites. This stable core microbiome, which includes</w:t>
+        </w:r>
+        <w:r>
+          <w:rPr>
+            <w:rFonts w:ascii="CMU Serif Roman" w:eastAsiaTheme="minorHAnsi" w:hAnsi="CMU Serif Roman" w:cs="CMU Serif Roman"/>
+            <w:rPrChange w:id="121" w:author="Ainhoa Magrach" w:date="2025-05-08T15:27:00Z" w16du:dateUtc="2025-05-08T13:27:00Z">
+              <w:rPr>
+                <w:rStyle w:val="apple-converted-space"/>
+                <w:color w:val="000000"/>
+              </w:rPr>
+            </w:rPrChange>
+          </w:rPr>
+          <w:t> </w:t>
+        </w:r>
+        <w:r>
+          <w:rPr>
+            <w:rFonts w:ascii="CMU Serif Roman" w:eastAsiaTheme="minorHAnsi" w:hAnsi="CMU Serif Roman" w:cs="CMU Serif Roman"/>
+            <w:rPrChange w:id="122" w:author="Ainhoa Magrach" w:date="2025-05-08T15:28:00Z" w16du:dateUtc="2025-05-08T13:28:00Z">
+              <w:rPr>
+                <w:rStyle w:val="Strong"/>
+                <w:color w:val="000000"/>
+              </w:rPr>
+            </w:rPrChange>
+          </w:rPr>
+          <w:t>Lactobacillus</w:t>
+        </w:r>
+        <w:r>
+          <w:rPr>
+            <w:rFonts w:ascii="CMU Serif Roman" w:eastAsiaTheme="minorHAnsi" w:hAnsi="CMU Serif Roman" w:cs="CMU Serif Roman"/>
+            <w:rPrChange w:id="123" w:author="Ainhoa Magrach" w:date="2025-05-08T15:28:00Z" w16du:dateUtc="2025-05-08T13:28:00Z">
+              <w:rPr>
+                <w:color w:val="000000"/>
+              </w:rPr>
+            </w:rPrChange>
+          </w:rPr>
+          <w:t>,</w:t>
+        </w:r>
+        <w:r>
+          <w:rPr>
+            <w:rFonts w:ascii="CMU Serif Roman" w:eastAsiaTheme="minorHAnsi" w:hAnsi="CMU Serif Roman" w:cs="CMU Serif Roman"/>
+            <w:rPrChange w:id="124" w:author="Ainhoa Magrach" w:date="2025-05-08T15:28:00Z" w16du:dateUtc="2025-05-08T13:28:00Z">
+              <w:rPr>
+                <w:rStyle w:val="apple-converted-space"/>
+                <w:color w:val="000000"/>
+              </w:rPr>
+            </w:rPrChange>
+          </w:rPr>
+          <w:t> </w:t>
+        </w:r>
+        <w:proofErr w:type="spellStart"/>
+        <w:r>
+          <w:rPr>
+            <w:rFonts w:ascii="CMU Serif Roman" w:eastAsiaTheme="minorHAnsi" w:hAnsi="CMU Serif Roman" w:cs="CMU Serif Roman"/>
+            <w:rPrChange w:id="125" w:author="Ainhoa Magrach" w:date="2025-05-08T15:28:00Z" w16du:dateUtc="2025-05-08T13:28:00Z">
+              <w:rPr>
+                <w:rStyle w:val="Strong"/>
+                <w:color w:val="000000"/>
+              </w:rPr>
+            </w:rPrChange>
+          </w:rPr>
+          <w:t>Gilliamella</w:t>
+        </w:r>
+        <w:proofErr w:type="spellEnd"/>
+        <w:r>
+          <w:rPr>
+            <w:rFonts w:ascii="CMU Serif Roman" w:eastAsiaTheme="minorHAnsi" w:hAnsi="CMU Serif Roman" w:cs="CMU Serif Roman"/>
+            <w:rPrChange w:id="126" w:author="Ainhoa Magrach" w:date="2025-05-08T15:28:00Z" w16du:dateUtc="2025-05-08T13:28:00Z">
+              <w:rPr>
+                <w:color w:val="000000"/>
+              </w:rPr>
+            </w:rPrChange>
+          </w:rPr>
+          <w:t>,</w:t>
+        </w:r>
+        <w:r>
+          <w:rPr>
+            <w:rFonts w:ascii="CMU Serif Roman" w:eastAsiaTheme="minorHAnsi" w:hAnsi="CMU Serif Roman" w:cs="CMU Serif Roman"/>
+            <w:rPrChange w:id="127" w:author="Ainhoa Magrach" w:date="2025-05-08T15:28:00Z" w16du:dateUtc="2025-05-08T13:28:00Z">
+              <w:rPr>
+                <w:rStyle w:val="apple-converted-space"/>
+                <w:color w:val="000000"/>
+              </w:rPr>
+            </w:rPrChange>
+          </w:rPr>
+          <w:t> </w:t>
+        </w:r>
+        <w:proofErr w:type="spellStart"/>
+        <w:r>
+          <w:rPr>
+            <w:rFonts w:ascii="CMU Serif Roman" w:eastAsiaTheme="minorHAnsi" w:hAnsi="CMU Serif Roman" w:cs="CMU Serif Roman"/>
+            <w:rPrChange w:id="128" w:author="Ainhoa Magrach" w:date="2025-05-08T15:28:00Z" w16du:dateUtc="2025-05-08T13:28:00Z">
+              <w:rPr>
+                <w:rStyle w:val="Strong"/>
+                <w:color w:val="000000"/>
+              </w:rPr>
+            </w:rPrChange>
+          </w:rPr>
+          <w:t>Snodgrassella</w:t>
+        </w:r>
+        <w:proofErr w:type="spellEnd"/>
+        <w:r>
+          <w:rPr>
+            <w:rFonts w:ascii="CMU Serif Roman" w:eastAsiaTheme="minorHAnsi" w:hAnsi="CMU Serif Roman" w:cs="CMU Serif Roman"/>
+            <w:rPrChange w:id="129" w:author="Ainhoa Magrach" w:date="2025-05-08T15:28:00Z" w16du:dateUtc="2025-05-08T13:28:00Z">
+              <w:rPr>
+                <w:color w:val="000000"/>
+              </w:rPr>
+            </w:rPrChange>
+          </w:rPr>
+          <w:t>, and</w:t>
+        </w:r>
+        <w:r>
+          <w:rPr>
+            <w:rFonts w:ascii="CMU Serif Roman" w:eastAsiaTheme="minorHAnsi" w:hAnsi="CMU Serif Roman" w:cs="CMU Serif Roman"/>
+            <w:rPrChange w:id="130" w:author="Ainhoa Magrach" w:date="2025-05-08T15:28:00Z" w16du:dateUtc="2025-05-08T13:28:00Z">
+              <w:rPr>
+                <w:rStyle w:val="apple-converted-space"/>
+                <w:color w:val="000000"/>
+              </w:rPr>
+            </w:rPrChange>
+          </w:rPr>
+          <w:t> </w:t>
+        </w:r>
+        <w:proofErr w:type="spellStart"/>
+        <w:r>
+          <w:rPr>
+            <w:rFonts w:ascii="CMU Serif Roman" w:eastAsiaTheme="minorHAnsi" w:hAnsi="CMU Serif Roman" w:cs="CMU Serif Roman"/>
+            <w:rPrChange w:id="131" w:author="Ainhoa Magrach" w:date="2025-05-08T15:28:00Z" w16du:dateUtc="2025-05-08T13:28:00Z">
+              <w:rPr>
+                <w:rStyle w:val="Strong"/>
+                <w:color w:val="000000"/>
+              </w:rPr>
+            </w:rPrChange>
+          </w:rPr>
+          <w:t>Bombiscardovia</w:t>
+        </w:r>
+        <w:proofErr w:type="spellEnd"/>
+        <w:r>
+          <w:rPr>
+            <w:rFonts w:ascii="CMU Serif Roman" w:eastAsiaTheme="minorHAnsi" w:hAnsi="CMU Serif Roman" w:cs="CMU Serif Roman"/>
+            <w:rPrChange w:id="132" w:author="Ainhoa Magrach" w:date="2025-05-08T15:28:00Z" w16du:dateUtc="2025-05-08T13:28:00Z">
+              <w:rPr>
+                <w:color w:val="000000"/>
+              </w:rPr>
+            </w:rPrChange>
+          </w:rPr>
+          <w:t>, likely plays fundamental roles in host health, such as enhancing nutrient absorption, protecting against p</w:t>
+        </w:r>
+        <w:r>
+          <w:rPr>
+            <w:rFonts w:ascii="CMU Serif Roman" w:eastAsiaTheme="minorHAnsi" w:hAnsi="CMU Serif Roman" w:cs="CMU Serif Roman"/>
+            <w:rPrChange w:id="133" w:author="Ainhoa Magrach" w:date="2025-05-08T15:27:00Z" w16du:dateUtc="2025-05-08T13:27:00Z">
+              <w:rPr>
+                <w:color w:val="000000"/>
+              </w:rPr>
+            </w:rPrChange>
+          </w:rPr>
+          <w:t>athogens, and modulating immune responses (REF). The stability of this core community across both spatial and temporal scales suggests a strong host-microbe association that may be evolutionarily conserved.</w:t>
+        </w:r>
+      </w:ins>
+    </w:p>
+    <w:p>
+      <w:pPr>
+        <w:spacing w:before="100" w:beforeAutospacing="1" w:after="100" w:afterAutospacing="1"/>
+        <w:jc w:val="both"/>
+        <w:rPr>
+          <w:ins w:id="134" w:author="Ainhoa Magrach" w:date="2025-05-08T15:27:00Z" w16du:dateUtc="2025-05-08T13:27:00Z"/>
+          <w:rFonts w:ascii="CMU Serif Roman" w:eastAsiaTheme="minorHAnsi" w:hAnsi="CMU Serif Roman" w:cs="CMU Serif Roman"/>
+          <w:rPrChange w:id="135" w:author="Ainhoa Magrach" w:date="2025-05-08T15:27:00Z" w16du:dateUtc="2025-05-08T13:27:00Z">
+            <w:rPr>
+              <w:ins w:id="136" w:author="Ainhoa Magrach" w:date="2025-05-08T15:27:00Z" w16du:dateUtc="2025-05-08T13:27:00Z"/>
+              <w:color w:val="000000"/>
+            </w:rPr>
+          </w:rPrChange>
+        </w:rPr>
+        <w:pPrChange w:id="137" w:author="Ainhoa Magrach" w:date="2025-05-08T15:28:00Z" w16du:dateUtc="2025-05-08T13:28:00Z">
+          <w:pPr>
+            <w:spacing w:before="100" w:beforeAutospacing="1" w:after="100" w:afterAutospacing="1"/>
+          </w:pPr>
+        </w:pPrChange>
+      </w:pPr>
+      <w:ins w:id="138" w:author="Ainhoa Magrach" w:date="2025-05-08T15:27:00Z" w16du:dateUtc="2025-05-08T13:27:00Z">
+        <w:r>
+          <w:rPr>
+            <w:rFonts w:ascii="CMU Serif Roman" w:eastAsiaTheme="minorHAnsi" w:hAnsi="CMU Serif Roman" w:cs="CMU Serif Roman"/>
+            <w:rPrChange w:id="139" w:author="Ainhoa Magrach" w:date="2025-05-08T15:27:00Z" w16du:dateUtc="2025-05-08T13:27:00Z">
+              <w:rPr>
+                <w:color w:val="000000"/>
+              </w:rPr>
+            </w:rPrChange>
+          </w:rPr>
+          <w:t>Interestingly, as the season progressed, the core microbiome was complemented by additional bacterial taxa, particularly species within the genera</w:t>
+        </w:r>
+        <w:r>
+          <w:rPr>
+            <w:rFonts w:ascii="CMU Serif Roman" w:eastAsiaTheme="minorHAnsi" w:hAnsi="CMU Serif Roman" w:cs="CMU Serif Roman"/>
+            <w:rPrChange w:id="140" w:author="Ainhoa Magrach" w:date="2025-05-08T15:27:00Z" w16du:dateUtc="2025-05-08T13:27:00Z">
+              <w:rPr>
+                <w:rStyle w:val="apple-converted-space"/>
+                <w:color w:val="000000"/>
+              </w:rPr>
+            </w:rPrChange>
+          </w:rPr>
+          <w:t> </w:t>
+        </w:r>
+        <w:r>
+          <w:rPr>
+            <w:rFonts w:ascii="CMU Serif Roman" w:eastAsiaTheme="minorHAnsi" w:hAnsi="CMU Serif Roman" w:cs="CMU Serif Roman"/>
+            <w:rPrChange w:id="141" w:author="Ainhoa Magrach" w:date="2025-05-08T15:29:00Z" w16du:dateUtc="2025-05-08T13:29:00Z">
+              <w:rPr>
+                <w:rStyle w:val="Strong"/>
+                <w:color w:val="000000"/>
+              </w:rPr>
+            </w:rPrChange>
+          </w:rPr>
+          <w:t>Pseudomonas</w:t>
+        </w:r>
+        <w:r>
+          <w:rPr>
+            <w:rFonts w:ascii="CMU Serif Roman" w:eastAsiaTheme="minorHAnsi" w:hAnsi="CMU Serif Roman" w:cs="CMU Serif Roman"/>
+            <w:rPrChange w:id="142" w:author="Ainhoa Magrach" w:date="2025-05-08T15:29:00Z" w16du:dateUtc="2025-05-08T13:29:00Z">
+              <w:rPr>
+                <w:color w:val="000000"/>
+              </w:rPr>
+            </w:rPrChange>
+          </w:rPr>
+          <w:t>,</w:t>
+        </w:r>
+        <w:r>
+          <w:rPr>
+            <w:rFonts w:ascii="CMU Serif Roman" w:eastAsiaTheme="minorHAnsi" w:hAnsi="CMU Serif Roman" w:cs="CMU Serif Roman"/>
+            <w:rPrChange w:id="143" w:author="Ainhoa Magrach" w:date="2025-05-08T15:29:00Z" w16du:dateUtc="2025-05-08T13:29:00Z">
+              <w:rPr>
+                <w:rStyle w:val="apple-converted-space"/>
+                <w:color w:val="000000"/>
+              </w:rPr>
+            </w:rPrChange>
+          </w:rPr>
+          <w:t> </w:t>
+        </w:r>
+        <w:r>
+          <w:rPr>
+            <w:rFonts w:ascii="CMU Serif Roman" w:eastAsiaTheme="minorHAnsi" w:hAnsi="CMU Serif Roman" w:cs="CMU Serif Roman"/>
+            <w:rPrChange w:id="144" w:author="Ainhoa Magrach" w:date="2025-05-08T15:29:00Z" w16du:dateUtc="2025-05-08T13:29:00Z">
+              <w:rPr>
+                <w:rStyle w:val="Strong"/>
+                <w:color w:val="000000"/>
+              </w:rPr>
+            </w:rPrChange>
+          </w:rPr>
+          <w:t>Bacillus</w:t>
+        </w:r>
+        <w:r>
+          <w:rPr>
+            <w:rFonts w:ascii="CMU Serif Roman" w:eastAsiaTheme="minorHAnsi" w:hAnsi="CMU Serif Roman" w:cs="CMU Serif Roman"/>
+            <w:rPrChange w:id="145" w:author="Ainhoa Magrach" w:date="2025-05-08T15:29:00Z" w16du:dateUtc="2025-05-08T13:29:00Z">
+              <w:rPr>
+                <w:color w:val="000000"/>
+              </w:rPr>
+            </w:rPrChange>
+          </w:rPr>
+          <w:t>,</w:t>
+        </w:r>
+        <w:r>
+          <w:rPr>
+            <w:rFonts w:ascii="CMU Serif Roman" w:eastAsiaTheme="minorHAnsi" w:hAnsi="CMU Serif Roman" w:cs="CMU Serif Roman"/>
+            <w:rPrChange w:id="146" w:author="Ainhoa Magrach" w:date="2025-05-08T15:29:00Z" w16du:dateUtc="2025-05-08T13:29:00Z">
+              <w:rPr>
+                <w:rStyle w:val="apple-converted-space"/>
+                <w:color w:val="000000"/>
+              </w:rPr>
+            </w:rPrChange>
+          </w:rPr>
+          <w:t> </w:t>
+        </w:r>
+        <w:proofErr w:type="spellStart"/>
+        <w:r>
+          <w:rPr>
+            <w:rFonts w:ascii="CMU Serif Roman" w:eastAsiaTheme="minorHAnsi" w:hAnsi="CMU Serif Roman" w:cs="CMU Serif Roman"/>
+            <w:rPrChange w:id="147" w:author="Ainhoa Magrach" w:date="2025-05-08T15:29:00Z" w16du:dateUtc="2025-05-08T13:29:00Z">
+              <w:rPr>
+                <w:rStyle w:val="Strong"/>
+                <w:color w:val="000000"/>
+              </w:rPr>
+            </w:rPrChange>
+          </w:rPr>
+          <w:t>Commensalibacter</w:t>
+        </w:r>
+        <w:proofErr w:type="spellEnd"/>
+        <w:r>
+          <w:rPr>
+            <w:rFonts w:ascii="CMU Serif Roman" w:eastAsiaTheme="minorHAnsi" w:hAnsi="CMU Serif Roman" w:cs="CMU Serif Roman"/>
+            <w:rPrChange w:id="148" w:author="Ainhoa Magrach" w:date="2025-05-08T15:29:00Z" w16du:dateUtc="2025-05-08T13:29:00Z">
+              <w:rPr>
+                <w:color w:val="000000"/>
+              </w:rPr>
+            </w:rPrChange>
+          </w:rPr>
+          <w:t>, and</w:t>
+        </w:r>
+        <w:r>
+          <w:rPr>
+            <w:rFonts w:ascii="CMU Serif Roman" w:eastAsiaTheme="minorHAnsi" w:hAnsi="CMU Serif Roman" w:cs="CMU Serif Roman"/>
+            <w:rPrChange w:id="149" w:author="Ainhoa Magrach" w:date="2025-05-08T15:29:00Z" w16du:dateUtc="2025-05-08T13:29:00Z">
+              <w:rPr>
+                <w:rStyle w:val="apple-converted-space"/>
+                <w:color w:val="000000"/>
+              </w:rPr>
+            </w:rPrChange>
+          </w:rPr>
+          <w:t> </w:t>
+        </w:r>
+        <w:proofErr w:type="spellStart"/>
+        <w:r>
+          <w:rPr>
+            <w:rFonts w:ascii="CMU Serif Roman" w:eastAsiaTheme="minorHAnsi" w:hAnsi="CMU Serif Roman" w:cs="CMU Serif Roman"/>
+            <w:rPrChange w:id="150" w:author="Ainhoa Magrach" w:date="2025-05-08T15:29:00Z" w16du:dateUtc="2025-05-08T13:29:00Z">
+              <w:rPr>
+                <w:rStyle w:val="Strong"/>
+                <w:color w:val="000000"/>
+              </w:rPr>
+            </w:rPrChange>
+          </w:rPr>
+          <w:t>Apibacter</w:t>
+        </w:r>
+        <w:proofErr w:type="spellEnd"/>
+        <w:r>
+          <w:rPr>
+            <w:rFonts w:ascii="CMU Serif Roman" w:eastAsiaTheme="minorHAnsi" w:hAnsi="CMU Serif Roman" w:cs="CMU Serif Roman"/>
+            <w:rPrChange w:id="151" w:author="Ainhoa Magrach" w:date="2025-05-08T15:29:00Z" w16du:dateUtc="2025-05-08T13:29:00Z">
+              <w:rPr>
+                <w:color w:val="000000"/>
+              </w:rPr>
+            </w:rPrChange>
+          </w:rPr>
+          <w:t>.</w:t>
+        </w:r>
+        <w:r>
+          <w:rPr>
+            <w:rFonts w:ascii="CMU Serif Roman" w:eastAsiaTheme="minorHAnsi" w:hAnsi="CMU Serif Roman" w:cs="CMU Serif Roman"/>
+            <w:rPrChange w:id="152" w:author="Ainhoa Magrach" w:date="2025-05-08T15:27:00Z" w16du:dateUtc="2025-05-08T13:27:00Z">
+              <w:rPr>
+                <w:color w:val="000000"/>
+              </w:rPr>
+            </w:rPrChange>
+          </w:rPr>
+          <w:t xml:space="preserve"> This late-season diversification could be driven by changes in floral availability and composition, shifts in foraging behavior, or increased environmental exposure as colonies expand and worker bees travel farther distances (REF). These supplementary taxa may represent transient members of the microbiome that are acquired from specific floral resources or environmental sources, potentially enhancing metabolic capabilities or stress tolerance during the late foraging season.</w:t>
+        </w:r>
+      </w:ins>
+    </w:p>
+    <w:p>
+      <w:pPr>
+        <w:spacing w:before="100" w:beforeAutospacing="1" w:after="100" w:afterAutospacing="1"/>
+        <w:jc w:val="both"/>
+        <w:rPr>
+          <w:ins w:id="153" w:author="Ainhoa Magrach" w:date="2025-05-08T15:27:00Z" w16du:dateUtc="2025-05-08T13:27:00Z"/>
+          <w:rFonts w:ascii="CMU Serif Roman" w:eastAsiaTheme="minorHAnsi" w:hAnsi="CMU Serif Roman" w:cs="CMU Serif Roman"/>
+          <w:rPrChange w:id="154" w:author="Ainhoa Magrach" w:date="2025-05-08T15:27:00Z" w16du:dateUtc="2025-05-08T13:27:00Z">
+            <w:rPr>
+              <w:ins w:id="155" w:author="Ainhoa Magrach" w:date="2025-05-08T15:27:00Z" w16du:dateUtc="2025-05-08T13:27:00Z"/>
+              <w:color w:val="000000"/>
+            </w:rPr>
+          </w:rPrChange>
+        </w:rPr>
+        <w:pPrChange w:id="156" w:author="Ainhoa Magrach" w:date="2025-05-08T15:28:00Z" w16du:dateUtc="2025-05-08T13:28:00Z">
+          <w:pPr>
+            <w:spacing w:before="100" w:beforeAutospacing="1" w:after="100" w:afterAutospacing="1"/>
+          </w:pPr>
+        </w:pPrChange>
+      </w:pPr>
+      <w:ins w:id="157" w:author="Ainhoa Magrach" w:date="2025-05-08T15:27:00Z" w16du:dateUtc="2025-05-08T13:27:00Z">
+        <w:r>
+          <w:rPr>
+            <w:rFonts w:ascii="CMU Serif Roman" w:eastAsiaTheme="minorHAnsi" w:hAnsi="CMU Serif Roman" w:cs="CMU Serif Roman"/>
+            <w:rPrChange w:id="158" w:author="Ainhoa Magrach" w:date="2025-05-08T15:27:00Z" w16du:dateUtc="2025-05-08T13:27:00Z">
+              <w:rPr>
+                <w:color w:val="000000"/>
+              </w:rPr>
+            </w:rPrChange>
+          </w:rPr>
+          <w:t>Our analysis revealed distinct temporal clustering of bacterial communities, with clear compositional differences between early and late time points. This temporal structuring suggests that the microbiome is not static but dynamically responds to seasonal changes in the environment. The early-season microbiome may be shaped by overwintering survival and the limited floral diversity available during initial foraging, while the late-season community reflects cumulative interactions with a broader spectrum of plant species. This shift may also be influenced by colony development stages, where increased colony size and worker numbers intensify environmental interactions.</w:t>
+        </w:r>
+      </w:ins>
+    </w:p>
+    <w:p>
+      <w:pPr>
+        <w:spacing w:before="100" w:beforeAutospacing="1" w:after="100" w:afterAutospacing="1"/>
+        <w:jc w:val="both"/>
+        <w:rPr>
+          <w:ins w:id="159" w:author="Ainhoa Magrach" w:date="2025-05-08T15:27:00Z" w16du:dateUtc="2025-05-08T13:27:00Z"/>
+          <w:rFonts w:ascii="CMU Serif Roman" w:eastAsiaTheme="minorHAnsi" w:hAnsi="CMU Serif Roman" w:cs="CMU Serif Roman"/>
+          <w:rPrChange w:id="160" w:author="Ainhoa Magrach" w:date="2025-05-08T15:27:00Z" w16du:dateUtc="2025-05-08T13:27:00Z">
+            <w:rPr>
+              <w:ins w:id="161" w:author="Ainhoa Magrach" w:date="2025-05-08T15:27:00Z" w16du:dateUtc="2025-05-08T13:27:00Z"/>
+              <w:color w:val="000000"/>
+            </w:rPr>
+          </w:rPrChange>
+        </w:rPr>
+        <w:pPrChange w:id="162" w:author="Ainhoa Magrach" w:date="2025-05-08T15:28:00Z" w16du:dateUtc="2025-05-08T13:28:00Z">
+          <w:pPr>
+            <w:spacing w:before="100" w:beforeAutospacing="1" w:after="100" w:afterAutospacing="1"/>
+          </w:pPr>
+        </w:pPrChange>
+      </w:pPr>
+      <w:ins w:id="163" w:author="Ainhoa Magrach" w:date="2025-05-08T15:27:00Z" w16du:dateUtc="2025-05-08T13:27:00Z">
+        <w:r>
+          <w:rPr>
+            <w:rFonts w:ascii="CMU Serif Roman" w:eastAsiaTheme="minorHAnsi" w:hAnsi="CMU Serif Roman" w:cs="CMU Serif Roman"/>
+            <w:rPrChange w:id="164" w:author="Ainhoa Magrach" w:date="2025-05-08T15:27:00Z" w16du:dateUtc="2025-05-08T13:27:00Z">
+              <w:rPr>
+                <w:color w:val="000000"/>
+              </w:rPr>
+            </w:rPrChange>
+          </w:rPr>
+          <w:t xml:space="preserve">Together, these findings underscore the dynamic nature of bumblebee gut microbiomes and the role of seasonal changes in shaping microbial community structure. They also highlight the importance of considering both temporal and spatial variation when assessing microbiome stability and its implications for host health and ecosystem functioning. Future studies with larger sample sizes and finer temporal resolution would </w:t>
+        </w:r>
+        <w:r>
+          <w:rPr>
+            <w:rFonts w:ascii="CMU Serif Roman" w:eastAsiaTheme="minorHAnsi" w:hAnsi="CMU Serif Roman" w:cs="CMU Serif Roman"/>
+            <w:rPrChange w:id="165" w:author="Ainhoa Magrach" w:date="2025-05-08T15:27:00Z" w16du:dateUtc="2025-05-08T13:27:00Z">
+              <w:rPr>
+                <w:color w:val="000000"/>
+              </w:rPr>
+            </w:rPrChange>
+          </w:rPr>
+          <w:lastRenderedPageBreak/>
+          <w:t>be valuable for disentangling the drivers of microbiome shifts and their potential consequences for pollinator health and resilience.</w:t>
+        </w:r>
+      </w:ins>
     </w:p>
     <w:p>
       <w:pPr>
         <w:pStyle w:val="BodyText"/>
-      </w:pPr>
-    </w:p>
-    <w:p>
-      <w:pPr>
-        <w:pStyle w:val="Heading2"/>
-        <w:jc w:val="both"/>
-        <w:rPr>
-          <w:ins w:id="73" w:author="Ainhoa Magrach" w:date="2025-05-07T13:58:00Z" w16du:dateUtc="2025-05-07T11:58:00Z"/>
-          <w:rFonts w:ascii="CMU Serif Roman" w:hAnsi="CMU Serif Roman" w:cs="CMU Serif Roman"/>
-          <w:lang w:val="es-ES"/>
-        </w:rPr>
-      </w:pPr>
-      <w:bookmarkStart w:id="74" w:name="discussion"/>
-      <w:bookmarkEnd w:id="25"/>
-      <w:proofErr w:type="spellStart"/>
-      <w:r>
-        <w:rPr>
-          <w:rFonts w:ascii="CMU Serif Roman" w:hAnsi="CMU Serif Roman" w:cs="CMU Serif Roman"/>
-          <w:lang w:val="es-ES"/>
-        </w:rPr>
-        <w:t>Discussion</w:t>
-      </w:r>
-      <w:proofErr w:type="spellEnd"/>
-    </w:p>
-    <w:p>
-      <w:pPr>
-        <w:pStyle w:val="BodyText"/>
-        <w:rPr>
-          <w:rFonts w:ascii="CMU Serif Roman" w:hAnsi="CMU Serif Roman" w:cs="CMU Serif Roman"/>
-          <w:rPrChange w:id="75" w:author="Ainhoa Magrach" w:date="2025-05-07T13:58:00Z" w16du:dateUtc="2025-05-07T11:58:00Z">
+        <w:jc w:val="both"/>
+        <w:rPr>
+          <w:rFonts w:ascii="CMU Serif Roman" w:hAnsi="CMU Serif Roman" w:cs="CMU Serif Roman"/>
+          <w:rPrChange w:id="166" w:author="Ainhoa Magrach" w:date="2025-05-07T13:58:00Z" w16du:dateUtc="2025-05-07T11:58:00Z">
             <w:rPr>
               <w:rFonts w:ascii="CMU Serif Roman" w:hAnsi="CMU Serif Roman" w:cs="CMU Serif Roman"/>
               <w:lang w:val="es-ES"/>
             </w:rPr>
           </w:rPrChange>
         </w:rPr>
-        <w:pPrChange w:id="76" w:author="Ainhoa Magrach" w:date="2025-05-07T13:58:00Z" w16du:dateUtc="2025-05-07T11:58:00Z">
+        <w:pPrChange w:id="167" w:author="Ainhoa Magrach" w:date="2025-05-08T15:15:00Z" w16du:dateUtc="2025-05-08T13:15:00Z">
           <w:pPr>
             <w:pStyle w:val="Heading2"/>
             <w:jc w:val="both"/>
           </w:pPr>
         </w:pPrChange>
       </w:pPr>
-      <w:ins w:id="77" w:author="Ainhoa Magrach" w:date="2025-05-07T13:58:00Z" w16du:dateUtc="2025-05-07T11:58:00Z">
-        <w:r>
-          <w:rPr>
-            <w:rFonts w:ascii="CMU Serif Roman" w:hAnsi="CMU Serif Roman" w:cs="CMU Serif Roman"/>
-            <w:rPrChange w:id="78" w:author="Ainhoa Magrach" w:date="2025-05-07T13:58:00Z" w16du:dateUtc="2025-05-07T11:58:00Z">
-              <w:rPr>
-                <w:rFonts w:ascii="CMU Serif Roman" w:hAnsi="CMU Serif Roman" w:cs="CMU Serif Roman"/>
-                <w:lang w:val="es-ES"/>
-              </w:rPr>
-            </w:rPrChange>
-          </w:rPr>
-          <w:t xml:space="preserve">Our </w:t>
-        </w:r>
-        <w:r>
-          <w:rPr>
-            <w:rFonts w:ascii="CMU Serif Roman" w:hAnsi="CMU Serif Roman" w:cs="CMU Serif Roman"/>
-          </w:rPr>
-          <w:t>analysis</w:t>
-        </w:r>
-        <w:r>
-          <w:rPr>
-            <w:rFonts w:ascii="CMU Serif Roman" w:hAnsi="CMU Serif Roman" w:cs="CMU Serif Roman"/>
-            <w:rPrChange w:id="79" w:author="Ainhoa Magrach" w:date="2025-05-07T13:58:00Z" w16du:dateUtc="2025-05-07T11:58:00Z">
-              <w:rPr>
-                <w:rFonts w:ascii="CMU Serif Roman" w:hAnsi="CMU Serif Roman" w:cs="CMU Serif Roman"/>
-                <w:lang w:val="es-ES"/>
-              </w:rPr>
-            </w:rPrChange>
-          </w:rPr>
-          <w:t xml:space="preserve"> of the mi</w:t>
-        </w:r>
-        <w:r>
-          <w:rPr>
-            <w:rFonts w:ascii="CMU Serif Roman" w:hAnsi="CMU Serif Roman" w:cs="CMU Serif Roman"/>
-          </w:rPr>
-          <w:t xml:space="preserve">crobial composition of wild bumblebee guts shows that </w:t>
+    </w:p>
+    <w:p>
+      <w:pPr>
+        <w:rPr>
+          <w:ins w:id="168" w:author="Ainhoa Magrach" w:date="2025-05-08T15:12:00Z" w16du:dateUtc="2025-05-08T13:12:00Z"/>
+          <w:rFonts w:ascii="CMU Serif Roman" w:eastAsiaTheme="majorEastAsia" w:hAnsi="CMU Serif Roman" w:cs="CMU Serif Roman"/>
+          <w:color w:val="0F4761" w:themeColor="accent1" w:themeShade="BF"/>
+          <w:sz w:val="32"/>
+          <w:szCs w:val="32"/>
+        </w:rPr>
+      </w:pPr>
+      <w:bookmarkStart w:id="169" w:name="references"/>
+      <w:bookmarkEnd w:id="85"/>
+      <w:ins w:id="170" w:author="Ainhoa Magrach" w:date="2025-05-08T15:12:00Z" w16du:dateUtc="2025-05-08T13:12:00Z">
+        <w:r>
+          <w:rPr>
+            <w:rFonts w:ascii="CMU Serif Roman" w:hAnsi="CMU Serif Roman" w:cs="CMU Serif Roman"/>
+          </w:rPr>
+          <w:br w:type="page"/>
         </w:r>
       </w:ins>
     </w:p>
@@ -1731,7 +2611,7 @@
         <w:jc w:val="both"/>
         <w:rPr>
           <w:rFonts w:ascii="CMU Serif Roman" w:hAnsi="CMU Serif Roman" w:cs="CMU Serif Roman"/>
-          <w:rPrChange w:id="80" w:author="Ainhoa Magrach" w:date="2025-05-07T13:58:00Z" w16du:dateUtc="2025-05-07T11:58:00Z">
+          <w:rPrChange w:id="171" w:author="Ainhoa Magrach" w:date="2025-05-07T13:58:00Z" w16du:dateUtc="2025-05-07T11:58:00Z">
             <w:rPr>
               <w:rFonts w:ascii="CMU Serif Roman" w:hAnsi="CMU Serif Roman" w:cs="CMU Serif Roman"/>
               <w:lang w:val="es-ES"/>
@@ -1739,18 +2619,17 @@
           </w:rPrChange>
         </w:rPr>
       </w:pPr>
-      <w:bookmarkStart w:id="81" w:name="references"/>
-      <w:bookmarkEnd w:id="74"/>
-      <w:r>
-        <w:rPr>
-          <w:rFonts w:ascii="CMU Serif Roman" w:hAnsi="CMU Serif Roman" w:cs="CMU Serif Roman"/>
-          <w:rPrChange w:id="82" w:author="Ainhoa Magrach" w:date="2025-05-07T13:58:00Z" w16du:dateUtc="2025-05-07T11:58:00Z">
+      <w:r>
+        <w:rPr>
+          <w:rFonts w:ascii="CMU Serif Roman" w:hAnsi="CMU Serif Roman" w:cs="CMU Serif Roman"/>
+          <w:rPrChange w:id="172" w:author="Ainhoa Magrach" w:date="2025-05-07T13:58:00Z" w16du:dateUtc="2025-05-07T11:58:00Z">
             <w:rPr>
               <w:rFonts w:ascii="CMU Serif Roman" w:hAnsi="CMU Serif Roman" w:cs="CMU Serif Roman"/>
               <w:lang w:val="es-ES"/>
             </w:rPr>
           </w:rPrChange>
         </w:rPr>
+        <w:lastRenderedPageBreak/>
         <w:t>References</w:t>
       </w:r>
     </w:p>
@@ -1763,8 +2642,8 @@
           <w:lang w:val="es-ES"/>
         </w:rPr>
       </w:pPr>
-      <w:bookmarkStart w:id="83" w:name="ref-Albizu2002COMPARACINDL"/>
-      <w:bookmarkStart w:id="84" w:name="refs"/>
+      <w:bookmarkStart w:id="173" w:name="ref-Albizu2002COMPARACINDL"/>
+      <w:bookmarkStart w:id="174" w:name="refs"/>
       <w:r>
         <w:rPr>
           <w:rFonts w:ascii="CMU Serif Roman" w:hAnsi="CMU Serif Roman" w:cs="CMU Serif Roman"/>
@@ -1877,8 +2756,8 @@
           <w:rFonts w:ascii="CMU Serif Roman" w:hAnsi="CMU Serif Roman" w:cs="CMU Serif Roman"/>
         </w:rPr>
       </w:pPr>
-      <w:bookmarkStart w:id="85" w:name="ref-allen-perkins2024"/>
-      <w:bookmarkEnd w:id="83"/>
+      <w:bookmarkStart w:id="175" w:name="ref-allen-perkins2024"/>
+      <w:bookmarkEnd w:id="173"/>
       <w:r>
         <w:rPr>
           <w:rFonts w:ascii="CMU Serif Roman" w:hAnsi="CMU Serif Roman" w:cs="CMU Serif Roman"/>
@@ -1946,13 +2825,12 @@
           <w:rFonts w:ascii="CMU Serif Roman" w:hAnsi="CMU Serif Roman" w:cs="CMU Serif Roman"/>
         </w:rPr>
       </w:pPr>
-      <w:bookmarkStart w:id="86" w:name="ref-carlini2024"/>
-      <w:bookmarkEnd w:id="85"/>
-      <w:r>
-        <w:rPr>
-          <w:rFonts w:ascii="CMU Serif Roman" w:hAnsi="CMU Serif Roman" w:cs="CMU Serif Roman"/>
-        </w:rPr>
-        <w:lastRenderedPageBreak/>
+      <w:bookmarkStart w:id="176" w:name="ref-carlini2024"/>
+      <w:bookmarkEnd w:id="175"/>
+      <w:r>
+        <w:rPr>
+          <w:rFonts w:ascii="CMU Serif Roman" w:hAnsi="CMU Serif Roman" w:cs="CMU Serif Roman"/>
+        </w:rPr>
         <w:t xml:space="preserve">Carlini, David B., Sundre K. Winslow, Katja Cloppenborg-Schmidt, and John F. Baines. 2024. “Quantitative Microbiome Profiling of Honey Bee (Apis Mellifera) Guts Is Predictive of Winter Colony Loss in Northern Virginia (USA).” </w:t>
       </w:r>
       <w:r>
@@ -1993,8 +2871,8 @@
           <w:rFonts w:ascii="CMU Serif Roman" w:hAnsi="CMU Serif Roman" w:cs="CMU Serif Roman"/>
         </w:rPr>
       </w:pPr>
-      <w:bookmarkStart w:id="87" w:name="ref-devkota2024"/>
-      <w:bookmarkEnd w:id="86"/>
+      <w:bookmarkStart w:id="177" w:name="ref-devkota2024"/>
+      <w:bookmarkEnd w:id="176"/>
       <w:r>
         <w:rPr>
           <w:rFonts w:ascii="CMU Serif Roman" w:hAnsi="CMU Serif Roman" w:cs="CMU Serif Roman"/>
@@ -2039,8 +2917,8 @@
           <w:rFonts w:ascii="CMU Serif Roman" w:hAnsi="CMU Serif Roman" w:cs="CMU Serif Roman"/>
         </w:rPr>
       </w:pPr>
-      <w:bookmarkStart w:id="88" w:name="ref-engel2012"/>
-      <w:bookmarkEnd w:id="87"/>
+      <w:bookmarkStart w:id="178" w:name="ref-engel2012"/>
+      <w:bookmarkEnd w:id="177"/>
       <w:r>
         <w:rPr>
           <w:rFonts w:ascii="CMU Serif Roman" w:hAnsi="CMU Serif Roman" w:cs="CMU Serif Roman"/>
@@ -2085,8 +2963,8 @@
           <w:rFonts w:ascii="CMU Serif Roman" w:hAnsi="CMU Serif Roman" w:cs="CMU Serif Roman"/>
         </w:rPr>
       </w:pPr>
-      <w:bookmarkStart w:id="89" w:name="ref-Engel2013"/>
-      <w:bookmarkEnd w:id="88"/>
+      <w:bookmarkStart w:id="179" w:name="ref-Engel2013"/>
+      <w:bookmarkEnd w:id="178"/>
       <w:r>
         <w:rPr>
           <w:rFonts w:ascii="CMU Serif Roman" w:hAnsi="CMU Serif Roman" w:cs="CMU Serif Roman"/>
@@ -2131,8 +3009,8 @@
           <w:rFonts w:ascii="CMU Serif Roman" w:hAnsi="CMU Serif Roman" w:cs="CMU Serif Roman"/>
         </w:rPr>
       </w:pPr>
-      <w:bookmarkStart w:id="90" w:name="ref-ferguson2018"/>
-      <w:bookmarkEnd w:id="89"/>
+      <w:bookmarkStart w:id="180" w:name="ref-ferguson2018"/>
+      <w:bookmarkEnd w:id="179"/>
       <w:r>
         <w:rPr>
           <w:rFonts w:ascii="CMU Serif Roman" w:hAnsi="CMU Serif Roman" w:cs="CMU Serif Roman"/>
@@ -2177,8 +3055,8 @@
           <w:rFonts w:ascii="CMU Serif Roman" w:hAnsi="CMU Serif Roman" w:cs="CMU Serif Roman"/>
         </w:rPr>
       </w:pPr>
-      <w:bookmarkStart w:id="91" w:name="ref-gérard2020"/>
-      <w:bookmarkEnd w:id="90"/>
+      <w:bookmarkStart w:id="181" w:name="ref-gérard2020"/>
+      <w:bookmarkEnd w:id="180"/>
       <w:r>
         <w:rPr>
           <w:rFonts w:ascii="CMU Serif Roman" w:hAnsi="CMU Serif Roman" w:cs="CMU Serif Roman"/>
@@ -2220,11 +3098,12 @@
         <w:pStyle w:val="Bibliography"/>
         <w:jc w:val="both"/>
         <w:rPr>
-          <w:rFonts w:ascii="CMU Serif Roman" w:hAnsi="CMU Serif Roman" w:cs="CMU Serif Roman"/>
-        </w:rPr>
-      </w:pPr>
-      <w:bookmarkStart w:id="92" w:name="ref-guzman2024"/>
-      <w:bookmarkEnd w:id="91"/>
+          <w:ins w:id="182" w:author="Ainhoa Magrach" w:date="2025-05-08T13:11:00Z" w16du:dateUtc="2025-05-08T11:11:00Z"/>
+          <w:rFonts w:ascii="CMU Serif Roman" w:hAnsi="CMU Serif Roman" w:cs="CMU Serif Roman"/>
+        </w:rPr>
+      </w:pPr>
+      <w:bookmarkStart w:id="183" w:name="ref-guzman2024"/>
+      <w:bookmarkEnd w:id="181"/>
       <w:r>
         <w:rPr>
           <w:rFonts w:ascii="CMU Serif Roman" w:hAnsi="CMU Serif Roman" w:cs="CMU Serif Roman"/>
@@ -2264,13 +3143,126 @@
     <w:p>
       <w:pPr>
         <w:pStyle w:val="Bibliography"/>
-        <w:jc w:val="both"/>
-        <w:rPr>
-          <w:rFonts w:ascii="CMU Serif Roman" w:hAnsi="CMU Serif Roman" w:cs="CMU Serif Roman"/>
-        </w:rPr>
-      </w:pPr>
-      <w:bookmarkStart w:id="93" w:name="ref-klein2006"/>
-      <w:bookmarkEnd w:id="92"/>
+        <w:rPr>
+          <w:rFonts w:ascii="CMU Serif Roman" w:hAnsi="CMU Serif Roman" w:cs="CMU Serif Roman"/>
+        </w:rPr>
+        <w:pPrChange w:id="184" w:author="Ainhoa Magrach" w:date="2025-05-08T13:11:00Z" w16du:dateUtc="2025-05-08T11:11:00Z">
+          <w:pPr>
+            <w:pStyle w:val="Bibliography"/>
+            <w:jc w:val="both"/>
+          </w:pPr>
+        </w:pPrChange>
+      </w:pPr>
+      <w:bookmarkStart w:id="185" w:name="ref-iNEXT"/>
+      <w:ins w:id="186" w:author="Ainhoa Magrach" w:date="2025-05-08T13:11:00Z" w16du:dateUtc="2025-05-08T11:11:00Z">
+        <w:r>
+          <w:rPr>
+            <w:rFonts w:ascii="CMU Serif Roman" w:hAnsi="CMU Serif Roman" w:cs="CMU Serif Roman"/>
+            <w:rPrChange w:id="187" w:author="Ainhoa Magrach" w:date="2025-05-08T13:11:00Z" w16du:dateUtc="2025-05-08T11:11:00Z">
+              <w:rPr/>
+            </w:rPrChange>
+          </w:rPr>
+          <w:lastRenderedPageBreak/>
+          <w:t>Hsieh, T. C., K. H. Ma, and Anne Chao. 2024. “</w:t>
+        </w:r>
+        <w:proofErr w:type="spellStart"/>
+        <w:r>
+          <w:rPr>
+            <w:rFonts w:ascii="CMU Serif Roman" w:hAnsi="CMU Serif Roman" w:cs="CMU Serif Roman"/>
+            <w:rPrChange w:id="188" w:author="Ainhoa Magrach" w:date="2025-05-08T13:11:00Z" w16du:dateUtc="2025-05-08T11:11:00Z">
+              <w:rPr/>
+            </w:rPrChange>
+          </w:rPr>
+          <w:t>iNEXT</w:t>
+        </w:r>
+        <w:proofErr w:type="spellEnd"/>
+        <w:r>
+          <w:rPr>
+            <w:rFonts w:ascii="CMU Serif Roman" w:hAnsi="CMU Serif Roman" w:cs="CMU Serif Roman"/>
+            <w:rPrChange w:id="189" w:author="Ainhoa Magrach" w:date="2025-05-08T13:11:00Z" w16du:dateUtc="2025-05-08T11:11:00Z">
+              <w:rPr/>
+            </w:rPrChange>
+          </w:rPr>
+          <w:t xml:space="preserve">: Interpolation and Extrapolation for Species Diversity.” </w:t>
+        </w:r>
+        <w:r>
+          <w:rPr>
+            <w:rFonts w:ascii="CMU Serif Roman" w:hAnsi="CMU Serif Roman" w:cs="CMU Serif Roman"/>
+            <w:rPrChange w:id="190" w:author="Ainhoa Magrach" w:date="2025-05-08T13:11:00Z" w16du:dateUtc="2025-05-08T11:11:00Z">
+              <w:rPr/>
+            </w:rPrChange>
+          </w:rPr>
+          <w:fldChar w:fldCharType="begin"/>
+        </w:r>
+        <w:r>
+          <w:rPr>
+            <w:rFonts w:ascii="CMU Serif Roman" w:hAnsi="CMU Serif Roman" w:cs="CMU Serif Roman"/>
+            <w:rPrChange w:id="191" w:author="Ainhoa Magrach" w:date="2025-05-08T13:11:00Z" w16du:dateUtc="2025-05-08T11:11:00Z">
+              <w:rPr/>
+            </w:rPrChange>
+          </w:rPr>
+          <w:instrText>HYPERLINK "http://chao.stat.nthu.edu.tw/wordpress/software_download/" \h</w:instrText>
+        </w:r>
+        <w:r>
+          <w:rPr>
+            <w:rFonts w:ascii="CMU Serif Roman" w:hAnsi="CMU Serif Roman" w:cs="CMU Serif Roman"/>
+            <w:rPrChange w:id="192" w:author="Ainhoa Magrach" w:date="2025-05-08T13:11:00Z" w16du:dateUtc="2025-05-08T11:11:00Z">
+              <w:rPr/>
+            </w:rPrChange>
+          </w:rPr>
+        </w:r>
+        <w:r>
+          <w:rPr>
+            <w:rFonts w:ascii="CMU Serif Roman" w:hAnsi="CMU Serif Roman" w:cs="CMU Serif Roman"/>
+            <w:rPrChange w:id="193" w:author="Ainhoa Magrach" w:date="2025-05-08T13:11:00Z" w16du:dateUtc="2025-05-08T11:11:00Z">
+              <w:rPr/>
+            </w:rPrChange>
+          </w:rPr>
+          <w:fldChar w:fldCharType="separate"/>
+        </w:r>
+        <w:r>
+          <w:rPr>
+            <w:rStyle w:val="Hyperlink"/>
+            <w:rFonts w:ascii="CMU Serif Roman" w:hAnsi="CMU Serif Roman" w:cs="CMU Serif Roman"/>
+            <w:rPrChange w:id="194" w:author="Ainhoa Magrach" w:date="2025-05-08T13:11:00Z" w16du:dateUtc="2025-05-08T11:11:00Z">
+              <w:rPr>
+                <w:rStyle w:val="Hyperlink"/>
+              </w:rPr>
+            </w:rPrChange>
+          </w:rPr>
+          <w:t>http://chao.stat.nthu.edu.tw/wordpress/software_download/</w:t>
+        </w:r>
+        <w:r>
+          <w:rPr>
+            <w:rFonts w:ascii="CMU Serif Roman" w:hAnsi="CMU Serif Roman" w:cs="CMU Serif Roman"/>
+            <w:rPrChange w:id="195" w:author="Ainhoa Magrach" w:date="2025-05-08T13:11:00Z" w16du:dateUtc="2025-05-08T11:11:00Z">
+              <w:rPr/>
+            </w:rPrChange>
+          </w:rPr>
+          <w:fldChar w:fldCharType="end"/>
+        </w:r>
+        <w:r>
+          <w:rPr>
+            <w:rFonts w:ascii="CMU Serif Roman" w:hAnsi="CMU Serif Roman" w:cs="CMU Serif Roman"/>
+            <w:rPrChange w:id="196" w:author="Ainhoa Magrach" w:date="2025-05-08T13:11:00Z" w16du:dateUtc="2025-05-08T11:11:00Z">
+              <w:rPr/>
+            </w:rPrChange>
+          </w:rPr>
+          <w:t>.</w:t>
+        </w:r>
+      </w:ins>
+      <w:bookmarkEnd w:id="185"/>
+    </w:p>
+    <w:p>
+      <w:pPr>
+        <w:pStyle w:val="Bibliography"/>
+        <w:jc w:val="both"/>
+        <w:rPr>
+          <w:rFonts w:ascii="CMU Serif Roman" w:hAnsi="CMU Serif Roman" w:cs="CMU Serif Roman"/>
+        </w:rPr>
+      </w:pPr>
+      <w:bookmarkStart w:id="197" w:name="ref-klein2006"/>
+      <w:bookmarkEnd w:id="183"/>
       <w:r>
         <w:rPr>
           <w:rFonts w:ascii="CMU Serif Roman" w:hAnsi="CMU Serif Roman" w:cs="CMU Serif Roman"/>
@@ -2315,8 +3307,8 @@
           <w:rFonts w:ascii="CMU Serif Roman" w:hAnsi="CMU Serif Roman" w:cs="CMU Serif Roman"/>
         </w:rPr>
       </w:pPr>
-      <w:bookmarkStart w:id="94" w:name="ref-koch2011"/>
-      <w:bookmarkEnd w:id="93"/>
+      <w:bookmarkStart w:id="198" w:name="ref-koch2011"/>
+      <w:bookmarkEnd w:id="197"/>
       <w:r>
         <w:rPr>
           <w:rFonts w:ascii="CMU Serif Roman" w:hAnsi="CMU Serif Roman" w:cs="CMU Serif Roman"/>
@@ -2361,20 +3353,13 @@
           <w:rFonts w:ascii="CMU Serif Roman" w:hAnsi="CMU Serif Roman" w:cs="CMU Serif Roman"/>
         </w:rPr>
       </w:pPr>
-      <w:bookmarkStart w:id="95" w:name="ref-li2023"/>
-      <w:bookmarkEnd w:id="94"/>
-      <w:r>
-        <w:rPr>
-          <w:rFonts w:ascii="CMU Serif Roman" w:hAnsi="CMU Serif Roman" w:cs="CMU Serif Roman"/>
-        </w:rPr>
-        <w:t xml:space="preserve">Li, Jilian, Logan Sauers, Daohua Zhuang, Haiqing Ren, Jun Guo, Liuhao Wang, Mingsheng Zhuang, et al. 2023. “Divergence and Convergence of Gut Microbiomes of Wild </w:t>
-      </w:r>
-      <w:r>
-        <w:rPr>
-          <w:rFonts w:ascii="CMU Serif Roman" w:hAnsi="CMU Serif Roman" w:cs="CMU Serif Roman"/>
-        </w:rPr>
-        <w:lastRenderedPageBreak/>
-        <w:t xml:space="preserve">Insect Pollinators.” Edited by Margaret J. McFall-Ngai and William Ludington. </w:t>
+      <w:bookmarkStart w:id="199" w:name="ref-li2023"/>
+      <w:bookmarkEnd w:id="198"/>
+      <w:r>
+        <w:rPr>
+          <w:rFonts w:ascii="CMU Serif Roman" w:hAnsi="CMU Serif Roman" w:cs="CMU Serif Roman"/>
+        </w:rPr>
+        <w:t xml:space="preserve">Li, Jilian, Logan Sauers, Daohua Zhuang, Haiqing Ren, Jun Guo, Liuhao Wang, Mingsheng Zhuang, et al. 2023. “Divergence and Convergence of Gut Microbiomes of Wild Insect Pollinators.” Edited by Margaret J. McFall-Ngai and William Ludington. </w:t>
       </w:r>
       <w:r>
         <w:rPr>
@@ -2414,8 +3399,8 @@
           <w:rFonts w:ascii="CMU Serif Roman" w:hAnsi="CMU Serif Roman" w:cs="CMU Serif Roman"/>
         </w:rPr>
       </w:pPr>
-      <w:bookmarkStart w:id="96" w:name="ref-ludvigsen2015"/>
-      <w:bookmarkEnd w:id="95"/>
+      <w:bookmarkStart w:id="200" w:name="ref-ludvigsen2015"/>
+      <w:bookmarkEnd w:id="199"/>
       <w:r>
         <w:rPr>
           <w:rFonts w:ascii="CMU Serif Roman" w:hAnsi="CMU Serif Roman" w:cs="CMU Serif Roman"/>
@@ -2460,8 +3445,8 @@
           <w:rFonts w:ascii="CMU Serif Roman" w:hAnsi="CMU Serif Roman" w:cs="CMU Serif Roman"/>
         </w:rPr>
       </w:pPr>
-      <w:bookmarkStart w:id="97" w:name="ref-maes2016"/>
-      <w:bookmarkEnd w:id="96"/>
+      <w:bookmarkStart w:id="201" w:name="ref-maes2016"/>
+      <w:bookmarkEnd w:id="200"/>
       <w:r>
         <w:rPr>
           <w:rFonts w:ascii="CMU Serif Roman" w:hAnsi="CMU Serif Roman" w:cs="CMU Serif Roman"/>
@@ -2520,8 +3505,8 @@
           <w:rFonts w:ascii="CMU Serif Roman" w:hAnsi="CMU Serif Roman" w:cs="CMU Serif Roman"/>
         </w:rPr>
       </w:pPr>
-      <w:bookmarkStart w:id="98" w:name="ref-manley2015"/>
-      <w:bookmarkEnd w:id="97"/>
+      <w:bookmarkStart w:id="202" w:name="ref-manley2015"/>
+      <w:bookmarkEnd w:id="201"/>
       <w:r>
         <w:rPr>
           <w:rFonts w:ascii="CMU Serif Roman" w:hAnsi="CMU Serif Roman" w:cs="CMU Serif Roman"/>
@@ -2566,8 +3551,8 @@
           <w:rFonts w:ascii="CMU Serif Roman" w:hAnsi="CMU Serif Roman" w:cs="CMU Serif Roman"/>
         </w:rPr>
       </w:pPr>
-      <w:bookmarkStart w:id="99" w:name="ref-martinson2010"/>
-      <w:bookmarkEnd w:id="98"/>
+      <w:bookmarkStart w:id="203" w:name="ref-martinson2010"/>
+      <w:bookmarkEnd w:id="202"/>
       <w:r>
         <w:rPr>
           <w:rFonts w:ascii="CMU Serif Roman" w:hAnsi="CMU Serif Roman" w:cs="CMU Serif Roman"/>
@@ -2612,8 +3597,8 @@
           <w:rFonts w:ascii="CMU Serif Roman" w:hAnsi="CMU Serif Roman" w:cs="CMU Serif Roman"/>
         </w:rPr>
       </w:pPr>
-      <w:bookmarkStart w:id="100" w:name="ref-miller-struttmann2015"/>
-      <w:bookmarkEnd w:id="99"/>
+      <w:bookmarkStart w:id="204" w:name="ref-miller-struttmann2015"/>
+      <w:bookmarkEnd w:id="203"/>
       <w:r>
         <w:rPr>
           <w:rFonts w:ascii="CMU Serif Roman" w:hAnsi="CMU Serif Roman" w:cs="CMU Serif Roman"/>
@@ -2658,12 +3643,13 @@
           <w:rFonts w:ascii="CMU Serif Roman" w:hAnsi="CMU Serif Roman" w:cs="CMU Serif Roman"/>
         </w:rPr>
       </w:pPr>
-      <w:bookmarkStart w:id="101" w:name="ref-murphy2022"/>
-      <w:bookmarkEnd w:id="100"/>
-      <w:r>
-        <w:rPr>
-          <w:rFonts w:ascii="CMU Serif Roman" w:hAnsi="CMU Serif Roman" w:cs="CMU Serif Roman"/>
-        </w:rPr>
+      <w:bookmarkStart w:id="205" w:name="ref-murphy2022"/>
+      <w:bookmarkEnd w:id="204"/>
+      <w:r>
+        <w:rPr>
+          <w:rFonts w:ascii="CMU Serif Roman" w:hAnsi="CMU Serif Roman" w:cs="CMU Serif Roman"/>
+        </w:rPr>
+        <w:lastRenderedPageBreak/>
         <w:t xml:space="preserve">Murphy, James T., Tom D. Breeze, Bryony Willcox, Saorla Kavanagh, and Jane C. Stout. 2022. “Globalisation and Pollinators: Pollinator Declines Are an Economic Threat to Global Food Systems.” </w:t>
       </w:r>
       <w:r>
@@ -2701,11 +3687,12 @@
         <w:pStyle w:val="Bibliography"/>
         <w:jc w:val="both"/>
         <w:rPr>
-          <w:rFonts w:ascii="CMU Serif Roman" w:hAnsi="CMU Serif Roman" w:cs="CMU Serif Roman"/>
-        </w:rPr>
-      </w:pPr>
-      <w:bookmarkStart w:id="102" w:name="ref-neu2021"/>
-      <w:bookmarkEnd w:id="101"/>
+          <w:ins w:id="206" w:author="Ainhoa Magrach" w:date="2025-05-08T15:08:00Z" w16du:dateUtc="2025-05-08T13:08:00Z"/>
+          <w:rFonts w:ascii="CMU Serif Roman" w:hAnsi="CMU Serif Roman" w:cs="CMU Serif Roman"/>
+        </w:rPr>
+      </w:pPr>
+      <w:bookmarkStart w:id="207" w:name="ref-neu2021"/>
+      <w:bookmarkEnd w:id="205"/>
       <w:r>
         <w:rPr>
           <w:rFonts w:ascii="CMU Serif Roman" w:hAnsi="CMU Serif Roman" w:cs="CMU Serif Roman"/>
@@ -2748,11 +3735,98 @@
         <w:jc w:val="both"/>
         <w:rPr>
           <w:rFonts w:ascii="CMU Serif Roman" w:hAnsi="CMU Serif Roman" w:cs="CMU Serif Roman"/>
+        </w:rPr>
+      </w:pPr>
+      <w:bookmarkStart w:id="208" w:name="ref-vegan"/>
+      <w:ins w:id="209" w:author="Ainhoa Magrach" w:date="2025-05-08T15:08:00Z" w16du:dateUtc="2025-05-08T13:08:00Z">
+        <w:r>
+          <w:rPr>
+            <w:rFonts w:ascii="CMU Serif Roman" w:hAnsi="CMU Serif Roman" w:cs="CMU Serif Roman"/>
+            <w:rPrChange w:id="210" w:author="Ainhoa Magrach" w:date="2025-05-08T15:08:00Z" w16du:dateUtc="2025-05-08T13:08:00Z">
+              <w:rPr/>
+            </w:rPrChange>
+          </w:rPr>
+          <w:t xml:space="preserve">Oksanen, Jari, Gavin L. Simpson, F. Guillaume Blanchet, Roeland Kindt, Pierre Legendre, Peter R. Minchin, R. B. O’Hara, et al. 2024. “Vegan: Community Ecology Package.” </w:t>
+        </w:r>
+        <w:r>
+          <w:rPr>
+            <w:rFonts w:ascii="CMU Serif Roman" w:hAnsi="CMU Serif Roman" w:cs="CMU Serif Roman"/>
+            <w:rPrChange w:id="211" w:author="Ainhoa Magrach" w:date="2025-05-08T15:08:00Z" w16du:dateUtc="2025-05-08T13:08:00Z">
+              <w:rPr/>
+            </w:rPrChange>
+          </w:rPr>
+          <w:fldChar w:fldCharType="begin"/>
+        </w:r>
+        <w:r>
+          <w:rPr>
+            <w:rFonts w:ascii="CMU Serif Roman" w:hAnsi="CMU Serif Roman" w:cs="CMU Serif Roman"/>
+            <w:rPrChange w:id="212" w:author="Ainhoa Magrach" w:date="2025-05-08T15:08:00Z" w16du:dateUtc="2025-05-08T13:08:00Z">
+              <w:rPr/>
+            </w:rPrChange>
+          </w:rPr>
+          <w:instrText>HYPERLINK "https://CRAN.R-project.org/package=vegan" \h</w:instrText>
+        </w:r>
+        <w:r>
+          <w:rPr>
+            <w:rFonts w:ascii="CMU Serif Roman" w:hAnsi="CMU Serif Roman" w:cs="CMU Serif Roman"/>
+            <w:rPrChange w:id="213" w:author="Ainhoa Magrach" w:date="2025-05-08T15:08:00Z" w16du:dateUtc="2025-05-08T13:08:00Z">
+              <w:rPr/>
+            </w:rPrChange>
+          </w:rPr>
+        </w:r>
+        <w:r>
+          <w:rPr>
+            <w:rFonts w:ascii="CMU Serif Roman" w:hAnsi="CMU Serif Roman" w:cs="CMU Serif Roman"/>
+            <w:rPrChange w:id="214" w:author="Ainhoa Magrach" w:date="2025-05-08T15:08:00Z" w16du:dateUtc="2025-05-08T13:08:00Z">
+              <w:rPr/>
+            </w:rPrChange>
+          </w:rPr>
+          <w:fldChar w:fldCharType="separate"/>
+        </w:r>
+        <w:r>
+          <w:rPr>
+            <w:rStyle w:val="Hyperlink"/>
+            <w:rFonts w:ascii="CMU Serif Roman" w:hAnsi="CMU Serif Roman" w:cs="CMU Serif Roman"/>
+            <w:rPrChange w:id="215" w:author="Ainhoa Magrach" w:date="2025-05-08T15:08:00Z" w16du:dateUtc="2025-05-08T13:08:00Z">
+              <w:rPr>
+                <w:rStyle w:val="Hyperlink"/>
+              </w:rPr>
+            </w:rPrChange>
+          </w:rPr>
+          <w:t>https://CRAN.R-project.org/package=vegan</w:t>
+        </w:r>
+        <w:r>
+          <w:rPr>
+            <w:rFonts w:ascii="CMU Serif Roman" w:hAnsi="CMU Serif Roman" w:cs="CMU Serif Roman"/>
+            <w:rPrChange w:id="216" w:author="Ainhoa Magrach" w:date="2025-05-08T15:08:00Z" w16du:dateUtc="2025-05-08T13:08:00Z">
+              <w:rPr/>
+            </w:rPrChange>
+          </w:rPr>
+          <w:fldChar w:fldCharType="end"/>
+        </w:r>
+        <w:r>
+          <w:rPr>
+            <w:rFonts w:ascii="CMU Serif Roman" w:hAnsi="CMU Serif Roman" w:cs="CMU Serif Roman"/>
+            <w:rPrChange w:id="217" w:author="Ainhoa Magrach" w:date="2025-05-08T15:08:00Z" w16du:dateUtc="2025-05-08T13:08:00Z">
+              <w:rPr/>
+            </w:rPrChange>
+          </w:rPr>
+          <w:t>.</w:t>
+        </w:r>
+      </w:ins>
+      <w:bookmarkEnd w:id="208"/>
+    </w:p>
+    <w:p>
+      <w:pPr>
+        <w:pStyle w:val="Bibliography"/>
+        <w:jc w:val="both"/>
+        <w:rPr>
+          <w:rFonts w:ascii="CMU Serif Roman" w:hAnsi="CMU Serif Roman" w:cs="CMU Serif Roman"/>
           <w:lang w:val="es-ES"/>
         </w:rPr>
       </w:pPr>
-      <w:bookmarkStart w:id="103" w:name="ref-ollerton2011"/>
-      <w:bookmarkEnd w:id="102"/>
+      <w:bookmarkStart w:id="218" w:name="ref-ollerton2011"/>
+      <w:bookmarkEnd w:id="207"/>
       <w:r>
         <w:rPr>
           <w:rFonts w:ascii="CMU Serif Roman" w:hAnsi="CMU Serif Roman" w:cs="CMU Serif Roman"/>
@@ -2781,7 +3855,7 @@
       <w:r>
         <w:rPr>
           <w:lang w:val="es-ES"/>
-          <w:rPrChange w:id="104" w:author="Ainhoa Magrach" w:date="2025-05-07T13:39:00Z" w16du:dateUtc="2025-05-07T11:39:00Z">
+          <w:rPrChange w:id="219" w:author="Ainhoa Magrach" w:date="2025-05-07T13:39:00Z" w16du:dateUtc="2025-05-07T11:39:00Z">
             <w:rPr/>
           </w:rPrChange>
         </w:rPr>
@@ -2817,8 +3891,8 @@
           <w:rFonts w:ascii="CMU Serif Roman" w:hAnsi="CMU Serif Roman" w:cs="CMU Serif Roman"/>
         </w:rPr>
       </w:pPr>
-      <w:bookmarkStart w:id="105" w:name="ref-Pizarro2021"/>
-      <w:bookmarkEnd w:id="103"/>
+      <w:bookmarkStart w:id="220" w:name="ref-Pizarro2021"/>
+      <w:bookmarkEnd w:id="218"/>
       <w:r>
         <w:rPr>
           <w:rFonts w:ascii="CMU Serif Roman" w:hAnsi="CMU Serif Roman" w:cs="CMU Serif Roman"/>
@@ -2872,13 +3946,12 @@
           <w:rFonts w:ascii="CMU Serif Roman" w:hAnsi="CMU Serif Roman" w:cs="CMU Serif Roman"/>
         </w:rPr>
       </w:pPr>
-      <w:bookmarkStart w:id="106" w:name="ref-risely2020"/>
-      <w:bookmarkEnd w:id="105"/>
-      <w:r>
-        <w:rPr>
-          <w:rFonts w:ascii="CMU Serif Roman" w:hAnsi="CMU Serif Roman" w:cs="CMU Serif Roman"/>
-        </w:rPr>
-        <w:lastRenderedPageBreak/>
+      <w:bookmarkStart w:id="221" w:name="ref-risely2020"/>
+      <w:bookmarkEnd w:id="220"/>
+      <w:r>
+        <w:rPr>
+          <w:rFonts w:ascii="CMU Serif Roman" w:hAnsi="CMU Serif Roman" w:cs="CMU Serif Roman"/>
+        </w:rPr>
         <w:t xml:space="preserve">Risely, Alice. 2020. “Applying the Core Microbiome to Understand Hostmicrobe Systems.” Edited by Ann Tate. </w:t>
       </w:r>
       <w:r>
@@ -2919,8 +3992,8 @@
           <w:rFonts w:ascii="CMU Serif Roman" w:hAnsi="CMU Serif Roman" w:cs="CMU Serif Roman"/>
         </w:rPr>
       </w:pPr>
-      <w:bookmarkStart w:id="107" w:name="ref-shah2024"/>
-      <w:bookmarkEnd w:id="106"/>
+      <w:bookmarkStart w:id="222" w:name="ref-shah2024"/>
+      <w:bookmarkEnd w:id="221"/>
       <w:r>
         <w:rPr>
           <w:rFonts w:ascii="CMU Serif Roman" w:hAnsi="CMU Serif Roman" w:cs="CMU Serif Roman"/>
@@ -2965,8 +4038,8 @@
           <w:rFonts w:ascii="CMU Serif Roman" w:hAnsi="CMU Serif Roman" w:cs="CMU Serif Roman"/>
         </w:rPr>
       </w:pPr>
-      <w:bookmarkStart w:id="108" w:name="ref-steele2021"/>
-      <w:bookmarkEnd w:id="107"/>
+      <w:bookmarkStart w:id="223" w:name="ref-steele2021"/>
+      <w:bookmarkEnd w:id="222"/>
       <w:r>
         <w:rPr>
           <w:rFonts w:ascii="CMU Serif Roman" w:hAnsi="CMU Serif Roman" w:cs="CMU Serif Roman"/>
@@ -3012,8 +4085,8 @@
           <w:lang w:val="es-ES"/>
         </w:rPr>
       </w:pPr>
-      <w:bookmarkStart w:id="109" w:name="ref-stemet2024"/>
-      <w:bookmarkEnd w:id="108"/>
+      <w:bookmarkStart w:id="224" w:name="ref-stemet2024"/>
+      <w:bookmarkEnd w:id="223"/>
       <w:r>
         <w:rPr>
           <w:rFonts w:ascii="CMU Serif Roman" w:hAnsi="CMU Serif Roman" w:cs="CMU Serif Roman"/>
@@ -3043,12 +4116,12 @@
         <w:pStyle w:val="Bibliography"/>
         <w:jc w:val="both"/>
         <w:rPr>
-          <w:ins w:id="110" w:author="Ainhoa Magrach" w:date="2025-05-07T13:42:00Z" w16du:dateUtc="2025-05-07T11:42:00Z"/>
-          <w:rFonts w:ascii="CMU Serif Roman" w:hAnsi="CMU Serif Roman" w:cs="CMU Serif Roman"/>
-        </w:rPr>
-      </w:pPr>
-      <w:bookmarkStart w:id="111" w:name="ref-vanbergen2017"/>
-      <w:bookmarkEnd w:id="109"/>
+          <w:ins w:id="225" w:author="Ainhoa Magrach" w:date="2025-05-07T13:42:00Z" w16du:dateUtc="2025-05-07T11:42:00Z"/>
+          <w:rFonts w:ascii="CMU Serif Roman" w:hAnsi="CMU Serif Roman" w:cs="CMU Serif Roman"/>
+        </w:rPr>
+      </w:pPr>
+      <w:bookmarkStart w:id="226" w:name="ref-vanbergen2017"/>
+      <w:bookmarkEnd w:id="224"/>
       <w:proofErr w:type="spellStart"/>
       <w:r>
         <w:rPr>
@@ -3122,35 +4195,36 @@
         <w:pStyle w:val="Bibliography"/>
         <w:jc w:val="both"/>
         <w:rPr>
-          <w:del w:id="112" w:author="Ainhoa Magrach" w:date="2025-05-07T13:42:00Z" w16du:dateUtc="2025-05-07T11:42:00Z"/>
-          <w:rFonts w:ascii="CMU Serif Roman" w:hAnsi="CMU Serif Roman" w:cs="CMU Serif Roman"/>
-          <w:rPrChange w:id="113" w:author="Ainhoa Magrach" w:date="2025-05-07T13:42:00Z" w16du:dateUtc="2025-05-07T11:42:00Z">
+          <w:del w:id="227" w:author="Ainhoa Magrach" w:date="2025-05-07T13:42:00Z" w16du:dateUtc="2025-05-07T11:42:00Z"/>
+          <w:rFonts w:ascii="CMU Serif Roman" w:hAnsi="CMU Serif Roman" w:cs="CMU Serif Roman"/>
+          <w:rPrChange w:id="228" w:author="Ainhoa Magrach" w:date="2025-05-07T13:42:00Z" w16du:dateUtc="2025-05-07T11:42:00Z">
             <w:rPr>
-              <w:del w:id="114" w:author="Ainhoa Magrach" w:date="2025-05-07T13:42:00Z" w16du:dateUtc="2025-05-07T11:42:00Z"/>
+              <w:del w:id="229" w:author="Ainhoa Magrach" w:date="2025-05-07T13:42:00Z" w16du:dateUtc="2025-05-07T11:42:00Z"/>
             </w:rPr>
           </w:rPrChange>
         </w:rPr>
-        <w:pPrChange w:id="115" w:author="Ainhoa Magrach" w:date="2025-05-07T13:42:00Z" w16du:dateUtc="2025-05-07T11:42:00Z">
+        <w:pPrChange w:id="230" w:author="Ainhoa Magrach" w:date="2025-05-07T13:42:00Z" w16du:dateUtc="2025-05-07T11:42:00Z">
           <w:pPr>
             <w:pStyle w:val="Bibliography"/>
           </w:pPr>
         </w:pPrChange>
       </w:pPr>
-      <w:bookmarkStart w:id="116" w:name="ref-wagner2021"/>
-      <w:r>
-        <w:rPr>
-          <w:rFonts w:ascii="CMU Serif Roman" w:hAnsi="CMU Serif Roman" w:cs="CMU Serif Roman"/>
-          <w:rPrChange w:id="117" w:author="Ainhoa Magrach" w:date="2025-05-07T13:42:00Z" w16du:dateUtc="2025-05-07T11:42:00Z">
+      <w:bookmarkStart w:id="231" w:name="ref-wagner2021"/>
+      <w:r>
+        <w:rPr>
+          <w:rFonts w:ascii="CMU Serif Roman" w:hAnsi="CMU Serif Roman" w:cs="CMU Serif Roman"/>
+          <w:rPrChange w:id="232" w:author="Ainhoa Magrach" w:date="2025-05-07T13:42:00Z" w16du:dateUtc="2025-05-07T11:42:00Z">
             <w:rPr/>
           </w:rPrChange>
         </w:rPr>
+        <w:lastRenderedPageBreak/>
         <w:t xml:space="preserve">Wagner, David L., Eliza M. </w:t>
       </w:r>
       <w:proofErr w:type="spellStart"/>
       <w:r>
         <w:rPr>
           <w:rFonts w:ascii="CMU Serif Roman" w:hAnsi="CMU Serif Roman" w:cs="CMU Serif Roman"/>
-          <w:rPrChange w:id="118" w:author="Ainhoa Magrach" w:date="2025-05-07T13:42:00Z" w16du:dateUtc="2025-05-07T11:42:00Z">
+          <w:rPrChange w:id="233" w:author="Ainhoa Magrach" w:date="2025-05-07T13:42:00Z" w16du:dateUtc="2025-05-07T11:42:00Z">
             <w:rPr/>
           </w:rPrChange>
         </w:rPr>
@@ -3160,7 +4234,7 @@
       <w:r>
         <w:rPr>
           <w:rFonts w:ascii="CMU Serif Roman" w:hAnsi="CMU Serif Roman" w:cs="CMU Serif Roman"/>
-          <w:rPrChange w:id="119" w:author="Ainhoa Magrach" w:date="2025-05-07T13:42:00Z" w16du:dateUtc="2025-05-07T11:42:00Z">
+          <w:rPrChange w:id="234" w:author="Ainhoa Magrach" w:date="2025-05-07T13:42:00Z" w16du:dateUtc="2025-05-07T11:42:00Z">
             <w:rPr/>
           </w:rPrChange>
         </w:rPr>
@@ -3170,7 +4244,7 @@
       <w:r>
         <w:rPr>
           <w:rFonts w:ascii="CMU Serif Roman" w:hAnsi="CMU Serif Roman" w:cs="CMU Serif Roman"/>
-          <w:rPrChange w:id="120" w:author="Ainhoa Magrach" w:date="2025-05-07T13:42:00Z" w16du:dateUtc="2025-05-07T11:42:00Z">
+          <w:rPrChange w:id="235" w:author="Ainhoa Magrach" w:date="2025-05-07T13:42:00Z" w16du:dateUtc="2025-05-07T11:42:00Z">
             <w:rPr/>
           </w:rPrChange>
         </w:rPr>
@@ -3180,7 +4254,7 @@
       <w:r>
         <w:rPr>
           <w:rFonts w:ascii="CMU Serif Roman" w:hAnsi="CMU Serif Roman" w:cs="CMU Serif Roman"/>
-          <w:rPrChange w:id="121" w:author="Ainhoa Magrach" w:date="2025-05-07T13:42:00Z" w16du:dateUtc="2025-05-07T11:42:00Z">
+          <w:rPrChange w:id="236" w:author="Ainhoa Magrach" w:date="2025-05-07T13:42:00Z" w16du:dateUtc="2025-05-07T11:42:00Z">
             <w:rPr/>
           </w:rPrChange>
         </w:rPr>
@@ -3190,7 +4264,7 @@
       <w:r>
         <w:rPr>
           <w:rFonts w:ascii="CMU Serif Roman" w:hAnsi="CMU Serif Roman" w:cs="CMU Serif Roman"/>
-          <w:rPrChange w:id="122" w:author="Ainhoa Magrach" w:date="2025-05-07T13:42:00Z" w16du:dateUtc="2025-05-07T11:42:00Z">
+          <w:rPrChange w:id="237" w:author="Ainhoa Magrach" w:date="2025-05-07T13:42:00Z" w16du:dateUtc="2025-05-07T11:42:00Z">
             <w:rPr/>
           </w:rPrChange>
         </w:rPr>
@@ -3200,7 +4274,7 @@
       <w:r>
         <w:rPr>
           <w:rFonts w:ascii="CMU Serif Roman" w:hAnsi="CMU Serif Roman" w:cs="CMU Serif Roman"/>
-          <w:rPrChange w:id="123" w:author="Ainhoa Magrach" w:date="2025-05-07T13:42:00Z" w16du:dateUtc="2025-05-07T11:42:00Z">
+          <w:rPrChange w:id="238" w:author="Ainhoa Magrach" w:date="2025-05-07T13:42:00Z" w16du:dateUtc="2025-05-07T11:42:00Z">
             <w:rPr/>
           </w:rPrChange>
         </w:rPr>
@@ -3211,7 +4285,7 @@
           <w:rFonts w:ascii="CMU Serif Roman" w:hAnsi="CMU Serif Roman" w:cs="CMU Serif Roman"/>
           <w:i/>
           <w:iCs/>
-          <w:rPrChange w:id="124" w:author="Ainhoa Magrach" w:date="2025-05-07T13:42:00Z" w16du:dateUtc="2025-05-07T11:42:00Z">
+          <w:rPrChange w:id="239" w:author="Ainhoa Magrach" w:date="2025-05-07T13:42:00Z" w16du:dateUtc="2025-05-07T11:42:00Z">
             <w:rPr>
               <w:i/>
               <w:iCs/>
@@ -3223,7 +4297,7 @@
       <w:r>
         <w:rPr>
           <w:rFonts w:ascii="CMU Serif Roman" w:hAnsi="CMU Serif Roman" w:cs="CMU Serif Roman"/>
-          <w:rPrChange w:id="125" w:author="Ainhoa Magrach" w:date="2025-05-07T13:42:00Z" w16du:dateUtc="2025-05-07T11:42:00Z">
+          <w:rPrChange w:id="240" w:author="Ainhoa Magrach" w:date="2025-05-07T13:42:00Z" w16du:dateUtc="2025-05-07T11:42:00Z">
             <w:rPr/>
           </w:rPrChange>
         </w:rPr>
@@ -3232,7 +4306,7 @@
       <w:r>
         <w:rPr>
           <w:rFonts w:ascii="CMU Serif Roman" w:hAnsi="CMU Serif Roman" w:cs="CMU Serif Roman"/>
-          <w:rPrChange w:id="126" w:author="Ainhoa Magrach" w:date="2025-05-07T13:42:00Z" w16du:dateUtc="2025-05-07T11:42:00Z">
+          <w:rPrChange w:id="241" w:author="Ainhoa Magrach" w:date="2025-05-07T13:42:00Z" w16du:dateUtc="2025-05-07T11:42:00Z">
             <w:rPr/>
           </w:rPrChange>
         </w:rPr>
@@ -3241,7 +4315,7 @@
       <w:r>
         <w:rPr>
           <w:rFonts w:ascii="CMU Serif Roman" w:hAnsi="CMU Serif Roman" w:cs="CMU Serif Roman"/>
-          <w:rPrChange w:id="127" w:author="Ainhoa Magrach" w:date="2025-05-07T13:42:00Z" w16du:dateUtc="2025-05-07T11:42:00Z">
+          <w:rPrChange w:id="242" w:author="Ainhoa Magrach" w:date="2025-05-07T13:42:00Z" w16du:dateUtc="2025-05-07T11:42:00Z">
             <w:rPr/>
           </w:rPrChange>
         </w:rPr>
@@ -3250,7 +4324,7 @@
       <w:r>
         <w:rPr>
           <w:rFonts w:ascii="CMU Serif Roman" w:hAnsi="CMU Serif Roman" w:cs="CMU Serif Roman"/>
-          <w:rPrChange w:id="128" w:author="Ainhoa Magrach" w:date="2025-05-07T13:42:00Z" w16du:dateUtc="2025-05-07T11:42:00Z">
+          <w:rPrChange w:id="243" w:author="Ainhoa Magrach" w:date="2025-05-07T13:42:00Z" w16du:dateUtc="2025-05-07T11:42:00Z">
             <w:rPr/>
           </w:rPrChange>
         </w:rPr>
@@ -3258,7 +4332,7 @@
       <w:r>
         <w:rPr>
           <w:rFonts w:ascii="CMU Serif Roman" w:hAnsi="CMU Serif Roman" w:cs="CMU Serif Roman"/>
-          <w:rPrChange w:id="129" w:author="Ainhoa Magrach" w:date="2025-05-07T13:42:00Z" w16du:dateUtc="2025-05-07T11:42:00Z">
+          <w:rPrChange w:id="244" w:author="Ainhoa Magrach" w:date="2025-05-07T13:42:00Z" w16du:dateUtc="2025-05-07T11:42:00Z">
             <w:rPr/>
           </w:rPrChange>
         </w:rPr>
@@ -3268,7 +4342,7 @@
         <w:rPr>
           <w:rStyle w:val="Hyperlink"/>
           <w:rFonts w:ascii="CMU Serif Roman" w:hAnsi="CMU Serif Roman" w:cs="CMU Serif Roman"/>
-          <w:rPrChange w:id="130" w:author="Ainhoa Magrach" w:date="2025-05-07T13:42:00Z" w16du:dateUtc="2025-05-07T11:42:00Z">
+          <w:rPrChange w:id="245" w:author="Ainhoa Magrach" w:date="2025-05-07T13:42:00Z" w16du:dateUtc="2025-05-07T11:42:00Z">
             <w:rPr>
               <w:rStyle w:val="Hyperlink"/>
             </w:rPr>
@@ -3280,7 +4354,7 @@
         <w:rPr>
           <w:rStyle w:val="Hyperlink"/>
           <w:rFonts w:ascii="CMU Serif Roman" w:hAnsi="CMU Serif Roman" w:cs="CMU Serif Roman"/>
-          <w:rPrChange w:id="131" w:author="Ainhoa Magrach" w:date="2025-05-07T13:42:00Z" w16du:dateUtc="2025-05-07T11:42:00Z">
+          <w:rPrChange w:id="246" w:author="Ainhoa Magrach" w:date="2025-05-07T13:42:00Z" w16du:dateUtc="2025-05-07T11:42:00Z">
             <w:rPr>
               <w:rStyle w:val="Hyperlink"/>
             </w:rPr>
@@ -3292,7 +4366,7 @@
         <w:rPr>
           <w:rStyle w:val="Hyperlink"/>
           <w:rFonts w:ascii="CMU Serif Roman" w:hAnsi="CMU Serif Roman" w:cs="CMU Serif Roman"/>
-          <w:rPrChange w:id="132" w:author="Ainhoa Magrach" w:date="2025-05-07T13:42:00Z" w16du:dateUtc="2025-05-07T11:42:00Z">
+          <w:rPrChange w:id="247" w:author="Ainhoa Magrach" w:date="2025-05-07T13:42:00Z" w16du:dateUtc="2025-05-07T11:42:00Z">
             <w:rPr>
               <w:rStyle w:val="Hyperlink"/>
             </w:rPr>
@@ -3303,7 +4377,7 @@
       <w:r>
         <w:rPr>
           <w:rFonts w:ascii="CMU Serif Roman" w:hAnsi="CMU Serif Roman" w:cs="CMU Serif Roman"/>
-          <w:rPrChange w:id="133" w:author="Ainhoa Magrach" w:date="2025-05-07T13:42:00Z" w16du:dateUtc="2025-05-07T11:42:00Z">
+          <w:rPrChange w:id="248" w:author="Ainhoa Magrach" w:date="2025-05-07T13:42:00Z" w16du:dateUtc="2025-05-07T11:42:00Z">
             <w:rPr/>
           </w:rPrChange>
         </w:rPr>
@@ -3312,14 +4386,14 @@
       <w:r>
         <w:rPr>
           <w:rFonts w:ascii="CMU Serif Roman" w:hAnsi="CMU Serif Roman" w:cs="CMU Serif Roman"/>
-          <w:rPrChange w:id="134" w:author="Ainhoa Magrach" w:date="2025-05-07T13:42:00Z" w16du:dateUtc="2025-05-07T11:42:00Z">
+          <w:rPrChange w:id="249" w:author="Ainhoa Magrach" w:date="2025-05-07T13:42:00Z" w16du:dateUtc="2025-05-07T11:42:00Z">
             <w:rPr/>
           </w:rPrChange>
         </w:rPr>
         <w:t>.</w:t>
       </w:r>
     </w:p>
-    <w:bookmarkEnd w:id="116"/>
+    <w:bookmarkEnd w:id="231"/>
     <w:p>
       <w:pPr>
         <w:pStyle w:val="Bibliography"/>
@@ -3337,8 +4411,8 @@
           <w:rFonts w:ascii="CMU Serif Roman" w:hAnsi="CMU Serif Roman" w:cs="CMU Serif Roman"/>
         </w:rPr>
       </w:pPr>
-      <w:bookmarkStart w:id="135" w:name="ref-weinhold2024"/>
-      <w:bookmarkEnd w:id="111"/>
+      <w:bookmarkStart w:id="250" w:name="ref-weinhold2024"/>
+      <w:bookmarkEnd w:id="226"/>
       <w:r>
         <w:rPr>
           <w:rFonts w:ascii="CMU Serif Roman" w:hAnsi="CMU Serif Roman" w:cs="CMU Serif Roman"/>
@@ -3383,8 +4457,8 @@
           <w:rFonts w:ascii="CMU Serif Roman" w:hAnsi="CMU Serif Roman" w:cs="CMU Serif Roman"/>
         </w:rPr>
       </w:pPr>
-      <w:bookmarkStart w:id="136" w:name="ref-winfree2009"/>
-      <w:bookmarkEnd w:id="135"/>
+      <w:bookmarkStart w:id="251" w:name="ref-winfree2009"/>
+      <w:bookmarkEnd w:id="250"/>
       <w:proofErr w:type="spellStart"/>
       <w:r>
         <w:rPr>
@@ -3493,8 +4567,8 @@
           <w:rFonts w:ascii="CMU Serif Roman" w:hAnsi="CMU Serif Roman" w:cs="CMU Serif Roman"/>
         </w:rPr>
       </w:pPr>
-      <w:bookmarkStart w:id="137" w:name="ref-zheng2019"/>
-      <w:bookmarkEnd w:id="136"/>
+      <w:bookmarkStart w:id="252" w:name="ref-zheng2019"/>
+      <w:bookmarkEnd w:id="251"/>
       <w:r>
         <w:rPr>
           <w:rFonts w:ascii="CMU Serif Roman" w:hAnsi="CMU Serif Roman" w:cs="CMU Serif Roman"/>
@@ -3539,20 +4613,13 @@
           <w:rFonts w:ascii="CMU Serif Roman" w:hAnsi="CMU Serif Roman" w:cs="CMU Serif Roman"/>
         </w:rPr>
       </w:pPr>
-      <w:bookmarkStart w:id="138" w:name="ref-zheng2017"/>
-      <w:bookmarkEnd w:id="137"/>
-      <w:r>
-        <w:rPr>
-          <w:rFonts w:ascii="CMU Serif Roman" w:hAnsi="CMU Serif Roman" w:cs="CMU Serif Roman"/>
-        </w:rPr>
-        <w:t xml:space="preserve">Zheng, Hao, J. Elijah Powell, Margaret I. Steele, Carsten Dietrich, and Nancy A. Moran. 2017. “Honeybee Gut Microbiota Promotes Host Weight Gain via Bacterial Metabolism </w:t>
-      </w:r>
-      <w:r>
-        <w:rPr>
-          <w:rFonts w:ascii="CMU Serif Roman" w:hAnsi="CMU Serif Roman" w:cs="CMU Serif Roman"/>
-        </w:rPr>
-        <w:lastRenderedPageBreak/>
-        <w:t xml:space="preserve">and Hormonal Signaling.” </w:t>
+      <w:bookmarkStart w:id="253" w:name="ref-zheng2017"/>
+      <w:bookmarkEnd w:id="252"/>
+      <w:r>
+        <w:rPr>
+          <w:rFonts w:ascii="CMU Serif Roman" w:hAnsi="CMU Serif Roman" w:cs="CMU Serif Roman"/>
+        </w:rPr>
+        <w:t xml:space="preserve">Zheng, Hao, J. Elijah Powell, Margaret I. Steele, Carsten Dietrich, and Nancy A. Moran. 2017. “Honeybee Gut Microbiota Promotes Host Weight Gain via Bacterial Metabolism and Hormonal Signaling.” </w:t>
       </w:r>
       <w:r>
         <w:rPr>
@@ -3583,9 +4650,9 @@
         </w:rPr>
         <w:t>.</w:t>
       </w:r>
-      <w:bookmarkEnd w:id="81"/>
-      <w:bookmarkEnd w:id="84"/>
-      <w:bookmarkEnd w:id="138"/>
+      <w:bookmarkEnd w:id="169"/>
+      <w:bookmarkEnd w:id="174"/>
+      <w:bookmarkEnd w:id="253"/>
     </w:p>
     <w:sectPr>
       <w:pgSz w:w="12240" w:h="15840"/>
@@ -3707,6 +4774,7 @@
     </w:pPrDefault>
   </w:docDefaults>
   <w:latentStyles w:defLockedState="0" w:defUIPriority="0" w:defSemiHidden="0" w:defUnhideWhenUsed="0" w:defQFormat="0" w:count="376">
+    <w:lsdException w:name="Strong" w:uiPriority="22" w:qFormat="1"/>
     <w:lsdException w:name="Normal (Web)" w:uiPriority="99"/>
     <w:lsdException w:name="HTML Code" w:uiPriority="99"/>
     <w:lsdException w:name="Normal Table" w:semiHidden="1" w:unhideWhenUsed="1"/>
@@ -3955,6 +5023,13 @@
   <w:style w:type="paragraph" w:default="1" w:styleId="Normal">
     <w:name w:val="Normal"/>
     <w:qFormat/>
+    <w:rsid w:val="00960BF6"/>
+    <w:pPr>
+      <w:spacing w:after="0"/>
+    </w:pPr>
+    <w:rPr>
+      <w:rFonts w:ascii="Times New Roman" w:eastAsia="Times New Roman" w:hAnsi="Times New Roman" w:cs="Times New Roman"/>
+    </w:rPr>
   </w:style>
   <w:style w:type="paragraph" w:styleId="Heading1">
     <w:name w:val="heading 1"/>
@@ -4017,7 +5092,7 @@
       <w:outlineLvl w:val="2"/>
     </w:pPr>
     <w:rPr>
-      <w:rFonts w:eastAsiaTheme="majorEastAsia" w:cstheme="majorBidi"/>
+      <w:rFonts w:asciiTheme="minorHAnsi" w:eastAsiaTheme="majorEastAsia" w:hAnsiTheme="minorHAnsi" w:cstheme="majorBidi"/>
       <w:color w:val="0F4761" w:themeColor="accent1" w:themeShade="BF"/>
       <w:sz w:val="28"/>
       <w:szCs w:val="28"/>
@@ -4040,7 +5115,7 @@
       <w:outlineLvl w:val="3"/>
     </w:pPr>
     <w:rPr>
-      <w:rFonts w:eastAsiaTheme="majorEastAsia" w:cstheme="majorBidi"/>
+      <w:rFonts w:asciiTheme="minorHAnsi" w:eastAsiaTheme="majorEastAsia" w:hAnsiTheme="minorHAnsi" w:cstheme="majorBidi"/>
       <w:i/>
       <w:iCs/>
       <w:color w:val="0F4761" w:themeColor="accent1" w:themeShade="BF"/>
@@ -4063,7 +5138,7 @@
       <w:outlineLvl w:val="4"/>
     </w:pPr>
     <w:rPr>
-      <w:rFonts w:eastAsiaTheme="majorEastAsia" w:cstheme="majorBidi"/>
+      <w:rFonts w:asciiTheme="minorHAnsi" w:eastAsiaTheme="majorEastAsia" w:hAnsiTheme="minorHAnsi" w:cstheme="majorBidi"/>
       <w:color w:val="0F4761" w:themeColor="accent1" w:themeShade="BF"/>
     </w:rPr>
   </w:style>
@@ -4080,11 +5155,11 @@
     <w:pPr>
       <w:keepNext/>
       <w:keepLines/>
-      <w:spacing w:before="40" w:after="0"/>
+      <w:spacing w:before="40"/>
       <w:outlineLvl w:val="5"/>
     </w:pPr>
     <w:rPr>
-      <w:rFonts w:eastAsiaTheme="majorEastAsia" w:cstheme="majorBidi"/>
+      <w:rFonts w:asciiTheme="minorHAnsi" w:eastAsiaTheme="majorEastAsia" w:hAnsiTheme="minorHAnsi" w:cstheme="majorBidi"/>
       <w:i/>
       <w:iCs/>
       <w:color w:val="595959" w:themeColor="text1" w:themeTint="A6"/>
@@ -4103,11 +5178,11 @@
     <w:pPr>
       <w:keepNext/>
       <w:keepLines/>
-      <w:spacing w:before="40" w:after="0"/>
+      <w:spacing w:before="40"/>
       <w:outlineLvl w:val="6"/>
     </w:pPr>
     <w:rPr>
-      <w:rFonts w:eastAsiaTheme="majorEastAsia" w:cstheme="majorBidi"/>
+      <w:rFonts w:asciiTheme="minorHAnsi" w:eastAsiaTheme="majorEastAsia" w:hAnsiTheme="minorHAnsi" w:cstheme="majorBidi"/>
       <w:color w:val="595959" w:themeColor="text1" w:themeTint="A6"/>
     </w:rPr>
   </w:style>
@@ -4124,11 +5199,10 @@
     <w:pPr>
       <w:keepNext/>
       <w:keepLines/>
-      <w:spacing w:after="0"/>
       <w:outlineLvl w:val="7"/>
     </w:pPr>
     <w:rPr>
-      <w:rFonts w:eastAsiaTheme="majorEastAsia" w:cstheme="majorBidi"/>
+      <w:rFonts w:asciiTheme="minorHAnsi" w:eastAsiaTheme="majorEastAsia" w:hAnsiTheme="minorHAnsi" w:cstheme="majorBidi"/>
       <w:i/>
       <w:iCs/>
       <w:color w:val="272727" w:themeColor="text1" w:themeTint="D8"/>
@@ -4147,11 +5221,10 @@
     <w:pPr>
       <w:keepNext/>
       <w:keepLines/>
-      <w:spacing w:after="0"/>
       <w:outlineLvl w:val="8"/>
     </w:pPr>
     <w:rPr>
-      <w:rFonts w:eastAsiaTheme="majorEastAsia" w:cstheme="majorBidi"/>
+      <w:rFonts w:asciiTheme="minorHAnsi" w:eastAsiaTheme="majorEastAsia" w:hAnsiTheme="minorHAnsi" w:cstheme="majorBidi"/>
       <w:color w:val="272727" w:themeColor="text1" w:themeTint="D8"/>
     </w:rPr>
   </w:style>
@@ -4189,6 +5262,9 @@
     <w:pPr>
       <w:spacing w:before="180" w:after="180"/>
     </w:pPr>
+    <w:rPr>
+      <w:rFonts w:asciiTheme="minorHAnsi" w:eastAsiaTheme="minorHAnsi" w:hAnsiTheme="minorHAnsi" w:cstheme="minorBidi"/>
+    </w:rPr>
   </w:style>
   <w:style w:type="paragraph" w:customStyle="1" w:styleId="FirstParagraph">
     <w:name w:val="First Paragraph"/>
@@ -4251,9 +5327,10 @@
       <w:numPr>
         <w:ilvl w:val="1"/>
       </w:numPr>
+      <w:spacing w:after="200"/>
     </w:pPr>
     <w:rPr>
-      <w:rFonts w:eastAsiaTheme="majorEastAsia" w:cstheme="majorBidi"/>
+      <w:rFonts w:asciiTheme="minorHAnsi" w:eastAsiaTheme="majorEastAsia" w:hAnsiTheme="minorHAnsi" w:cstheme="majorBidi"/>
       <w:color w:val="595959" w:themeColor="text1" w:themeTint="A6"/>
       <w:spacing w:val="15"/>
       <w:sz w:val="28"/>
@@ -4302,10 +5379,11 @@
     <w:pPr>
       <w:keepNext/>
       <w:keepLines/>
-      <w:spacing w:before="300" w:after="0"/>
+      <w:spacing w:before="300"/>
       <w:jc w:val="center"/>
     </w:pPr>
     <w:rPr>
+      <w:rFonts w:asciiTheme="minorHAnsi" w:eastAsiaTheme="minorHAnsi" w:hAnsiTheme="minorHAnsi" w:cstheme="minorBidi"/>
       <w:b/>
       <w:color w:val="345A8A"/>
       <w:sz w:val="20"/>
@@ -4323,6 +5401,7 @@
       <w:spacing w:before="100" w:after="300"/>
     </w:pPr>
     <w:rPr>
+      <w:rFonts w:asciiTheme="minorHAnsi" w:eastAsiaTheme="minorHAnsi" w:hAnsiTheme="minorHAnsi" w:cstheme="minorBidi"/>
       <w:sz w:val="20"/>
       <w:szCs w:val="20"/>
     </w:rPr>
@@ -4331,6 +5410,12 @@
     <w:name w:val="Bibliography"/>
     <w:basedOn w:val="Normal"/>
     <w:qFormat/>
+    <w:pPr>
+      <w:spacing w:after="200"/>
+    </w:pPr>
+    <w:rPr>
+      <w:rFonts w:asciiTheme="minorHAnsi" w:eastAsiaTheme="minorHAnsi" w:hAnsiTheme="minorHAnsi" w:cstheme="minorBidi"/>
+    </w:rPr>
   </w:style>
   <w:style w:type="character" w:customStyle="1" w:styleId="Heading1Char">
     <w:name w:val="Heading 1 Char"/>
@@ -4469,6 +5554,12 @@
     <w:uiPriority w:val="9"/>
     <w:unhideWhenUsed/>
     <w:qFormat/>
+    <w:pPr>
+      <w:spacing w:after="200"/>
+    </w:pPr>
+    <w:rPr>
+      <w:rFonts w:asciiTheme="minorHAnsi" w:eastAsiaTheme="minorHAnsi" w:hAnsiTheme="minorHAnsi" w:cstheme="minorBidi"/>
+    </w:rPr>
   </w:style>
   <w:style w:type="paragraph" w:customStyle="1" w:styleId="FootnoteBlockText">
     <w:name w:val="Footnote Block Text"/>
@@ -4518,15 +5609,21 @@
     <w:pPr>
       <w:keepNext/>
       <w:keepLines/>
-      <w:spacing w:after="0"/>
     </w:pPr>
     <w:rPr>
+      <w:rFonts w:asciiTheme="minorHAnsi" w:eastAsiaTheme="minorHAnsi" w:hAnsiTheme="minorHAnsi" w:cstheme="minorBidi"/>
       <w:b/>
     </w:rPr>
   </w:style>
   <w:style w:type="paragraph" w:customStyle="1" w:styleId="Definition">
     <w:name w:val="Definition"/>
     <w:basedOn w:val="Normal"/>
+    <w:pPr>
+      <w:spacing w:after="200"/>
+    </w:pPr>
+    <w:rPr>
+      <w:rFonts w:asciiTheme="minorHAnsi" w:eastAsiaTheme="minorHAnsi" w:hAnsiTheme="minorHAnsi" w:cstheme="minorBidi"/>
+    </w:rPr>
   </w:style>
   <w:style w:type="paragraph" w:styleId="Caption">
     <w:name w:val="caption"/>
@@ -4536,6 +5633,7 @@
       <w:spacing w:after="120"/>
     </w:pPr>
     <w:rPr>
+      <w:rFonts w:asciiTheme="minorHAnsi" w:eastAsiaTheme="minorHAnsi" w:hAnsiTheme="minorHAnsi" w:cstheme="minorBidi"/>
       <w:i/>
     </w:rPr>
   </w:style>
@@ -4553,6 +5651,12 @@
   <w:style w:type="paragraph" w:customStyle="1" w:styleId="Figure">
     <w:name w:val="Figure"/>
     <w:basedOn w:val="Normal"/>
+    <w:pPr>
+      <w:spacing w:after="200"/>
+    </w:pPr>
+    <w:rPr>
+      <w:rFonts w:asciiTheme="minorHAnsi" w:eastAsiaTheme="minorHAnsi" w:hAnsiTheme="minorHAnsi" w:cstheme="minorBidi"/>
+    </w:rPr>
   </w:style>
   <w:style w:type="paragraph" w:customStyle="1" w:styleId="CaptionedFigure">
     <w:name w:val="Captioned Figure"/>
@@ -4612,7 +5716,11 @@
     <w:pPr>
       <w:shd w:val="clear" w:color="auto" w:fill="F1F3F5"/>
       <w:wordWrap w:val="0"/>
+      <w:spacing w:after="200"/>
     </w:pPr>
+    <w:rPr>
+      <w:rFonts w:asciiTheme="minorHAnsi" w:eastAsiaTheme="minorHAnsi" w:hAnsiTheme="minorHAnsi" w:cstheme="minorBidi"/>
+    </w:rPr>
   </w:style>
   <w:style w:type="character" w:customStyle="1" w:styleId="KeywordTok">
     <w:name w:val="KeywordTok"/>
@@ -4946,9 +6054,6 @@
     <w:pPr>
       <w:spacing w:before="100" w:beforeAutospacing="1" w:after="100" w:afterAutospacing="1"/>
     </w:pPr>
-    <w:rPr>
-      <w:rFonts w:ascii="Times New Roman" w:eastAsia="Times New Roman" w:hAnsi="Times New Roman" w:cs="Times New Roman"/>
-    </w:rPr>
   </w:style>
   <w:style w:type="character" w:styleId="FollowedHyperlink">
     <w:name w:val="FollowedHyperlink"/>
@@ -4974,6 +6079,17 @@
       <w:rFonts w:ascii="Courier New" w:eastAsia="Times New Roman" w:hAnsi="Courier New" w:cs="Courier New"/>
       <w:sz w:val="20"/>
       <w:szCs w:val="20"/>
+    </w:rPr>
+  </w:style>
+  <w:style w:type="character" w:styleId="Strong">
+    <w:name w:val="Strong"/>
+    <w:basedOn w:val="DefaultParagraphFont"/>
+    <w:uiPriority w:val="22"/>
+    <w:qFormat/>
+    <w:rsid w:val="00960BF6"/>
+    <w:rPr>
+      <w:b/>
+      <w:bCs/>
     </w:rPr>
   </w:style>
 </w:styles>

</xml_diff>

<commit_message>
last changes to text
</commit_message>
<xml_diff>
--- a/ms_versions/ms_microbiome_v1.docx
+++ b/ms_versions/ms_microbiome_v1.docx
@@ -1132,13 +1132,7 @@
         <w:rPr>
           <w:rFonts w:ascii="CMU Serif Roman" w:hAnsi="CMU Serif Roman" w:cs="CMU Serif Roman"/>
         </w:rPr>
-        <w:t>collected</w:t>
-      </w:r>
-      <w:r>
-        <w:rPr>
-          <w:rFonts w:ascii="CMU Serif Roman" w:hAnsi="CMU Serif Roman" w:cs="CMU Serif Roman"/>
-        </w:rPr>
-        <w:t xml:space="preserve"> </w:t>
+        <w:t xml:space="preserve">collected </w:t>
       </w:r>
       <w:r>
         <w:rPr>
@@ -1171,31 +1165,7 @@
         <w:rPr>
           <w:rFonts w:ascii="CMU Serif Roman" w:hAnsi="CMU Serif Roman" w:cs="CMU Serif Roman"/>
         </w:rPr>
-        <w:t>To assess the relationship between floral species diversity and the gut microbiome of wild bumblebees, we modeled three response variables separately: bacterial species richness (observed ASVs), Shannon diversity, and Simpson diversity. For each of these diversity metrics, we fitted a linear model with floral diversity as a predictor, while controlling for potential variation due to sampling period and site by including</w:t>
-      </w:r>
-      <w:r>
-        <w:rPr>
-          <w:rFonts w:ascii="CMU Serif Roman" w:hAnsi="CMU Serif Roman" w:cs="CMU Serif Roman"/>
-        </w:rPr>
-        <w:t> period </w:t>
-      </w:r>
-      <w:r>
-        <w:rPr>
-          <w:rFonts w:ascii="CMU Serif Roman" w:hAnsi="CMU Serif Roman" w:cs="CMU Serif Roman"/>
-        </w:rPr>
-        <w:t>and</w:t>
-      </w:r>
-      <w:r>
-        <w:rPr>
-          <w:rFonts w:ascii="CMU Serif Roman" w:hAnsi="CMU Serif Roman" w:cs="CMU Serif Roman"/>
-        </w:rPr>
-        <w:t> site </w:t>
-      </w:r>
-      <w:r>
-        <w:rPr>
-          <w:rFonts w:ascii="CMU Serif Roman" w:hAnsi="CMU Serif Roman" w:cs="CMU Serif Roman"/>
-        </w:rPr>
-        <w:t xml:space="preserve">as covariates. </w:t>
+        <w:t xml:space="preserve">To assess the relationship between floral species diversity and the gut microbiome of wild bumblebees, we modeled three response variables separately: bacterial species richness (observed ASVs), Shannon diversity, and Simpson diversity. For each of these diversity metrics, we fitted a linear model with floral diversity as a predictor, while controlling for potential variation due to sampling period and site by including period and site as covariates. </w:t>
       </w:r>
     </w:p>
     <w:p>
@@ -1309,19 +1279,7 @@
         <w:rPr>
           <w:rFonts w:ascii="CMU Serif Roman" w:hAnsi="CMU Serif Roman" w:cs="CMU Serif Roman"/>
         </w:rPr>
-        <w:t>We find that bacterial diversity within bumblebee guts—as measured by Shannon and Simpson indices—</w:t>
-      </w:r>
-      <w:r>
-        <w:rPr>
-          <w:rFonts w:ascii="CMU Serif Roman" w:hAnsi="CMU Serif Roman" w:cs="CMU Serif Roman"/>
-        </w:rPr>
-        <w:t>significantly increases </w:t>
-      </w:r>
-      <w:r>
-        <w:rPr>
-          <w:rFonts w:ascii="CMU Serif Roman" w:hAnsi="CMU Serif Roman" w:cs="CMU Serif Roman"/>
-        </w:rPr>
-        <w:t>over time, whereas bacterial richness does not show a similar trend</w:t>
+        <w:t>We find that bacterial diversity within bumblebee guts—as measured by Shannon and Simpson indices—significantly increases over time, whereas bacterial richness does not show a similar trend</w:t>
       </w:r>
       <w:r>
         <w:rPr>
@@ -1333,37 +1291,23 @@
         <w:rPr>
           <w:rFonts w:ascii="CMU Serif Roman" w:hAnsi="CMU Serif Roman" w:cs="CMU Serif Roman"/>
         </w:rPr>
-        <w:t>. This suggests that while the number of bacterial taxa remains relatively constant, the</w:t>
-      </w:r>
-      <w:r>
-        <w:rPr>
-          <w:rFonts w:ascii="CMU Serif Roman" w:hAnsi="CMU Serif Roman" w:cs="CMU Serif Roman"/>
-        </w:rPr>
-        <w:t> distribution and relative abundance </w:t>
-      </w:r>
-      <w:r>
-        <w:rPr>
-          <w:rFonts w:ascii="CMU Serif Roman" w:hAnsi="CMU Serif Roman" w:cs="CMU Serif Roman"/>
-        </w:rPr>
-        <w:t>of these taxa becomes more even over time.</w:t>
-      </w:r>
-    </w:p>
-    <w:p>
-      <w:pPr>
-        <w:pStyle w:val="BodyText"/>
-        <w:jc w:val="both"/>
-        <w:rPr>
-          <w:rFonts w:ascii="CMU Serif Roman" w:hAnsi="CMU Serif Roman" w:cs="CMU Serif Roman"/>
-        </w:rPr>
-      </w:pPr>
-      <w:proofErr w:type="spellStart"/>
+        <w:t>. This suggests that while the number of bacterial taxa remains relatively constant, the distribution and relative abundance of these taxa becomes more even over time.</w:t>
+      </w:r>
+    </w:p>
+    <w:p>
+      <w:pPr>
+        <w:pStyle w:val="BodyText"/>
+        <w:jc w:val="both"/>
+        <w:rPr>
+          <w:rFonts w:ascii="CMU Serif Roman" w:hAnsi="CMU Serif Roman" w:cs="CMU Serif Roman"/>
+        </w:rPr>
+      </w:pPr>
       <w:r>
         <w:rPr>
           <w:rFonts w:ascii="CMU Serif Roman" w:hAnsi="CMU Serif Roman" w:cs="CMU Serif Roman"/>
         </w:rPr>
         <w:t>Bumblebee</w:t>
       </w:r>
-      <w:proofErr w:type="spellEnd"/>
       <w:r>
         <w:rPr>
           <w:rFonts w:ascii="CMU Serif Roman" w:hAnsi="CMU Serif Roman" w:cs="CMU Serif Roman"/>
@@ -1572,6 +1516,7 @@
       <w:r>
         <w:rPr>
           <w:rFonts w:ascii="CMU Serif Roman" w:hAnsi="CMU Serif Roman" w:cs="CMU Serif Roman"/>
+          <w:noProof/>
         </w:rPr>
         <w:drawing>
           <wp:inline distT="0" distB="0" distL="0" distR="0" wp14:anchorId="412C1B60" wp14:editId="129B21F3">
@@ -1671,6 +1616,7 @@
       <w:r>
         <w:rPr>
           <w:rFonts w:ascii="CMU Serif Roman" w:hAnsi="CMU Serif Roman" w:cs="CMU Serif Roman"/>
+          <w:noProof/>
         </w:rPr>
         <w:drawing>
           <wp:inline distT="0" distB="0" distL="0" distR="0" wp14:anchorId="11A43035" wp14:editId="01C4E85F">
@@ -1714,6 +1660,9 @@
         <w:pStyle w:val="BodyText"/>
       </w:pPr>
       <w:r>
+        <w:rPr>
+          <w:noProof/>
+        </w:rPr>
         <w:drawing>
           <wp:inline distT="0" distB="0" distL="0" distR="0" wp14:anchorId="550308CF" wp14:editId="5768CA39">
             <wp:extent cx="4845538" cy="3413102"/>
@@ -1961,6 +1910,9 @@
         <w:pStyle w:val="BodyText"/>
       </w:pPr>
       <w:r>
+        <w:rPr>
+          <w:noProof/>
+        </w:rPr>
         <w:drawing>
           <wp:inline distT="0" distB="0" distL="0" distR="0" wp14:anchorId="72EBF9BF" wp14:editId="76C6B3DD">
             <wp:extent cx="5943600" cy="3424555"/>
@@ -2013,6 +1965,9 @@
         <w:pStyle w:val="BodyText"/>
       </w:pPr>
       <w:r>
+        <w:rPr>
+          <w:noProof/>
+        </w:rPr>
         <w:drawing>
           <wp:inline distT="0" distB="0" distL="0" distR="0" wp14:anchorId="5474E8D8" wp14:editId="30DE9F7F">
             <wp:extent cx="5943600" cy="3267710"/>
@@ -2060,6 +2015,9 @@
         <w:pStyle w:val="BodyText"/>
       </w:pPr>
       <w:r>
+        <w:rPr>
+          <w:noProof/>
+        </w:rPr>
         <w:lastRenderedPageBreak/>
         <w:drawing>
           <wp:inline distT="0" distB="0" distL="0" distR="0" wp14:anchorId="7381C976" wp14:editId="36D7BB7A">
@@ -2134,6 +2092,9 @@
         <w:pStyle w:val="BodyText"/>
       </w:pPr>
       <w:r>
+        <w:rPr>
+          <w:noProof/>
+        </w:rPr>
         <w:lastRenderedPageBreak/>
         <w:drawing>
           <wp:inline distT="0" distB="0" distL="0" distR="0" wp14:anchorId="0CB73838" wp14:editId="385B9A8E">
@@ -2182,6 +2143,9 @@
         <w:pStyle w:val="BodyText"/>
       </w:pPr>
       <w:r>
+        <w:rPr>
+          <w:noProof/>
+        </w:rPr>
         <w:lastRenderedPageBreak/>
         <w:drawing>
           <wp:inline distT="0" distB="0" distL="0" distR="0" wp14:anchorId="4CBF4322" wp14:editId="788D76FD">
@@ -2230,6 +2194,9 @@
         <w:pStyle w:val="BodyText"/>
       </w:pPr>
       <w:r>
+        <w:rPr>
+          <w:noProof/>
+        </w:rPr>
         <w:lastRenderedPageBreak/>
         <w:drawing>
           <wp:inline distT="0" distB="0" distL="0" distR="0" wp14:anchorId="264133EC" wp14:editId="1F82B880">
@@ -2357,6 +2324,7 @@
       <w:r>
         <w:rPr>
           <w:rFonts w:ascii="CMU Serif Roman" w:hAnsi="CMU Serif Roman" w:cs="CMU Serif Roman"/>
+          <w:noProof/>
         </w:rPr>
         <w:lastRenderedPageBreak/>
         <w:drawing>
@@ -2766,46 +2734,97 @@
           <w:rFonts w:ascii="CMU Serif Roman" w:hAnsi="CMU Serif Roman" w:cs="CMU Serif Roman"/>
         </w:rPr>
       </w:pPr>
-      <w:r>
-        <w:rPr>
-          <w:rFonts w:ascii="CMU Serif Roman" w:hAnsi="CMU Serif Roman" w:cs="CMU Serif Roman"/>
-        </w:rPr>
-        <w:drawing>
-          <wp:inline distT="0" distB="0" distL="0" distR="0" wp14:anchorId="676BBEA5" wp14:editId="0C027835">
-            <wp:extent cx="5943600" cy="3029585"/>
-            <wp:effectExtent l="0" t="0" r="0" b="5715"/>
-            <wp:docPr id="1141052432" name="Picture 1" descr="A diagram of different plants&#10;&#10;AI-generated content may be incorrect."/>
-            <wp:cNvGraphicFramePr>
-              <a:graphicFrameLocks xmlns:a="http://schemas.openxmlformats.org/drawingml/2006/main" noChangeAspect="1"/>
-            </wp:cNvGraphicFramePr>
-            <a:graphic xmlns:a="http://schemas.openxmlformats.org/drawingml/2006/main">
-              <a:graphicData uri="http://schemas.openxmlformats.org/drawingml/2006/picture">
-                <pic:pic xmlns:pic="http://schemas.openxmlformats.org/drawingml/2006/picture">
-                  <pic:nvPicPr>
-                    <pic:cNvPr id="1141052432" name="Picture 1" descr="A diagram of different plants&#10;&#10;AI-generated content may be incorrect."/>
-                    <pic:cNvPicPr/>
-                  </pic:nvPicPr>
-                  <pic:blipFill>
-                    <a:blip r:embed="rId17"/>
-                    <a:stretch>
-                      <a:fillRect/>
-                    </a:stretch>
-                  </pic:blipFill>
-                  <pic:spPr>
-                    <a:xfrm>
-                      <a:off x="0" y="0"/>
-                      <a:ext cx="5943600" cy="3029585"/>
-                    </a:xfrm>
-                    <a:prstGeom prst="rect">
-                      <a:avLst/>
-                    </a:prstGeom>
-                  </pic:spPr>
-                </pic:pic>
-              </a:graphicData>
-            </a:graphic>
-          </wp:inline>
-        </w:drawing>
-      </w:r>
+      <w:del w:id="4" w:author="Ainhoa Magrach" w:date="2025-07-07T13:29:00Z" w16du:dateUtc="2025-07-07T11:29:00Z">
+        <w:r>
+          <w:rPr>
+            <w:rFonts w:ascii="CMU Serif Roman" w:hAnsi="CMU Serif Roman" w:cs="CMU Serif Roman"/>
+            <w:noProof/>
+          </w:rPr>
+          <w:drawing>
+            <wp:inline distT="0" distB="0" distL="0" distR="0" wp14:anchorId="676BBEA5" wp14:editId="1C3D2BC0">
+              <wp:extent cx="5943600" cy="3029585"/>
+              <wp:effectExtent l="0" t="0" r="0" b="5715"/>
+              <wp:docPr id="1141052432" name="Picture 1" descr="A diagram of different plants&#10;&#10;AI-generated content may be incorrect."/>
+              <wp:cNvGraphicFramePr>
+                <a:graphicFrameLocks xmlns:a="http://schemas.openxmlformats.org/drawingml/2006/main" noChangeAspect="1"/>
+              </wp:cNvGraphicFramePr>
+              <a:graphic xmlns:a="http://schemas.openxmlformats.org/drawingml/2006/main">
+                <a:graphicData uri="http://schemas.openxmlformats.org/drawingml/2006/picture">
+                  <pic:pic xmlns:pic="http://schemas.openxmlformats.org/drawingml/2006/picture">
+                    <pic:nvPicPr>
+                      <pic:cNvPr id="1141052432" name="Picture 1" descr="A diagram of different plants&#10;&#10;AI-generated content may be incorrect."/>
+                      <pic:cNvPicPr/>
+                    </pic:nvPicPr>
+                    <pic:blipFill>
+                      <a:blip r:embed="rId17"/>
+                      <a:stretch>
+                        <a:fillRect/>
+                      </a:stretch>
+                    </pic:blipFill>
+                    <pic:spPr>
+                      <a:xfrm>
+                        <a:off x="0" y="0"/>
+                        <a:ext cx="5943600" cy="3029585"/>
+                      </a:xfrm>
+                      <a:prstGeom prst="rect">
+                        <a:avLst/>
+                      </a:prstGeom>
+                    </pic:spPr>
+                  </pic:pic>
+                </a:graphicData>
+              </a:graphic>
+            </wp:inline>
+          </w:drawing>
+        </w:r>
+      </w:del>
+      <w:ins w:id="5" w:author="Ainhoa Magrach" w:date="2025-07-07T13:29:00Z" w16du:dateUtc="2025-07-07T11:29:00Z">
+        <w:r>
+          <w:rPr>
+            <w:noProof/>
+          </w:rPr>
+          <w:t xml:space="preserve"> </w:t>
+        </w:r>
+        <w:r>
+          <w:rPr>
+            <w:rFonts w:ascii="CMU Serif Roman" w:hAnsi="CMU Serif Roman" w:cs="CMU Serif Roman"/>
+          </w:rPr>
+          <w:drawing>
+            <wp:inline distT="0" distB="0" distL="0" distR="0" wp14:anchorId="17A0BCD9" wp14:editId="32AE5623">
+              <wp:extent cx="5943600" cy="3472815"/>
+              <wp:effectExtent l="0" t="0" r="0" b="0"/>
+              <wp:docPr id="856476896" name="Picture 1" descr="A diagram of different species&#10;&#10;AI-generated content may be incorrect."/>
+              <wp:cNvGraphicFramePr>
+                <a:graphicFrameLocks xmlns:a="http://schemas.openxmlformats.org/drawingml/2006/main" noChangeAspect="1"/>
+              </wp:cNvGraphicFramePr>
+              <a:graphic xmlns:a="http://schemas.openxmlformats.org/drawingml/2006/main">
+                <a:graphicData uri="http://schemas.openxmlformats.org/drawingml/2006/picture">
+                  <pic:pic xmlns:pic="http://schemas.openxmlformats.org/drawingml/2006/picture">
+                    <pic:nvPicPr>
+                      <pic:cNvPr id="856476896" name="Picture 1" descr="A diagram of different species&#10;&#10;AI-generated content may be incorrect."/>
+                      <pic:cNvPicPr/>
+                    </pic:nvPicPr>
+                    <pic:blipFill>
+                      <a:blip r:embed="rId18"/>
+                      <a:stretch>
+                        <a:fillRect/>
+                      </a:stretch>
+                    </pic:blipFill>
+                    <pic:spPr>
+                      <a:xfrm>
+                        <a:off x="0" y="0"/>
+                        <a:ext cx="5943600" cy="3472815"/>
+                      </a:xfrm>
+                      <a:prstGeom prst="rect">
+                        <a:avLst/>
+                      </a:prstGeom>
+                    </pic:spPr>
+                  </pic:pic>
+                </a:graphicData>
+              </a:graphic>
+            </wp:inline>
+          </w:drawing>
+        </w:r>
+      </w:ins>
     </w:p>
     <w:p>
       <w:pPr>
@@ -2836,56 +2855,108 @@
           <w:rFonts w:ascii="CMU Serif Roman" w:hAnsi="CMU Serif Roman" w:cs="CMU Serif Roman"/>
         </w:rPr>
       </w:pPr>
-      <w:r>
-        <w:rPr>
-          <w:rFonts w:ascii="CMU Serif Roman" w:hAnsi="CMU Serif Roman" w:cs="CMU Serif Roman"/>
+      <w:del w:id="6" w:author="Ainhoa Magrach" w:date="2025-07-07T13:30:00Z" w16du:dateUtc="2025-07-07T11:30:00Z">
+        <w:r>
+          <w:rPr>
+            <w:rFonts w:ascii="CMU Serif Roman" w:hAnsi="CMU Serif Roman" w:cs="CMU Serif Roman"/>
+            <w:noProof/>
+          </w:rPr>
+          <w:lastRenderedPageBreak/>
+          <w:drawing>
+            <wp:inline distT="0" distB="0" distL="0" distR="0" wp14:anchorId="242A4C9B" wp14:editId="219CF54F">
+              <wp:extent cx="5943600" cy="3029585"/>
+              <wp:effectExtent l="0" t="0" r="0" b="5715"/>
+              <wp:docPr id="2107685114" name="Picture 1" descr="A diagram of different plants&#10;&#10;AI-generated content may be incorrect."/>
+              <wp:cNvGraphicFramePr>
+                <a:graphicFrameLocks xmlns:a="http://schemas.openxmlformats.org/drawingml/2006/main" noChangeAspect="1"/>
+              </wp:cNvGraphicFramePr>
+              <a:graphic xmlns:a="http://schemas.openxmlformats.org/drawingml/2006/main">
+                <a:graphicData uri="http://schemas.openxmlformats.org/drawingml/2006/picture">
+                  <pic:pic xmlns:pic="http://schemas.openxmlformats.org/drawingml/2006/picture">
+                    <pic:nvPicPr>
+                      <pic:cNvPr id="2107685114" name="Picture 1" descr="A diagram of different plants&#10;&#10;AI-generated content may be incorrect."/>
+                      <pic:cNvPicPr/>
+                    </pic:nvPicPr>
+                    <pic:blipFill>
+                      <a:blip r:embed="rId19"/>
+                      <a:stretch>
+                        <a:fillRect/>
+                      </a:stretch>
+                    </pic:blipFill>
+                    <pic:spPr>
+                      <a:xfrm>
+                        <a:off x="0" y="0"/>
+                        <a:ext cx="5943600" cy="3029585"/>
+                      </a:xfrm>
+                      <a:prstGeom prst="rect">
+                        <a:avLst/>
+                      </a:prstGeom>
+                    </pic:spPr>
+                  </pic:pic>
+                </a:graphicData>
+              </a:graphic>
+            </wp:inline>
+          </w:drawing>
+        </w:r>
+      </w:del>
+      <w:ins w:id="7" w:author="Ainhoa Magrach" w:date="2025-07-07T13:30:00Z" w16du:dateUtc="2025-07-07T11:30:00Z">
+        <w:r>
+          <w:rPr>
+            <w:noProof/>
+          </w:rPr>
+          <w:t xml:space="preserve"> </w:t>
+        </w:r>
+        <w:r>
+          <w:rPr>
+            <w:rFonts w:ascii="CMU Serif Roman" w:hAnsi="CMU Serif Roman" w:cs="CMU Serif Roman"/>
+          </w:rPr>
+          <w:drawing>
+            <wp:inline distT="0" distB="0" distL="0" distR="0" wp14:anchorId="40E18713" wp14:editId="68BD6186">
+              <wp:extent cx="5943600" cy="4588510"/>
+              <wp:effectExtent l="0" t="0" r="0" b="0"/>
+              <wp:docPr id="1324866699" name="Picture 1"/>
+              <wp:cNvGraphicFramePr>
+                <a:graphicFrameLocks xmlns:a="http://schemas.openxmlformats.org/drawingml/2006/main" noChangeAspect="1"/>
+              </wp:cNvGraphicFramePr>
+              <a:graphic xmlns:a="http://schemas.openxmlformats.org/drawingml/2006/main">
+                <a:graphicData uri="http://schemas.openxmlformats.org/drawingml/2006/picture">
+                  <pic:pic xmlns:pic="http://schemas.openxmlformats.org/drawingml/2006/picture">
+                    <pic:nvPicPr>
+                      <pic:cNvPr id="1324866699" name=""/>
+                      <pic:cNvPicPr/>
+                    </pic:nvPicPr>
+                    <pic:blipFill>
+                      <a:blip r:embed="rId20"/>
+                      <a:stretch>
+                        <a:fillRect/>
+                      </a:stretch>
+                    </pic:blipFill>
+                    <pic:spPr>
+                      <a:xfrm>
+                        <a:off x="0" y="0"/>
+                        <a:ext cx="5943600" cy="4588510"/>
+                      </a:xfrm>
+                      <a:prstGeom prst="rect">
+                        <a:avLst/>
+                      </a:prstGeom>
+                    </pic:spPr>
+                  </pic:pic>
+                </a:graphicData>
+              </a:graphic>
+            </wp:inline>
+          </w:drawing>
+        </w:r>
+      </w:ins>
+    </w:p>
+    <w:p>
+      <w:pPr>
+        <w:pStyle w:val="BodyText"/>
+      </w:pPr>
+      <w:r>
+        <w:rPr>
+          <w:noProof/>
         </w:rPr>
         <w:lastRenderedPageBreak/>
-        <w:drawing>
-          <wp:inline distT="0" distB="0" distL="0" distR="0" wp14:anchorId="242A4C9B" wp14:editId="708F0362">
-            <wp:extent cx="5943600" cy="3029585"/>
-            <wp:effectExtent l="0" t="0" r="0" b="5715"/>
-            <wp:docPr id="2107685114" name="Picture 1" descr="A diagram of different plants&#10;&#10;AI-generated content may be incorrect."/>
-            <wp:cNvGraphicFramePr>
-              <a:graphicFrameLocks xmlns:a="http://schemas.openxmlformats.org/drawingml/2006/main" noChangeAspect="1"/>
-            </wp:cNvGraphicFramePr>
-            <a:graphic xmlns:a="http://schemas.openxmlformats.org/drawingml/2006/main">
-              <a:graphicData uri="http://schemas.openxmlformats.org/drawingml/2006/picture">
-                <pic:pic xmlns:pic="http://schemas.openxmlformats.org/drawingml/2006/picture">
-                  <pic:nvPicPr>
-                    <pic:cNvPr id="2107685114" name="Picture 1" descr="A diagram of different plants&#10;&#10;AI-generated content may be incorrect."/>
-                    <pic:cNvPicPr/>
-                  </pic:nvPicPr>
-                  <pic:blipFill>
-                    <a:blip r:embed="rId18"/>
-                    <a:stretch>
-                      <a:fillRect/>
-                    </a:stretch>
-                  </pic:blipFill>
-                  <pic:spPr>
-                    <a:xfrm>
-                      <a:off x="0" y="0"/>
-                      <a:ext cx="5943600" cy="3029585"/>
-                    </a:xfrm>
-                    <a:prstGeom prst="rect">
-                      <a:avLst/>
-                    </a:prstGeom>
-                  </pic:spPr>
-                </pic:pic>
-              </a:graphicData>
-            </a:graphic>
-          </wp:inline>
-        </w:drawing>
-      </w:r>
-    </w:p>
-    <w:p>
-      <w:pPr>
-        <w:pStyle w:val="BodyText"/>
-      </w:pPr>
-      <w:r>
-        <w:rPr>
-          <w:noProof/>
-        </w:rPr>
         <w:drawing>
           <wp:inline distT="0" distB="0" distL="0" distR="0" wp14:anchorId="48FDFC4A" wp14:editId="435B8A2D">
             <wp:extent cx="5943600" cy="4457700"/>
@@ -2916,7 +2987,7 @@
                     </pic:cNvPicPr>
                   </pic:nvPicPr>
                   <pic:blipFill>
-                    <a:blip r:embed="rId19"/>
+                    <a:blip r:embed="rId21"/>
                     <a:stretch>
                       <a:fillRect/>
                     </a:stretch>
@@ -2950,147 +3021,162 @@
           <w:rFonts w:ascii="CMU Serif Roman" w:hAnsi="CMU Serif Roman" w:cs="CMU Serif Roman"/>
         </w:rPr>
       </w:pPr>
-      <w:bookmarkStart w:id="4" w:name="discussion"/>
+      <w:bookmarkStart w:id="8" w:name="discussion"/>
       <w:bookmarkEnd w:id="3"/>
       <w:r>
         <w:rPr>
           <w:rFonts w:ascii="CMU Serif Roman" w:hAnsi="CMU Serif Roman" w:cs="CMU Serif Roman"/>
         </w:rPr>
+        <w:t>Discussion</w:t>
+      </w:r>
+    </w:p>
+    <w:p>
+      <w:pPr>
+        <w:pStyle w:val="BodyText"/>
+        <w:jc w:val="both"/>
+        <w:rPr>
+          <w:rFonts w:ascii="CMU Serif Roman" w:hAnsi="CMU Serif Roman" w:cs="CMU Serif Roman"/>
+        </w:rPr>
+      </w:pPr>
+      <w:r>
+        <w:rPr>
+          <w:rFonts w:ascii="CMU Serif Roman" w:hAnsi="CMU Serif Roman" w:cs="CMU Serif Roman"/>
+        </w:rPr>
+        <w:t>Our analysis of the microbial composition of wild bumblebee guts shows that gut bacterial communities are dynamic across the flowering season and are shaped by both temporal variation and plant community characteristics.</w:t>
+      </w:r>
+      <w:r>
+        <w:rPr>
+          <w:rFonts w:ascii="CMU Serif Roman" w:hAnsi="CMU Serif Roman" w:cs="CMU Serif Roman"/>
+        </w:rPr>
+        <w:t xml:space="preserve"> </w:t>
+      </w:r>
+    </w:p>
+    <w:p>
+      <w:pPr>
+        <w:pStyle w:val="BodyText"/>
+        <w:jc w:val="both"/>
+        <w:rPr>
+          <w:rFonts w:ascii="CMU Serif Roman" w:hAnsi="CMU Serif Roman" w:cs="CMU Serif Roman"/>
+        </w:rPr>
+      </w:pPr>
+      <w:r>
+        <w:rPr>
+          <w:rFonts w:ascii="CMU Serif Roman" w:hAnsi="CMU Serif Roman" w:cs="CMU Serif Roman"/>
+        </w:rPr>
+        <w:t>W</w:t>
+      </w:r>
+      <w:r>
+        <w:rPr>
+          <w:rFonts w:ascii="CMU Serif Roman" w:hAnsi="CMU Serif Roman" w:cs="CMU Serif Roman"/>
+        </w:rPr>
+        <w:t>hil</w:t>
+      </w:r>
+      <w:r>
+        <w:rPr>
+          <w:rFonts w:ascii="CMU Serif Roman" w:hAnsi="CMU Serif Roman" w:cs="CMU Serif Roman"/>
+        </w:rPr>
+        <w:t>e</w:t>
+      </w:r>
+      <w:r>
+        <w:rPr>
+          <w:rFonts w:ascii="CMU Serif Roman" w:hAnsi="CMU Serif Roman" w:cs="CMU Serif Roman"/>
+        </w:rPr>
+        <w:t xml:space="preserve"> we</w:t>
+      </w:r>
+      <w:r>
+        <w:rPr>
+          <w:rFonts w:ascii="CMU Serif Roman" w:hAnsi="CMU Serif Roman" w:cs="CMU Serif Roman"/>
+        </w:rPr>
+        <w:t xml:space="preserve"> find that bacterial diversity within bumblebee guts</w:t>
+      </w:r>
+      <w:r>
+        <w:rPr>
+          <w:rFonts w:ascii="CMU Serif Roman" w:hAnsi="CMU Serif Roman" w:cs="CMU Serif Roman"/>
+        </w:rPr>
+        <w:t xml:space="preserve"> </w:t>
+      </w:r>
+      <w:r>
+        <w:rPr>
+          <w:rFonts w:ascii="CMU Serif Roman" w:hAnsi="CMU Serif Roman" w:cs="CMU Serif Roman"/>
+        </w:rPr>
+        <w:t>significantly increases over time, bacterial richness does not show a similar trend. This suggests that while the number of bacterial taxa remains relatively constant, the distribution and relative abundance of these taxa becomes more even over time. Such a pattern could indicate a gradual stabilization or maturation of the gut microbiome, potentially driven by changes in floral resources, foraging behavior, or environmental conditions that affect microbial colonization and persistence.</w:t>
+      </w:r>
+    </w:p>
+    <w:p>
+      <w:pPr>
+        <w:pStyle w:val="BodyText"/>
+        <w:jc w:val="both"/>
+        <w:rPr>
+          <w:rFonts w:ascii="CMU Serif Roman" w:hAnsi="CMU Serif Roman" w:cs="CMU Serif Roman"/>
+        </w:rPr>
+      </w:pPr>
+      <w:proofErr w:type="gramStart"/>
+      <w:r>
+        <w:rPr>
+          <w:rFonts w:ascii="CMU Serif Roman" w:hAnsi="CMU Serif Roman" w:cs="CMU Serif Roman"/>
+        </w:rPr>
+        <w:t>Similar to</w:t>
+      </w:r>
+      <w:proofErr w:type="gramEnd"/>
+      <w:r>
+        <w:rPr>
+          <w:rFonts w:ascii="CMU Serif Roman" w:hAnsi="CMU Serif Roman" w:cs="CMU Serif Roman"/>
+        </w:rPr>
+        <w:t xml:space="preserve"> other previous research looking at the composition of gut microbiomes in other bumblebee species, we find large differences throughout the flowering season (REF). Specifically, while bumblebees collected early in the season exhibit more depauperate </w:t>
+      </w:r>
+      <w:r>
+        <w:rPr>
+          <w:rFonts w:ascii="CMU Serif Roman" w:hAnsi="CMU Serif Roman" w:cs="CMU Serif Roman"/>
+        </w:rPr>
         <w:lastRenderedPageBreak/>
-        <w:t>Discussion</w:t>
-      </w:r>
-    </w:p>
-    <w:p>
-      <w:pPr>
-        <w:pStyle w:val="BodyText"/>
-        <w:jc w:val="both"/>
-        <w:rPr>
-          <w:rFonts w:ascii="CMU Serif Roman" w:hAnsi="CMU Serif Roman" w:cs="CMU Serif Roman"/>
-        </w:rPr>
-      </w:pPr>
-      <w:r>
-        <w:rPr>
-          <w:rFonts w:ascii="CMU Serif Roman" w:hAnsi="CMU Serif Roman" w:cs="CMU Serif Roman"/>
-        </w:rPr>
-        <w:t>Our analysis of the microbial composition of wild bumblebee guts shows that gut bacterial communities are dynamic across the flowering season and are shaped by both temporal variation and plant community characteristics.</w:t>
-      </w:r>
-      <w:r>
-        <w:rPr>
-          <w:rFonts w:ascii="CMU Serif Roman" w:hAnsi="CMU Serif Roman" w:cs="CMU Serif Roman"/>
+        <w:t xml:space="preserve">patterns, featuring XX to XX ASVs, those captured </w:t>
+      </w:r>
+      <w:proofErr w:type="gramStart"/>
+      <w:r>
+        <w:rPr>
+          <w:rFonts w:ascii="CMU Serif Roman" w:hAnsi="CMU Serif Roman" w:cs="CMU Serif Roman"/>
+        </w:rPr>
+        <w:t>later on</w:t>
+      </w:r>
+      <w:proofErr w:type="gramEnd"/>
+      <w:r>
+        <w:rPr>
+          <w:rFonts w:ascii="CMU Serif Roman" w:hAnsi="CMU Serif Roman" w:cs="CMU Serif Roman"/>
+        </w:rPr>
+        <w:t xml:space="preserve"> in the season host a much more diverse microbial community (XXX to XXX). </w:t>
+      </w:r>
+      <w:r>
+        <w:rPr>
+          <w:rFonts w:ascii="CMU Serif Roman" w:hAnsi="CMU Serif Roman" w:cs="CMU Serif Roman"/>
+        </w:rPr>
+        <w:t>This seasonal shift suggests a progressive accumulation of microbial diversity, potentially driven by increased foraging activity, exposure to diverse floral resources, and interactions with other pollinators as the season advances. These findings highlight the dynamic nature of bumblebee gut microbiomes and underscore the importance of seasonal context when assessing microbial diversity and its ecological implications.</w:t>
+      </w:r>
+    </w:p>
+    <w:p>
+      <w:pPr>
+        <w:spacing w:before="100" w:beforeAutospacing="1" w:after="100" w:afterAutospacing="1"/>
+        <w:jc w:val="both"/>
+        <w:rPr>
+          <w:rFonts w:ascii="CMU Serif Roman" w:eastAsiaTheme="minorHAnsi" w:hAnsi="CMU Serif Roman" w:cs="CMU Serif Roman"/>
+        </w:rPr>
+      </w:pPr>
+      <w:r>
+        <w:rPr>
+          <w:rFonts w:ascii="CMU Serif Roman" w:eastAsiaTheme="minorHAnsi" w:hAnsi="CMU Serif Roman" w:cs="CMU Serif Roman"/>
+        </w:rPr>
+        <w:t>Bumblebee guts were colonized by a diverse array of bacteria, with Gammaproteobacteria</w:t>
+      </w:r>
+      <w:r>
+        <w:rPr>
+          <w:rFonts w:ascii="CMU Serif Roman" w:eastAsiaTheme="minorHAnsi" w:hAnsi="CMU Serif Roman" w:cs="CMU Serif Roman"/>
         </w:rPr>
         <w:t xml:space="preserve"> </w:t>
       </w:r>
-    </w:p>
-    <w:p>
-      <w:pPr>
-        <w:pStyle w:val="BodyText"/>
-        <w:jc w:val="both"/>
-        <w:rPr>
-          <w:rFonts w:ascii="CMU Serif Roman" w:hAnsi="CMU Serif Roman" w:cs="CMU Serif Roman"/>
-        </w:rPr>
-      </w:pPr>
-      <w:r>
-        <w:rPr>
-          <w:rFonts w:ascii="CMU Serif Roman" w:hAnsi="CMU Serif Roman" w:cs="CMU Serif Roman"/>
-        </w:rPr>
-        <w:t>W</w:t>
-      </w:r>
-      <w:r>
-        <w:rPr>
-          <w:rFonts w:ascii="CMU Serif Roman" w:hAnsi="CMU Serif Roman" w:cs="CMU Serif Roman"/>
-        </w:rPr>
-        <w:t>hil</w:t>
-      </w:r>
-      <w:r>
-        <w:rPr>
-          <w:rFonts w:ascii="CMU Serif Roman" w:hAnsi="CMU Serif Roman" w:cs="CMU Serif Roman"/>
-        </w:rPr>
-        <w:t>e</w:t>
-      </w:r>
-      <w:r>
-        <w:rPr>
-          <w:rFonts w:ascii="CMU Serif Roman" w:hAnsi="CMU Serif Roman" w:cs="CMU Serif Roman"/>
-        </w:rPr>
-        <w:t xml:space="preserve"> we</w:t>
-      </w:r>
-      <w:r>
-        <w:rPr>
-          <w:rFonts w:ascii="CMU Serif Roman" w:hAnsi="CMU Serif Roman" w:cs="CMU Serif Roman"/>
-        </w:rPr>
-        <w:t xml:space="preserve"> find that bacterial diversity within bumblebee guts</w:t>
-      </w:r>
-      <w:r>
-        <w:rPr>
-          <w:rFonts w:ascii="CMU Serif Roman" w:hAnsi="CMU Serif Roman" w:cs="CMU Serif Roman"/>
-        </w:rPr>
-        <w:t xml:space="preserve"> </w:t>
-      </w:r>
-      <w:r>
-        <w:rPr>
-          <w:rFonts w:ascii="CMU Serif Roman" w:hAnsi="CMU Serif Roman" w:cs="CMU Serif Roman"/>
-        </w:rPr>
-        <w:t>significantly increases </w:t>
-      </w:r>
-      <w:r>
-        <w:rPr>
-          <w:rFonts w:ascii="CMU Serif Roman" w:hAnsi="CMU Serif Roman" w:cs="CMU Serif Roman"/>
-        </w:rPr>
-        <w:t>over time, bacterial richness does not show a similar trend. This suggests that while the number of bacterial taxa remains relatively constant, the</w:t>
-      </w:r>
-      <w:r>
-        <w:rPr>
-          <w:rFonts w:ascii="CMU Serif Roman" w:hAnsi="CMU Serif Roman" w:cs="CMU Serif Roman"/>
-        </w:rPr>
-        <w:t> distribution and relative abundance </w:t>
-      </w:r>
-      <w:r>
-        <w:rPr>
-          <w:rFonts w:ascii="CMU Serif Roman" w:hAnsi="CMU Serif Roman" w:cs="CMU Serif Roman"/>
-        </w:rPr>
-        <w:t>of these taxa becomes more even over time. Such a pattern could indicate a gradual stabilization or maturation of the gut microbiome, potentially driven by changes in floral resources, foraging behavior, or environmental conditions that affect microbial colonization and persistence.</w:t>
-      </w:r>
-    </w:p>
-    <w:p>
-      <w:pPr>
-        <w:pStyle w:val="BodyText"/>
-        <w:jc w:val="both"/>
-        <w:rPr>
-          <w:rFonts w:ascii="CMU Serif Roman" w:hAnsi="CMU Serif Roman" w:cs="CMU Serif Roman"/>
-        </w:rPr>
-      </w:pPr>
-      <w:proofErr w:type="gramStart"/>
-      <w:r>
-        <w:rPr>
-          <w:rFonts w:ascii="CMU Serif Roman" w:hAnsi="CMU Serif Roman" w:cs="CMU Serif Roman"/>
-        </w:rPr>
-        <w:t>Similar to</w:t>
-      </w:r>
-      <w:proofErr w:type="gramEnd"/>
-      <w:r>
-        <w:rPr>
-          <w:rFonts w:ascii="CMU Serif Roman" w:hAnsi="CMU Serif Roman" w:cs="CMU Serif Roman"/>
-        </w:rPr>
-        <w:t xml:space="preserve"> other previous research looking at the composition of gut microbiomes in other bumblebee species, we find large differences throughout the flowering season (REF). Specifically, while bumblebees collected early in the season exhibit more depauperate patterns, featuring XX to XX ASVs, those captured </w:t>
-      </w:r>
-      <w:proofErr w:type="gramStart"/>
-      <w:r>
-        <w:rPr>
-          <w:rFonts w:ascii="CMU Serif Roman" w:hAnsi="CMU Serif Roman" w:cs="CMU Serif Roman"/>
-        </w:rPr>
-        <w:t>later on</w:t>
-      </w:r>
-      <w:proofErr w:type="gramEnd"/>
-      <w:r>
-        <w:rPr>
-          <w:rFonts w:ascii="CMU Serif Roman" w:hAnsi="CMU Serif Roman" w:cs="CMU Serif Roman"/>
-        </w:rPr>
-        <w:t xml:space="preserve"> in the season host a much more diverse microbial community (XXX to XXX). </w:t>
-      </w:r>
-      <w:r>
-        <w:rPr>
-          <w:rFonts w:ascii="CMU Serif Roman" w:hAnsi="CMU Serif Roman" w:cs="CMU Serif Roman"/>
-        </w:rPr>
-        <w:t>This seasonal shift suggests a progressive accumulation of microbial diversity, potentially driven by increased foraging activity, exposure to diverse floral resources, and interactions with other pollinators as the season advances. These findings highlight the dynamic nature of bumblebee gut microbiomes and underscore the importance of seasonal context when assessing microbial diversity and its ecological implications.</w:t>
+      <w:r>
+        <w:rPr>
+          <w:rFonts w:ascii="CMU Serif Roman" w:eastAsiaTheme="minorHAnsi" w:hAnsi="CMU Serif Roman" w:cs="CMU Serif Roman"/>
+        </w:rPr>
+        <w:t>being the most abundant, followed by Actinobacteria, Firmicutes, and Cyanobacteria. Notably, we observed a considerable proportion of unidentified bacterial taxa (X%), reflecting both the complexity of microbial communities within pollinators and potential gaps in current taxonomic databases. This underlines the importance of continued exploration and sequencing efforts to fully characterize the microbial diversity associated with bumblebees.</w:t>
       </w:r>
     </w:p>
     <w:p>
@@ -3105,19 +3191,49 @@
         <w:rPr>
           <w:rFonts w:ascii="CMU Serif Roman" w:eastAsiaTheme="minorHAnsi" w:hAnsi="CMU Serif Roman" w:cs="CMU Serif Roman"/>
         </w:rPr>
-        <w:t>Bumblebee guts were colonized by a diverse array of bacteria, with Gammaproteobacteria</w:t>
-      </w:r>
+        <w:t>In terms of temporal shifts, our results indicate the persistence of a core group of bacterial taxa consistently present across all time points and sampling sites. This stable core microbiome, which includes Lactobacillus, </w:t>
+      </w:r>
+      <w:proofErr w:type="spellStart"/>
       <w:r>
         <w:rPr>
           <w:rFonts w:ascii="CMU Serif Roman" w:eastAsiaTheme="minorHAnsi" w:hAnsi="CMU Serif Roman" w:cs="CMU Serif Roman"/>
         </w:rPr>
-        <w:t xml:space="preserve"> </w:t>
-      </w:r>
+        <w:t>Gilliamella</w:t>
+      </w:r>
+      <w:proofErr w:type="spellEnd"/>
       <w:r>
         <w:rPr>
           <w:rFonts w:ascii="CMU Serif Roman" w:eastAsiaTheme="minorHAnsi" w:hAnsi="CMU Serif Roman" w:cs="CMU Serif Roman"/>
         </w:rPr>
-        <w:t>being the most abundant, followed by Actinobacteria, Firmicutes, and Cyanobacteria. Notably, we observed a considerable proportion of unidentified bacterial taxa (X%), reflecting both the complexity of microbial communities within pollinators and potential gaps in current taxonomic databases. This underlines the importance of continued exploration and sequencing efforts to fully characterize the microbial diversity associated with bumblebees.</w:t>
+        <w:t>, </w:t>
+      </w:r>
+      <w:proofErr w:type="spellStart"/>
+      <w:r>
+        <w:rPr>
+          <w:rFonts w:ascii="CMU Serif Roman" w:eastAsiaTheme="minorHAnsi" w:hAnsi="CMU Serif Roman" w:cs="CMU Serif Roman"/>
+        </w:rPr>
+        <w:t>Snodgrassella</w:t>
+      </w:r>
+      <w:proofErr w:type="spellEnd"/>
+      <w:r>
+        <w:rPr>
+          <w:rFonts w:ascii="CMU Serif Roman" w:eastAsiaTheme="minorHAnsi" w:hAnsi="CMU Serif Roman" w:cs="CMU Serif Roman"/>
+        </w:rPr>
+        <w:t>, and </w:t>
+      </w:r>
+      <w:proofErr w:type="spellStart"/>
+      <w:r>
+        <w:rPr>
+          <w:rFonts w:ascii="CMU Serif Roman" w:eastAsiaTheme="minorHAnsi" w:hAnsi="CMU Serif Roman" w:cs="CMU Serif Roman"/>
+        </w:rPr>
+        <w:t>Bombiscardovia</w:t>
+      </w:r>
+      <w:proofErr w:type="spellEnd"/>
+      <w:r>
+        <w:rPr>
+          <w:rFonts w:ascii="CMU Serif Roman" w:eastAsiaTheme="minorHAnsi" w:hAnsi="CMU Serif Roman" w:cs="CMU Serif Roman"/>
+        </w:rPr>
+        <w:t>, likely plays fundamental roles in host health, such as enhancing nutrient absorption, protecting against pathogens, and modulating immune responses (REF). The stability of this core community across both spatial and temporal scales suggests a strong host-microbe association that may be evolutionarily conserved.</w:t>
       </w:r>
     </w:p>
     <w:p>
@@ -3132,108 +3248,57 @@
         <w:rPr>
           <w:rFonts w:ascii="CMU Serif Roman" w:eastAsiaTheme="minorHAnsi" w:hAnsi="CMU Serif Roman" w:cs="CMU Serif Roman"/>
         </w:rPr>
-        <w:t>In terms of temporal shifts, our results indicate the persistence of a core group of bacterial taxa consistently present across all time points and sampling sites. This stable core microbiome, which includes Lactobacillus, </w:t>
+        <w:t>Interestingly, as the season progressed, the core microbiome was complemented by additional bacterial taxa, particularly species within the genera Pseudomonas, Bacillus, </w:t>
       </w:r>
       <w:proofErr w:type="spellStart"/>
       <w:r>
         <w:rPr>
           <w:rFonts w:ascii="CMU Serif Roman" w:eastAsiaTheme="minorHAnsi" w:hAnsi="CMU Serif Roman" w:cs="CMU Serif Roman"/>
         </w:rPr>
-        <w:t>Gilliamella</w:t>
+        <w:t>Commensalibacter</w:t>
       </w:r>
       <w:proofErr w:type="spellEnd"/>
       <w:r>
         <w:rPr>
           <w:rFonts w:ascii="CMU Serif Roman" w:eastAsiaTheme="minorHAnsi" w:hAnsi="CMU Serif Roman" w:cs="CMU Serif Roman"/>
         </w:rPr>
-        <w:t>, </w:t>
+        <w:t>, and </w:t>
       </w:r>
       <w:proofErr w:type="spellStart"/>
       <w:r>
         <w:rPr>
           <w:rFonts w:ascii="CMU Serif Roman" w:eastAsiaTheme="minorHAnsi" w:hAnsi="CMU Serif Roman" w:cs="CMU Serif Roman"/>
         </w:rPr>
-        <w:t>Snodgrassella</w:t>
+        <w:t>Apibacter</w:t>
       </w:r>
       <w:proofErr w:type="spellEnd"/>
       <w:r>
         <w:rPr>
           <w:rFonts w:ascii="CMU Serif Roman" w:eastAsiaTheme="minorHAnsi" w:hAnsi="CMU Serif Roman" w:cs="CMU Serif Roman"/>
         </w:rPr>
-        <w:t>, and </w:t>
-      </w:r>
-      <w:proofErr w:type="spellStart"/>
-      <w:r>
+        <w:t>. This late-season diversification could be driven by changes in floral availability and composition, shifts in foraging behavior, or increased environmental exposure as colonies expand and worker bees travel farther distances (REF). These supplementary taxa may represent transient members of the microbiome that are acquired from specific floral resources or environmental sources, potentially enhancing metabolic capabilities or stress tolerance during the late foraging season.</w:t>
+      </w:r>
+    </w:p>
+    <w:p>
+      <w:pPr>
+        <w:spacing w:before="100" w:beforeAutospacing="1" w:after="100" w:afterAutospacing="1"/>
+        <w:jc w:val="both"/>
         <w:rPr>
           <w:rFonts w:ascii="CMU Serif Roman" w:eastAsiaTheme="minorHAnsi" w:hAnsi="CMU Serif Roman" w:cs="CMU Serif Roman"/>
         </w:rPr>
-        <w:t>Bombiscardovia</w:t>
-      </w:r>
-      <w:proofErr w:type="spellEnd"/>
+      </w:pPr>
       <w:r>
         <w:rPr>
           <w:rFonts w:ascii="CMU Serif Roman" w:eastAsiaTheme="minorHAnsi" w:hAnsi="CMU Serif Roman" w:cs="CMU Serif Roman"/>
         </w:rPr>
-        <w:t>, likely plays fundamental roles in host health, such as enhancing nutrient absorption, protecting against pathogens, and modulating immune responses (REF). The stability of this core community across both spatial and temporal scales suggests a strong host-microbe association that may be evolutionarily conserved.</w:t>
-      </w:r>
-    </w:p>
-    <w:p>
-      <w:pPr>
-        <w:spacing w:before="100" w:beforeAutospacing="1" w:after="100" w:afterAutospacing="1"/>
-        <w:jc w:val="both"/>
+        <w:t xml:space="preserve">Our analysis revealed distinct temporal clustering of bacterial communities, with clear compositional differences between early and late time points. This temporal structuring suggests that the microbiome is not static but dynamically responds to seasonal changes in the environment. The early-season microbiome may be shaped by overwintering survival and the limited floral diversity available during initial foraging, while the late-season community reflects cumulative interactions with a broader spectrum of plant </w:t>
+      </w:r>
+      <w:r>
         <w:rPr>
           <w:rFonts w:ascii="CMU Serif Roman" w:eastAsiaTheme="minorHAnsi" w:hAnsi="CMU Serif Roman" w:cs="CMU Serif Roman"/>
         </w:rPr>
-      </w:pPr>
-      <w:r>
-        <w:rPr>
-          <w:rFonts w:ascii="CMU Serif Roman" w:eastAsiaTheme="minorHAnsi" w:hAnsi="CMU Serif Roman" w:cs="CMU Serif Roman"/>
-        </w:rPr>
         <w:lastRenderedPageBreak/>
-        <w:t>Interestingly, as the season progressed, the core microbiome was complemented by additional bacterial taxa, particularly species within the genera Pseudomonas, Bacillus, </w:t>
-      </w:r>
-      <w:proofErr w:type="spellStart"/>
-      <w:r>
-        <w:rPr>
-          <w:rFonts w:ascii="CMU Serif Roman" w:eastAsiaTheme="minorHAnsi" w:hAnsi="CMU Serif Roman" w:cs="CMU Serif Roman"/>
-        </w:rPr>
-        <w:t>Commensalibacter</w:t>
-      </w:r>
-      <w:proofErr w:type="spellEnd"/>
-      <w:r>
-        <w:rPr>
-          <w:rFonts w:ascii="CMU Serif Roman" w:eastAsiaTheme="minorHAnsi" w:hAnsi="CMU Serif Roman" w:cs="CMU Serif Roman"/>
-        </w:rPr>
-        <w:t>, and </w:t>
-      </w:r>
-      <w:proofErr w:type="spellStart"/>
-      <w:r>
-        <w:rPr>
-          <w:rFonts w:ascii="CMU Serif Roman" w:eastAsiaTheme="minorHAnsi" w:hAnsi="CMU Serif Roman" w:cs="CMU Serif Roman"/>
-        </w:rPr>
-        <w:t>Apibacter</w:t>
-      </w:r>
-      <w:proofErr w:type="spellEnd"/>
-      <w:r>
-        <w:rPr>
-          <w:rFonts w:ascii="CMU Serif Roman" w:eastAsiaTheme="minorHAnsi" w:hAnsi="CMU Serif Roman" w:cs="CMU Serif Roman"/>
-        </w:rPr>
-        <w:t>. This late-season diversification could be driven by changes in floral availability and composition, shifts in foraging behavior, or increased environmental exposure as colonies expand and worker bees travel farther distances (REF). These supplementary taxa may represent transient members of the microbiome that are acquired from specific floral resources or environmental sources, potentially enhancing metabolic capabilities or stress tolerance during the late foraging season.</w:t>
-      </w:r>
-    </w:p>
-    <w:p>
-      <w:pPr>
-        <w:spacing w:before="100" w:beforeAutospacing="1" w:after="100" w:afterAutospacing="1"/>
-        <w:jc w:val="both"/>
-        <w:rPr>
-          <w:rFonts w:ascii="CMU Serif Roman" w:eastAsiaTheme="minorHAnsi" w:hAnsi="CMU Serif Roman" w:cs="CMU Serif Roman"/>
-        </w:rPr>
-      </w:pPr>
-      <w:r>
-        <w:rPr>
-          <w:rFonts w:ascii="CMU Serif Roman" w:eastAsiaTheme="minorHAnsi" w:hAnsi="CMU Serif Roman" w:cs="CMU Serif Roman"/>
-        </w:rPr>
-        <w:t>Our analysis revealed distinct temporal clustering of bacterial communities, with clear compositional differences between early and late time points. This temporal structuring suggests that the microbiome is not static but dynamically responds to seasonal changes in the environment. The early-season microbiome may be shaped by overwintering survival and the limited floral diversity available during initial foraging, while the late-season community reflects cumulative interactions with a broader spectrum of plant species. This shift may also be influenced by colony development stages, where increased colony size and worker numbers intensify environmental interactions.</w:t>
+        <w:t>species. This shift may also be influenced by colony development stages, where increased colony size and worker numbers intensify environmental interactions.</w:t>
       </w:r>
     </w:p>
     <w:p>
@@ -3269,8 +3334,8 @@
           <w:szCs w:val="32"/>
         </w:rPr>
       </w:pPr>
-      <w:bookmarkStart w:id="5" w:name="references"/>
-      <w:bookmarkEnd w:id="4"/>
+      <w:bookmarkStart w:id="9" w:name="references"/>
+      <w:bookmarkEnd w:id="8"/>
       <w:r>
         <w:rPr>
           <w:rFonts w:ascii="CMU Serif Roman" w:hAnsi="CMU Serif Roman" w:cs="CMU Serif Roman"/>
@@ -3307,8 +3372,8 @@
           <w:lang w:val="es-ES"/>
         </w:rPr>
       </w:pPr>
-      <w:bookmarkStart w:id="6" w:name="ref-Albizu2002COMPARACINDL"/>
-      <w:bookmarkStart w:id="7" w:name="refs"/>
+      <w:bookmarkStart w:id="10" w:name="ref-Albizu2002COMPARACINDL"/>
+      <w:bookmarkStart w:id="11" w:name="refs"/>
       <w:r>
         <w:rPr>
           <w:rFonts w:ascii="CMU Serif Roman" w:hAnsi="CMU Serif Roman" w:cs="CMU Serif Roman"/>
@@ -3421,8 +3486,8 @@
           <w:rFonts w:ascii="CMU Serif Roman" w:hAnsi="CMU Serif Roman" w:cs="CMU Serif Roman"/>
         </w:rPr>
       </w:pPr>
-      <w:bookmarkStart w:id="8" w:name="ref-allen-perkins2024"/>
-      <w:bookmarkEnd w:id="6"/>
+      <w:bookmarkStart w:id="12" w:name="ref-allen-perkins2024"/>
+      <w:bookmarkEnd w:id="10"/>
       <w:r>
         <w:rPr>
           <w:rFonts w:ascii="CMU Serif Roman" w:hAnsi="CMU Serif Roman" w:cs="CMU Serif Roman"/>
@@ -3466,7 +3531,7 @@
         </w:rPr>
         <w:t xml:space="preserve">, July. </w:t>
       </w:r>
-      <w:hyperlink r:id="rId20">
+      <w:hyperlink r:id="rId22">
         <w:r>
           <w:rPr>
             <w:rStyle w:val="Hyperlink"/>
@@ -3490,8 +3555,8 @@
           <w:rFonts w:ascii="CMU Serif Roman" w:hAnsi="CMU Serif Roman" w:cs="CMU Serif Roman"/>
         </w:rPr>
       </w:pPr>
-      <w:bookmarkStart w:id="9" w:name="ref-carlini2024"/>
-      <w:bookmarkEnd w:id="8"/>
+      <w:bookmarkStart w:id="13" w:name="ref-carlini2024"/>
+      <w:bookmarkEnd w:id="12"/>
       <w:r>
         <w:rPr>
           <w:rFonts w:ascii="CMU Serif Roman" w:hAnsi="CMU Serif Roman" w:cs="CMU Serif Roman"/>
@@ -3512,7 +3577,7 @@
         </w:rPr>
         <w:t xml:space="preserve"> 14 (1). </w:t>
       </w:r>
-      <w:hyperlink r:id="rId21">
+      <w:hyperlink r:id="rId23">
         <w:r>
           <w:rPr>
             <w:rStyle w:val="Hyperlink"/>
@@ -3536,8 +3601,8 @@
           <w:rFonts w:ascii="CMU Serif Roman" w:hAnsi="CMU Serif Roman" w:cs="CMU Serif Roman"/>
         </w:rPr>
       </w:pPr>
-      <w:bookmarkStart w:id="10" w:name="ref-devkota2024"/>
-      <w:bookmarkEnd w:id="9"/>
+      <w:bookmarkStart w:id="14" w:name="ref-devkota2024"/>
+      <w:bookmarkEnd w:id="13"/>
       <w:r>
         <w:rPr>
           <w:rFonts w:ascii="CMU Serif Roman" w:hAnsi="CMU Serif Roman" w:cs="CMU Serif Roman"/>
@@ -3558,7 +3623,7 @@
         </w:rPr>
         <w:t xml:space="preserve"> 50 (April): e02815. </w:t>
       </w:r>
-      <w:hyperlink r:id="rId22">
+      <w:hyperlink r:id="rId24">
         <w:r>
           <w:rPr>
             <w:rStyle w:val="Hyperlink"/>
@@ -3582,8 +3647,8 @@
           <w:rFonts w:ascii="CMU Serif Roman" w:hAnsi="CMU Serif Roman" w:cs="CMU Serif Roman"/>
         </w:rPr>
       </w:pPr>
-      <w:bookmarkStart w:id="11" w:name="ref-engel2012"/>
-      <w:bookmarkEnd w:id="10"/>
+      <w:bookmarkStart w:id="15" w:name="ref-engel2012"/>
+      <w:bookmarkEnd w:id="14"/>
       <w:r>
         <w:rPr>
           <w:rFonts w:ascii="CMU Serif Roman" w:hAnsi="CMU Serif Roman" w:cs="CMU Serif Roman"/>
@@ -3604,7 +3669,7 @@
         </w:rPr>
         <w:t xml:space="preserve"> 109 (27): 11002–7. </w:t>
       </w:r>
-      <w:hyperlink r:id="rId23">
+      <w:hyperlink r:id="rId25">
         <w:r>
           <w:rPr>
             <w:rStyle w:val="Hyperlink"/>
@@ -3628,8 +3693,8 @@
           <w:rFonts w:ascii="CMU Serif Roman" w:hAnsi="CMU Serif Roman" w:cs="CMU Serif Roman"/>
         </w:rPr>
       </w:pPr>
-      <w:bookmarkStart w:id="12" w:name="ref-Engel2013"/>
-      <w:bookmarkEnd w:id="11"/>
+      <w:bookmarkStart w:id="16" w:name="ref-Engel2013"/>
+      <w:bookmarkEnd w:id="15"/>
       <w:r>
         <w:rPr>
           <w:rFonts w:ascii="CMU Serif Roman" w:hAnsi="CMU Serif Roman" w:cs="CMU Serif Roman"/>
@@ -3650,7 +3715,7 @@
         </w:rPr>
         <w:t xml:space="preserve"> 37 (5): 699–735. </w:t>
       </w:r>
-      <w:hyperlink r:id="rId24">
+      <w:hyperlink r:id="rId26">
         <w:r>
           <w:rPr>
             <w:rStyle w:val="Hyperlink"/>
@@ -3674,8 +3739,8 @@
           <w:rFonts w:ascii="CMU Serif Roman" w:hAnsi="CMU Serif Roman" w:cs="CMU Serif Roman"/>
         </w:rPr>
       </w:pPr>
-      <w:bookmarkStart w:id="13" w:name="ref-ferguson2018"/>
-      <w:bookmarkEnd w:id="12"/>
+      <w:bookmarkStart w:id="17" w:name="ref-ferguson2018"/>
+      <w:bookmarkEnd w:id="16"/>
       <w:r>
         <w:rPr>
           <w:rFonts w:ascii="CMU Serif Roman" w:hAnsi="CMU Serif Roman" w:cs="CMU Serif Roman"/>
@@ -3696,7 +3761,7 @@
         </w:rPr>
         <w:t xml:space="preserve"> 32 (10): 2357–68. </w:t>
       </w:r>
-      <w:hyperlink r:id="rId25">
+      <w:hyperlink r:id="rId27">
         <w:r>
           <w:rPr>
             <w:rStyle w:val="Hyperlink"/>
@@ -3720,8 +3785,8 @@
           <w:rFonts w:ascii="CMU Serif Roman" w:hAnsi="CMU Serif Roman" w:cs="CMU Serif Roman"/>
         </w:rPr>
       </w:pPr>
-      <w:bookmarkStart w:id="14" w:name="ref-gérard2020"/>
-      <w:bookmarkEnd w:id="13"/>
+      <w:bookmarkStart w:id="18" w:name="ref-gérard2020"/>
+      <w:bookmarkEnd w:id="17"/>
       <w:r>
         <w:rPr>
           <w:rFonts w:ascii="CMU Serif Roman" w:hAnsi="CMU Serif Roman" w:cs="CMU Serif Roman"/>
@@ -3742,7 +3807,7 @@
         </w:rPr>
         <w:t xml:space="preserve"> 4 (1): 77–86. </w:t>
       </w:r>
-      <w:hyperlink r:id="rId26">
+      <w:hyperlink r:id="rId28">
         <w:r>
           <w:rPr>
             <w:rStyle w:val="Hyperlink"/>
@@ -3766,8 +3831,8 @@
           <w:rFonts w:ascii="CMU Serif Roman" w:hAnsi="CMU Serif Roman" w:cs="CMU Serif Roman"/>
         </w:rPr>
       </w:pPr>
-      <w:bookmarkStart w:id="15" w:name="ref-guzman2024"/>
-      <w:bookmarkEnd w:id="14"/>
+      <w:bookmarkStart w:id="19" w:name="ref-guzman2024"/>
+      <w:bookmarkEnd w:id="18"/>
       <w:r>
         <w:rPr>
           <w:rFonts w:ascii="CMU Serif Roman" w:hAnsi="CMU Serif Roman" w:cs="CMU Serif Roman"/>
@@ -3788,7 +3853,7 @@
         </w:rPr>
         <w:t xml:space="preserve"> 7 (10): 1324–34. </w:t>
       </w:r>
-      <w:hyperlink r:id="rId27">
+      <w:hyperlink r:id="rId29">
         <w:r>
           <w:rPr>
             <w:rStyle w:val="Hyperlink"/>
@@ -3811,7 +3876,7 @@
           <w:rFonts w:ascii="CMU Serif Roman" w:hAnsi="CMU Serif Roman" w:cs="CMU Serif Roman"/>
         </w:rPr>
       </w:pPr>
-      <w:bookmarkStart w:id="16" w:name="ref-iNEXT"/>
+      <w:bookmarkStart w:id="20" w:name="ref-iNEXT"/>
       <w:r>
         <w:rPr>
           <w:rFonts w:ascii="CMU Serif Roman" w:hAnsi="CMU Serif Roman" w:cs="CMU Serif Roman"/>
@@ -3833,7 +3898,7 @@
         </w:rPr>
         <w:t xml:space="preserve">: Interpolation and Extrapolation for Species Diversity.” </w:t>
       </w:r>
-      <w:hyperlink r:id="rId28">
+      <w:hyperlink r:id="rId30">
         <w:r>
           <w:rPr>
             <w:rStyle w:val="Hyperlink"/>
@@ -3848,7 +3913,7 @@
         </w:rPr>
         <w:t>.</w:t>
       </w:r>
-      <w:bookmarkEnd w:id="16"/>
+      <w:bookmarkEnd w:id="20"/>
     </w:p>
     <w:p>
       <w:pPr>
@@ -3858,8 +3923,8 @@
           <w:rFonts w:ascii="CMU Serif Roman" w:hAnsi="CMU Serif Roman" w:cs="CMU Serif Roman"/>
         </w:rPr>
       </w:pPr>
-      <w:bookmarkStart w:id="17" w:name="ref-klein2006"/>
-      <w:bookmarkEnd w:id="15"/>
+      <w:bookmarkStart w:id="21" w:name="ref-klein2006"/>
+      <w:bookmarkEnd w:id="19"/>
       <w:r>
         <w:rPr>
           <w:rFonts w:ascii="CMU Serif Roman" w:hAnsi="CMU Serif Roman" w:cs="CMU Serif Roman"/>
@@ -3880,7 +3945,7 @@
         </w:rPr>
         <w:t xml:space="preserve"> 274 (1608): 303–13. </w:t>
       </w:r>
-      <w:hyperlink r:id="rId29">
+      <w:hyperlink r:id="rId31">
         <w:r>
           <w:rPr>
             <w:rStyle w:val="Hyperlink"/>
@@ -3904,8 +3969,8 @@
           <w:rFonts w:ascii="CMU Serif Roman" w:hAnsi="CMU Serif Roman" w:cs="CMU Serif Roman"/>
         </w:rPr>
       </w:pPr>
-      <w:bookmarkStart w:id="18" w:name="ref-koch2011"/>
-      <w:bookmarkEnd w:id="17"/>
+      <w:bookmarkStart w:id="22" w:name="ref-koch2011"/>
+      <w:bookmarkEnd w:id="21"/>
       <w:r>
         <w:rPr>
           <w:rFonts w:ascii="CMU Serif Roman" w:hAnsi="CMU Serif Roman" w:cs="CMU Serif Roman"/>
@@ -3926,7 +3991,7 @@
         </w:rPr>
         <w:t xml:space="preserve"> 108 (48): 19288–92. </w:t>
       </w:r>
-      <w:hyperlink r:id="rId30">
+      <w:hyperlink r:id="rId32">
         <w:r>
           <w:rPr>
             <w:rStyle w:val="Hyperlink"/>
@@ -3950,8 +4015,8 @@
           <w:rFonts w:ascii="CMU Serif Roman" w:hAnsi="CMU Serif Roman" w:cs="CMU Serif Roman"/>
         </w:rPr>
       </w:pPr>
-      <w:bookmarkStart w:id="19" w:name="ref-li2023"/>
-      <w:bookmarkEnd w:id="18"/>
+      <w:bookmarkStart w:id="23" w:name="ref-li2023"/>
+      <w:bookmarkEnd w:id="22"/>
       <w:r>
         <w:rPr>
           <w:rFonts w:ascii="CMU Serif Roman" w:hAnsi="CMU Serif Roman" w:cs="CMU Serif Roman"/>
@@ -3972,7 +4037,7 @@
         </w:rPr>
         <w:t xml:space="preserve">, July. </w:t>
       </w:r>
-      <w:hyperlink r:id="rId31">
+      <w:hyperlink r:id="rId33">
         <w:r>
           <w:rPr>
             <w:rStyle w:val="Hyperlink"/>
@@ -3996,8 +4061,8 @@
           <w:rFonts w:ascii="CMU Serif Roman" w:hAnsi="CMU Serif Roman" w:cs="CMU Serif Roman"/>
         </w:rPr>
       </w:pPr>
-      <w:bookmarkStart w:id="20" w:name="ref-ludvigsen2015"/>
-      <w:bookmarkEnd w:id="19"/>
+      <w:bookmarkStart w:id="24" w:name="ref-ludvigsen2015"/>
+      <w:bookmarkEnd w:id="23"/>
       <w:r>
         <w:rPr>
           <w:rFonts w:ascii="CMU Serif Roman" w:hAnsi="CMU Serif Roman" w:cs="CMU Serif Roman"/>
@@ -4018,7 +4083,7 @@
         </w:rPr>
         <w:t xml:space="preserve"> 30 (3): 235–44. </w:t>
       </w:r>
-      <w:hyperlink r:id="rId32">
+      <w:hyperlink r:id="rId34">
         <w:r>
           <w:rPr>
             <w:rStyle w:val="Hyperlink"/>
@@ -4042,8 +4107,8 @@
           <w:rFonts w:ascii="CMU Serif Roman" w:hAnsi="CMU Serif Roman" w:cs="CMU Serif Roman"/>
         </w:rPr>
       </w:pPr>
-      <w:bookmarkStart w:id="21" w:name="ref-maes2016"/>
-      <w:bookmarkEnd w:id="20"/>
+      <w:bookmarkStart w:id="25" w:name="ref-maes2016"/>
+      <w:bookmarkEnd w:id="24"/>
       <w:r>
         <w:rPr>
           <w:rFonts w:ascii="CMU Serif Roman" w:hAnsi="CMU Serif Roman" w:cs="CMU Serif Roman"/>
@@ -4078,7 +4143,7 @@
         </w:rPr>
         <w:t xml:space="preserve"> 25 (21): 5439–50. </w:t>
       </w:r>
-      <w:hyperlink r:id="rId33">
+      <w:hyperlink r:id="rId35">
         <w:r>
           <w:rPr>
             <w:rStyle w:val="Hyperlink"/>
@@ -4102,8 +4167,8 @@
           <w:rFonts w:ascii="CMU Serif Roman" w:hAnsi="CMU Serif Roman" w:cs="CMU Serif Roman"/>
         </w:rPr>
       </w:pPr>
-      <w:bookmarkStart w:id="22" w:name="ref-manley2015"/>
-      <w:bookmarkEnd w:id="21"/>
+      <w:bookmarkStart w:id="26" w:name="ref-manley2015"/>
+      <w:bookmarkEnd w:id="25"/>
       <w:r>
         <w:rPr>
           <w:rFonts w:ascii="CMU Serif Roman" w:hAnsi="CMU Serif Roman" w:cs="CMU Serif Roman"/>
@@ -4124,7 +4189,7 @@
         </w:rPr>
         <w:t xml:space="preserve"> 52 (2): 331–40. </w:t>
       </w:r>
-      <w:hyperlink r:id="rId34">
+      <w:hyperlink r:id="rId36">
         <w:r>
           <w:rPr>
             <w:rStyle w:val="Hyperlink"/>
@@ -4148,8 +4213,8 @@
           <w:rFonts w:ascii="CMU Serif Roman" w:hAnsi="CMU Serif Roman" w:cs="CMU Serif Roman"/>
         </w:rPr>
       </w:pPr>
-      <w:bookmarkStart w:id="23" w:name="ref-martinson2010"/>
-      <w:bookmarkEnd w:id="22"/>
+      <w:bookmarkStart w:id="27" w:name="ref-martinson2010"/>
+      <w:bookmarkEnd w:id="26"/>
       <w:r>
         <w:rPr>
           <w:rFonts w:ascii="CMU Serif Roman" w:hAnsi="CMU Serif Roman" w:cs="CMU Serif Roman"/>
@@ -4170,7 +4235,7 @@
         </w:rPr>
         <w:t xml:space="preserve"> 20 (3): 619–28. </w:t>
       </w:r>
-      <w:hyperlink r:id="rId35">
+      <w:hyperlink r:id="rId37">
         <w:r>
           <w:rPr>
             <w:rStyle w:val="Hyperlink"/>
@@ -4194,8 +4259,8 @@
           <w:rFonts w:ascii="CMU Serif Roman" w:hAnsi="CMU Serif Roman" w:cs="CMU Serif Roman"/>
         </w:rPr>
       </w:pPr>
-      <w:bookmarkStart w:id="24" w:name="ref-miller-struttmann2015"/>
-      <w:bookmarkEnd w:id="23"/>
+      <w:bookmarkStart w:id="28" w:name="ref-miller-struttmann2015"/>
+      <w:bookmarkEnd w:id="27"/>
       <w:r>
         <w:rPr>
           <w:rFonts w:ascii="CMU Serif Roman" w:hAnsi="CMU Serif Roman" w:cs="CMU Serif Roman"/>
@@ -4216,7 +4281,7 @@
         </w:rPr>
         <w:t xml:space="preserve"> 349 (6255): 1541–44. </w:t>
       </w:r>
-      <w:hyperlink r:id="rId36">
+      <w:hyperlink r:id="rId38">
         <w:r>
           <w:rPr>
             <w:rStyle w:val="Hyperlink"/>
@@ -4240,8 +4305,8 @@
           <w:rFonts w:ascii="CMU Serif Roman" w:hAnsi="CMU Serif Roman" w:cs="CMU Serif Roman"/>
         </w:rPr>
       </w:pPr>
-      <w:bookmarkStart w:id="25" w:name="ref-murphy2022"/>
-      <w:bookmarkEnd w:id="24"/>
+      <w:bookmarkStart w:id="29" w:name="ref-murphy2022"/>
+      <w:bookmarkEnd w:id="28"/>
       <w:r>
         <w:rPr>
           <w:rFonts w:ascii="CMU Serif Roman" w:hAnsi="CMU Serif Roman" w:cs="CMU Serif Roman"/>
@@ -4263,7 +4328,7 @@
         </w:rPr>
         <w:t xml:space="preserve"> 4 (3): 773–85. </w:t>
       </w:r>
-      <w:hyperlink r:id="rId37">
+      <w:hyperlink r:id="rId39">
         <w:r>
           <w:rPr>
             <w:rStyle w:val="Hyperlink"/>
@@ -4287,8 +4352,8 @@
           <w:rFonts w:ascii="CMU Serif Roman" w:hAnsi="CMU Serif Roman" w:cs="CMU Serif Roman"/>
         </w:rPr>
       </w:pPr>
-      <w:bookmarkStart w:id="26" w:name="ref-neu2021"/>
-      <w:bookmarkEnd w:id="25"/>
+      <w:bookmarkStart w:id="30" w:name="ref-neu2021"/>
+      <w:bookmarkEnd w:id="29"/>
       <w:r>
         <w:rPr>
           <w:rFonts w:ascii="CMU Serif Roman" w:hAnsi="CMU Serif Roman" w:cs="CMU Serif Roman"/>
@@ -4309,7 +4374,7 @@
         </w:rPr>
         <w:t xml:space="preserve"> 118 (51). </w:t>
       </w:r>
-      <w:hyperlink r:id="rId38">
+      <w:hyperlink r:id="rId40">
         <w:r>
           <w:rPr>
             <w:rStyle w:val="Hyperlink"/>
@@ -4333,14 +4398,14 @@
           <w:rFonts w:ascii="CMU Serif Roman" w:hAnsi="CMU Serif Roman" w:cs="CMU Serif Roman"/>
         </w:rPr>
       </w:pPr>
-      <w:bookmarkStart w:id="27" w:name="ref-vegan"/>
+      <w:bookmarkStart w:id="31" w:name="ref-vegan"/>
       <w:r>
         <w:rPr>
           <w:rFonts w:ascii="CMU Serif Roman" w:hAnsi="CMU Serif Roman" w:cs="CMU Serif Roman"/>
         </w:rPr>
         <w:t xml:space="preserve">Oksanen, Jari, Gavin L. Simpson, F. Guillaume Blanchet, Roeland Kindt, Pierre Legendre, Peter R. Minchin, R. B. O’Hara, et al. 2024. “Vegan: Community Ecology Package.” </w:t>
       </w:r>
-      <w:hyperlink r:id="rId39">
+      <w:hyperlink r:id="rId41">
         <w:r>
           <w:rPr>
             <w:rStyle w:val="Hyperlink"/>
@@ -4355,7 +4420,7 @@
         </w:rPr>
         <w:t>.</w:t>
       </w:r>
-      <w:bookmarkEnd w:id="27"/>
+      <w:bookmarkEnd w:id="31"/>
     </w:p>
     <w:p>
       <w:pPr>
@@ -4363,10 +4428,16 @@
         <w:jc w:val="both"/>
         <w:rPr>
           <w:rFonts w:ascii="CMU Serif Roman" w:hAnsi="CMU Serif Roman" w:cs="CMU Serif Roman"/>
-        </w:rPr>
-      </w:pPr>
-      <w:bookmarkStart w:id="28" w:name="ref-ollerton2011"/>
-      <w:bookmarkEnd w:id="26"/>
+          <w:lang w:val="es-ES"/>
+          <w:rPrChange w:id="32" w:author="Ainhoa Magrach" w:date="2025-07-07T13:29:00Z" w16du:dateUtc="2025-07-07T11:29:00Z">
+            <w:rPr>
+              <w:rFonts w:ascii="CMU Serif Roman" w:hAnsi="CMU Serif Roman" w:cs="CMU Serif Roman"/>
+            </w:rPr>
+          </w:rPrChange>
+        </w:rPr>
+      </w:pPr>
+      <w:bookmarkStart w:id="33" w:name="ref-ollerton2011"/>
+      <w:bookmarkEnd w:id="30"/>
       <w:r>
         <w:rPr>
           <w:rFonts w:ascii="CMU Serif Roman" w:hAnsi="CMU Serif Roman" w:cs="CMU Serif Roman"/>
@@ -4378,27 +4449,70 @@
           <w:rFonts w:ascii="CMU Serif Roman" w:hAnsi="CMU Serif Roman" w:cs="CMU Serif Roman"/>
           <w:i/>
           <w:iCs/>
+          <w:lang w:val="es-ES"/>
+          <w:rPrChange w:id="34" w:author="Ainhoa Magrach" w:date="2025-07-07T13:29:00Z" w16du:dateUtc="2025-07-07T11:29:00Z">
+            <w:rPr>
+              <w:rFonts w:ascii="CMU Serif Roman" w:hAnsi="CMU Serif Roman" w:cs="CMU Serif Roman"/>
+              <w:i/>
+              <w:iCs/>
+            </w:rPr>
+          </w:rPrChange>
         </w:rPr>
         <w:t>Oikos</w:t>
       </w:r>
       <w:r>
         <w:rPr>
           <w:rFonts w:ascii="CMU Serif Roman" w:hAnsi="CMU Serif Roman" w:cs="CMU Serif Roman"/>
+          <w:lang w:val="es-ES"/>
+          <w:rPrChange w:id="35" w:author="Ainhoa Magrach" w:date="2025-07-07T13:29:00Z" w16du:dateUtc="2025-07-07T11:29:00Z">
+            <w:rPr>
+              <w:rFonts w:ascii="CMU Serif Roman" w:hAnsi="CMU Serif Roman" w:cs="CMU Serif Roman"/>
+            </w:rPr>
+          </w:rPrChange>
         </w:rPr>
         <w:t xml:space="preserve"> 120 (3): 321–26. </w:t>
       </w:r>
-      <w:hyperlink r:id="rId40">
-        <w:r>
-          <w:rPr>
-            <w:rStyle w:val="Hyperlink"/>
-            <w:rFonts w:ascii="CMU Serif Roman" w:hAnsi="CMU Serif Roman" w:cs="CMU Serif Roman"/>
-          </w:rPr>
-          <w:t>https://doi.org/10.1111/j.1600-0706.2010.18644.x</w:t>
-        </w:r>
-      </w:hyperlink>
-      <w:r>
-        <w:rPr>
-          <w:rFonts w:ascii="CMU Serif Roman" w:hAnsi="CMU Serif Roman" w:cs="CMU Serif Roman"/>
+      <w:r>
+        <w:fldChar w:fldCharType="begin"/>
+      </w:r>
+      <w:r>
+        <w:rPr>
+          <w:lang w:val="es-ES"/>
+          <w:rPrChange w:id="36" w:author="Ainhoa Magrach" w:date="2025-07-07T13:29:00Z" w16du:dateUtc="2025-07-07T11:29:00Z">
+            <w:rPr/>
+          </w:rPrChange>
+        </w:rPr>
+        <w:instrText>HYPERLINK "https://doi.org/10.1111/j.1600-0706.2010.18644.x" \h</w:instrText>
+      </w:r>
+      <w:r>
+        <w:fldChar w:fldCharType="separate"/>
+      </w:r>
+      <w:r>
+        <w:rPr>
+          <w:rStyle w:val="Hyperlink"/>
+          <w:rFonts w:ascii="CMU Serif Roman" w:hAnsi="CMU Serif Roman" w:cs="CMU Serif Roman"/>
+          <w:lang w:val="es-ES"/>
+          <w:rPrChange w:id="37" w:author="Ainhoa Magrach" w:date="2025-07-07T13:29:00Z" w16du:dateUtc="2025-07-07T11:29:00Z">
+            <w:rPr>
+              <w:rStyle w:val="Hyperlink"/>
+              <w:rFonts w:ascii="CMU Serif Roman" w:hAnsi="CMU Serif Roman" w:cs="CMU Serif Roman"/>
+            </w:rPr>
+          </w:rPrChange>
+        </w:rPr>
+        <w:t>https://doi.org/10.1111/j.1600-0706.2010.18644.x</w:t>
+      </w:r>
+      <w:r>
+        <w:fldChar w:fldCharType="end"/>
+      </w:r>
+      <w:r>
+        <w:rPr>
+          <w:rFonts w:ascii="CMU Serif Roman" w:hAnsi="CMU Serif Roman" w:cs="CMU Serif Roman"/>
+          <w:lang w:val="es-ES"/>
+          <w:rPrChange w:id="38" w:author="Ainhoa Magrach" w:date="2025-07-07T13:29:00Z" w16du:dateUtc="2025-07-07T11:29:00Z">
+            <w:rPr>
+              <w:rFonts w:ascii="CMU Serif Roman" w:hAnsi="CMU Serif Roman" w:cs="CMU Serif Roman"/>
+            </w:rPr>
+          </w:rPrChange>
         </w:rPr>
         <w:t>.</w:t>
       </w:r>
@@ -4411,8 +4525,8 @@
           <w:rFonts w:ascii="CMU Serif Roman" w:hAnsi="CMU Serif Roman" w:cs="CMU Serif Roman"/>
         </w:rPr>
       </w:pPr>
-      <w:bookmarkStart w:id="29" w:name="ref-Pizarro2021"/>
-      <w:bookmarkEnd w:id="28"/>
+      <w:bookmarkStart w:id="39" w:name="ref-Pizarro2021"/>
+      <w:bookmarkEnd w:id="33"/>
       <w:r>
         <w:rPr>
           <w:rFonts w:ascii="CMU Serif Roman" w:hAnsi="CMU Serif Roman" w:cs="CMU Serif Roman"/>
@@ -4442,7 +4556,7 @@
         </w:rPr>
         <w:t xml:space="preserve">2021. “Climaemet: Climate AEMET Tools,” September. </w:t>
       </w:r>
-      <w:hyperlink r:id="rId41">
+      <w:hyperlink r:id="rId42">
         <w:r>
           <w:rPr>
             <w:rStyle w:val="Hyperlink"/>
@@ -4466,8 +4580,8 @@
           <w:rFonts w:ascii="CMU Serif Roman" w:hAnsi="CMU Serif Roman" w:cs="CMU Serif Roman"/>
         </w:rPr>
       </w:pPr>
-      <w:bookmarkStart w:id="30" w:name="ref-risely2020"/>
-      <w:bookmarkEnd w:id="29"/>
+      <w:bookmarkStart w:id="40" w:name="ref-risely2020"/>
+      <w:bookmarkEnd w:id="39"/>
       <w:r>
         <w:rPr>
           <w:rFonts w:ascii="CMU Serif Roman" w:hAnsi="CMU Serif Roman" w:cs="CMU Serif Roman"/>
@@ -4488,7 +4602,7 @@
         </w:rPr>
         <w:t xml:space="preserve"> 89 (7): 1549–58. </w:t>
       </w:r>
-      <w:hyperlink r:id="rId42">
+      <w:hyperlink r:id="rId43">
         <w:r>
           <w:rPr>
             <w:rStyle w:val="Hyperlink"/>
@@ -4512,8 +4626,8 @@
           <w:rFonts w:ascii="CMU Serif Roman" w:hAnsi="CMU Serif Roman" w:cs="CMU Serif Roman"/>
         </w:rPr>
       </w:pPr>
-      <w:bookmarkStart w:id="31" w:name="ref-shah2024"/>
-      <w:bookmarkEnd w:id="30"/>
+      <w:bookmarkStart w:id="41" w:name="ref-shah2024"/>
+      <w:bookmarkEnd w:id="40"/>
       <w:r>
         <w:rPr>
           <w:rFonts w:ascii="CMU Serif Roman" w:hAnsi="CMU Serif Roman" w:cs="CMU Serif Roman"/>
@@ -4534,7 +4648,7 @@
         </w:rPr>
         <w:t xml:space="preserve"> 915 (March): 170145. </w:t>
       </w:r>
-      <w:hyperlink r:id="rId43">
+      <w:hyperlink r:id="rId44">
         <w:r>
           <w:rPr>
             <w:rStyle w:val="Hyperlink"/>
@@ -4558,8 +4672,8 @@
           <w:rFonts w:ascii="CMU Serif Roman" w:hAnsi="CMU Serif Roman" w:cs="CMU Serif Roman"/>
         </w:rPr>
       </w:pPr>
-      <w:bookmarkStart w:id="32" w:name="ref-steele2021"/>
-      <w:bookmarkEnd w:id="31"/>
+      <w:bookmarkStart w:id="42" w:name="ref-steele2021"/>
+      <w:bookmarkEnd w:id="41"/>
       <w:r>
         <w:rPr>
           <w:rFonts w:ascii="CMU Serif Roman" w:hAnsi="CMU Serif Roman" w:cs="CMU Serif Roman"/>
@@ -4580,7 +4694,7 @@
         </w:rPr>
         <w:t xml:space="preserve"> 9 (2). </w:t>
       </w:r>
-      <w:hyperlink r:id="rId44">
+      <w:hyperlink r:id="rId45">
         <w:r>
           <w:rPr>
             <w:rStyle w:val="Hyperlink"/>
@@ -4605,15 +4719,15 @@
           <w:lang w:val="es-ES"/>
         </w:rPr>
       </w:pPr>
-      <w:bookmarkStart w:id="33" w:name="ref-stemet2024"/>
-      <w:bookmarkEnd w:id="32"/>
+      <w:bookmarkStart w:id="43" w:name="ref-stemet2024"/>
+      <w:bookmarkEnd w:id="42"/>
       <w:r>
         <w:rPr>
           <w:rFonts w:ascii="CMU Serif Roman" w:hAnsi="CMU Serif Roman" w:cs="CMU Serif Roman"/>
         </w:rPr>
         <w:t xml:space="preserve">Stemet, Lilia, David J. Biddinger, Kusum Naithani, Allen L. Szalanski, and Neelendra Joshi. 2024. “Intertegular Distance of Wild Bees and Its Use in Estimating Proboscis Lengths and Foraging Ranges to Better Understand Bee Conservation Ecology.” </w:t>
       </w:r>
-      <w:hyperlink r:id="rId45">
+      <w:hyperlink r:id="rId46">
         <w:r>
           <w:rPr>
             <w:rStyle w:val="Hyperlink"/>
@@ -4639,8 +4753,8 @@
           <w:rFonts w:ascii="CMU Serif Roman" w:hAnsi="CMU Serif Roman" w:cs="CMU Serif Roman"/>
         </w:rPr>
       </w:pPr>
-      <w:bookmarkStart w:id="34" w:name="ref-vanbergen2017"/>
-      <w:bookmarkEnd w:id="33"/>
+      <w:bookmarkStart w:id="44" w:name="ref-vanbergen2017"/>
+      <w:bookmarkEnd w:id="43"/>
       <w:proofErr w:type="spellStart"/>
       <w:r>
         <w:rPr>
@@ -4693,7 +4807,7 @@
         </w:rPr>
         <w:t xml:space="preserve"> 2 (1): 16–25. </w:t>
       </w:r>
-      <w:hyperlink r:id="rId46">
+      <w:hyperlink r:id="rId47">
         <w:r>
           <w:rPr>
             <w:rStyle w:val="Hyperlink"/>
@@ -4717,7 +4831,7 @@
           <w:rFonts w:ascii="CMU Serif Roman" w:hAnsi="CMU Serif Roman" w:cs="CMU Serif Roman"/>
         </w:rPr>
       </w:pPr>
-      <w:bookmarkStart w:id="35" w:name="ref-wagner2021"/>
+      <w:bookmarkStart w:id="45" w:name="ref-wagner2021"/>
       <w:r>
         <w:rPr>
           <w:rFonts w:ascii="CMU Serif Roman" w:hAnsi="CMU Serif Roman" w:cs="CMU Serif Roman"/>
@@ -4781,7 +4895,7 @@
         </w:rPr>
         <w:t xml:space="preserve"> 118 (2). </w:t>
       </w:r>
-      <w:hyperlink r:id="rId47">
+      <w:hyperlink r:id="rId48">
         <w:r>
           <w:rPr>
             <w:rStyle w:val="Hyperlink"/>
@@ -4796,7 +4910,7 @@
         </w:rPr>
         <w:t>.</w:t>
       </w:r>
-      <w:bookmarkEnd w:id="35"/>
+      <w:bookmarkEnd w:id="45"/>
     </w:p>
     <w:p>
       <w:pPr>
@@ -4806,8 +4920,8 @@
           <w:rFonts w:ascii="CMU Serif Roman" w:hAnsi="CMU Serif Roman" w:cs="CMU Serif Roman"/>
         </w:rPr>
       </w:pPr>
-      <w:bookmarkStart w:id="36" w:name="ref-weinhold2024"/>
-      <w:bookmarkEnd w:id="34"/>
+      <w:bookmarkStart w:id="46" w:name="ref-weinhold2024"/>
+      <w:bookmarkEnd w:id="44"/>
       <w:r>
         <w:rPr>
           <w:rFonts w:ascii="CMU Serif Roman" w:hAnsi="CMU Serif Roman" w:cs="CMU Serif Roman"/>
@@ -4828,7 +4942,7 @@
         </w:rPr>
         <w:t xml:space="preserve"> 14 (March). </w:t>
       </w:r>
-      <w:hyperlink r:id="rId48">
+      <w:hyperlink r:id="rId49">
         <w:r>
           <w:rPr>
             <w:rStyle w:val="Hyperlink"/>
@@ -4852,8 +4966,8 @@
           <w:rFonts w:ascii="CMU Serif Roman" w:hAnsi="CMU Serif Roman" w:cs="CMU Serif Roman"/>
         </w:rPr>
       </w:pPr>
-      <w:bookmarkStart w:id="37" w:name="ref-winfree2009"/>
-      <w:bookmarkEnd w:id="36"/>
+      <w:bookmarkStart w:id="47" w:name="ref-winfree2009"/>
+      <w:bookmarkEnd w:id="46"/>
       <w:proofErr w:type="spellStart"/>
       <w:r>
         <w:rPr>
@@ -4938,7 +5052,7 @@
         </w:rPr>
         <w:t xml:space="preserve"> 90 (8): 2068–76. </w:t>
       </w:r>
-      <w:hyperlink r:id="rId49">
+      <w:hyperlink r:id="rId50">
         <w:r>
           <w:rPr>
             <w:rStyle w:val="Hyperlink"/>
@@ -4962,8 +5076,8 @@
           <w:rFonts w:ascii="CMU Serif Roman" w:hAnsi="CMU Serif Roman" w:cs="CMU Serif Roman"/>
         </w:rPr>
       </w:pPr>
-      <w:bookmarkStart w:id="38" w:name="ref-zheng2019"/>
-      <w:bookmarkEnd w:id="37"/>
+      <w:bookmarkStart w:id="48" w:name="ref-zheng2019"/>
+      <w:bookmarkEnd w:id="47"/>
       <w:r>
         <w:rPr>
           <w:rFonts w:ascii="CMU Serif Roman" w:hAnsi="CMU Serif Roman" w:cs="CMU Serif Roman"/>
@@ -4984,7 +5098,7 @@
         </w:rPr>
         <w:t xml:space="preserve"> 116 (51): 25909–16. </w:t>
       </w:r>
-      <w:hyperlink r:id="rId50">
+      <w:hyperlink r:id="rId51">
         <w:r>
           <w:rPr>
             <w:rStyle w:val="Hyperlink"/>
@@ -5008,8 +5122,8 @@
           <w:rFonts w:ascii="CMU Serif Roman" w:hAnsi="CMU Serif Roman" w:cs="CMU Serif Roman"/>
         </w:rPr>
       </w:pPr>
-      <w:bookmarkStart w:id="39" w:name="ref-zheng2017"/>
-      <w:bookmarkEnd w:id="38"/>
+      <w:bookmarkStart w:id="49" w:name="ref-zheng2017"/>
+      <w:bookmarkEnd w:id="48"/>
       <w:r>
         <w:rPr>
           <w:rFonts w:ascii="CMU Serif Roman" w:hAnsi="CMU Serif Roman" w:cs="CMU Serif Roman"/>
@@ -5030,7 +5144,7 @@
         </w:rPr>
         <w:t xml:space="preserve"> 114 (18): 4775–80. </w:t>
       </w:r>
-      <w:hyperlink r:id="rId51">
+      <w:hyperlink r:id="rId52">
         <w:r>
           <w:rPr>
             <w:rStyle w:val="Hyperlink"/>
@@ -5045,9 +5159,9 @@
         </w:rPr>
         <w:t>.</w:t>
       </w:r>
-      <w:bookmarkEnd w:id="5"/>
-      <w:bookmarkEnd w:id="7"/>
-      <w:bookmarkEnd w:id="39"/>
+      <w:bookmarkEnd w:id="9"/>
+      <w:bookmarkEnd w:id="11"/>
+      <w:bookmarkEnd w:id="49"/>
     </w:p>
     <w:sectPr>
       <w:pgSz w:w="12240" w:h="15840"/>
@@ -5141,6 +5255,14 @@
     <w:abstractNumId w:val="0"/>
   </w:num>
 </w:numbering>
+</file>
+
+<file path=word/people.xml><?xml version="1.0" encoding="utf-8"?>
+<w15:people xmlns:wpc="http://schemas.microsoft.com/office/word/2010/wordprocessingCanvas" xmlns:cx="http://schemas.microsoft.com/office/drawing/2014/chartex" xmlns:cx1="http://schemas.microsoft.com/office/drawing/2015/9/8/chartex" xmlns:cx2="http://schemas.microsoft.com/office/drawing/2015/10/21/chartex" xmlns:cx3="http://schemas.microsoft.com/office/drawing/2016/5/9/chartex" xmlns:cx4="http://schemas.microsoft.com/office/drawing/2016/5/10/chartex" xmlns:cx5="http://schemas.microsoft.com/office/drawing/2016/5/11/chartex" xmlns:cx6="http://schemas.microsoft.com/office/drawing/2016/5/12/chartex" xmlns:cx7="http://schemas.microsoft.com/office/drawing/2016/5/13/chartex" xmlns:cx8="http://schemas.microsoft.com/office/drawing/2016/5/14/chartex" xmlns:mc="http://schemas.openxmlformats.org/markup-compatibility/2006" xmlns:aink="http://schemas.microsoft.com/office/drawing/2016/ink" xmlns:am3d="http://schemas.microsoft.com/office/drawing/2017/model3d" xmlns:o="urn:schemas-microsoft-com:office:office" xmlns:oel="http://schemas.microsoft.com/office/2019/extlst" xmlns:r="http://schemas.openxmlformats.org/officeDocument/2006/relationships" xmlns:m="http://schemas.openxmlformats.org/officeDocument/2006/math" xmlns:v="urn:schemas-microsoft-com:vml" xmlns:wp14="http://schemas.microsoft.com/office/word/2010/wordprocessingDrawing" xmlns:wp="http://schemas.openxmlformats.org/drawingml/2006/wordprocessingDrawing" xmlns:w10="urn:schemas-microsoft-com:office:word" xmlns:w="http://schemas.openxmlformats.org/wordprocessingml/2006/main" xmlns:w14="http://schemas.microsoft.com/office/word/2010/wordml" xmlns:w15="http://schemas.microsoft.com/office/word/2012/wordml" xmlns:w16cex="http://schemas.microsoft.com/office/word/2018/wordml/cex" xmlns:w16cid="http://schemas.microsoft.com/office/word/2016/wordml/cid" xmlns:w16="http://schemas.microsoft.com/office/word/2018/wordml" xmlns:w16du="http://schemas.microsoft.com/office/word/2023/wordml/word16du" xmlns:w16sdtdh="http://schemas.microsoft.com/office/word/2020/wordml/sdtdatahash" xmlns:w16sdtfl="http://schemas.microsoft.com/office/word/2024/wordml/sdtformatlock" xmlns:w16se="http://schemas.microsoft.com/office/word/2015/wordml/symex" xmlns:wpg="http://schemas.microsoft.com/office/word/2010/wordprocessingGroup" xmlns:wpi="http://schemas.microsoft.com/office/word/2010/wordprocessingInk" xmlns:wne="http://schemas.microsoft.com/office/word/2006/wordml" xmlns:wps="http://schemas.microsoft.com/office/word/2010/wordprocessingShape" mc:Ignorable="w14 w15 w16se w16cid w16 w16cex w16sdtdh w16sdtfl w16du wp14">
+  <w15:person w15:author="Ainhoa Magrach">
+    <w15:presenceInfo w15:providerId="Windows Live" w15:userId="d571eaaaa22ded7c"/>
+  </w15:person>
+</w15:people>
 </file>
 
 <file path=word/styles.xml><?xml version="1.0" encoding="utf-8"?>

</xml_diff>